<commit_message>
docs: actualiza documentación de la fase 3
</commit_message>
<xml_diff>
--- a/FASE 3/Documentacion del proyecto/Plan de Capacitación.docx
+++ b/FASE 3/Documentacion del proyecto/Plan de Capacitación.docx
@@ -1,13 +1,13 @@
 
 <file path=word/document.xml><?xml version="1.0" encoding="utf-8"?>
-<w:document xmlns:wpc="http://schemas.microsoft.com/office/word/2010/wordprocessingCanvas" xmlns:cx="http://schemas.microsoft.com/office/drawing/2014/chartex" xmlns:cx1="http://schemas.microsoft.com/office/drawing/2015/9/8/chartex" xmlns:cx2="http://schemas.microsoft.com/office/drawing/2015/10/21/chartex" xmlns:cx3="http://schemas.microsoft.com/office/drawing/2016/5/9/chartex" xmlns:cx4="http://schemas.microsoft.com/office/drawing/2016/5/10/chartex" xmlns:cx5="http://schemas.microsoft.com/office/drawing/2016/5/11/chartex" xmlns:cx6="http://schemas.microsoft.com/office/drawing/2016/5/12/chartex" xmlns:cx7="http://schemas.microsoft.com/office/drawing/2016/5/13/chartex" xmlns:cx8="http://schemas.microsoft.com/office/drawing/2016/5/14/chartex" xmlns:mc="http://schemas.openxmlformats.org/markup-compatibility/2006" xmlns:aink="http://schemas.microsoft.com/office/drawing/2016/ink" xmlns:am3d="http://schemas.microsoft.com/office/drawing/2017/model3d" xmlns:o="urn:schemas-microsoft-com:office:office" xmlns:oel="http://schemas.microsoft.com/office/2019/extlst" xmlns:r="http://schemas.openxmlformats.org/officeDocument/2006/relationships" xmlns:m="http://schemas.openxmlformats.org/officeDocument/2006/math" xmlns:v="urn:schemas-microsoft-com:vml" xmlns:wp14="http://schemas.microsoft.com/office/word/2010/wordprocessingDrawing" xmlns:wp="http://schemas.openxmlformats.org/drawingml/2006/wordprocessingDrawing" xmlns:w10="urn:schemas-microsoft-com:office:word" xmlns:w="http://schemas.openxmlformats.org/wordprocessingml/2006/main" xmlns:w14="http://schemas.microsoft.com/office/word/2010/wordml" xmlns:w15="http://schemas.microsoft.com/office/word/2012/wordml" xmlns:w16cex="http://schemas.microsoft.com/office/word/2018/wordml/cex" xmlns:w16cid="http://schemas.microsoft.com/office/word/2016/wordml/cid" xmlns:w16="http://schemas.microsoft.com/office/word/2018/wordml" xmlns:w16du="http://schemas.microsoft.com/office/word/2023/wordml/word16du" xmlns:w16sdtdh="http://schemas.microsoft.com/office/word/2020/wordml/sdtdatahash" xmlns:w16se="http://schemas.microsoft.com/office/word/2015/wordml/symex" xmlns:wpg="http://schemas.microsoft.com/office/word/2010/wordprocessingGroup" xmlns:wpi="http://schemas.microsoft.com/office/word/2010/wordprocessingInk" xmlns:wne="http://schemas.microsoft.com/office/word/2006/wordml" xmlns:wps="http://schemas.microsoft.com/office/word/2010/wordprocessingShape" mc:Ignorable="w14 w15 w16se w16cid w16 w16cex w16sdtdh w16du wp14">
+<w:document xmlns:wpc="http://schemas.microsoft.com/office/word/2010/wordprocessingCanvas" xmlns:cx="http://schemas.microsoft.com/office/drawing/2014/chartex" xmlns:cx1="http://schemas.microsoft.com/office/drawing/2015/9/8/chartex" xmlns:cx2="http://schemas.microsoft.com/office/drawing/2015/10/21/chartex" xmlns:cx3="http://schemas.microsoft.com/office/drawing/2016/5/9/chartex" xmlns:cx4="http://schemas.microsoft.com/office/drawing/2016/5/10/chartex" xmlns:cx5="http://schemas.microsoft.com/office/drawing/2016/5/11/chartex" xmlns:cx6="http://schemas.microsoft.com/office/drawing/2016/5/12/chartex" xmlns:cx7="http://schemas.microsoft.com/office/drawing/2016/5/13/chartex" xmlns:cx8="http://schemas.microsoft.com/office/drawing/2016/5/14/chartex" xmlns:mc="http://schemas.openxmlformats.org/markup-compatibility/2006" xmlns:aink="http://schemas.microsoft.com/office/drawing/2016/ink" xmlns:am3d="http://schemas.microsoft.com/office/drawing/2017/model3d" xmlns:o="urn:schemas-microsoft-com:office:office" xmlns:oel="http://schemas.microsoft.com/office/2019/extlst" xmlns:r="http://schemas.openxmlformats.org/officeDocument/2006/relationships" xmlns:m="http://schemas.openxmlformats.org/officeDocument/2006/math" xmlns:v="urn:schemas-microsoft-com:vml" xmlns:wp14="http://schemas.microsoft.com/office/word/2010/wordprocessingDrawing" xmlns:wp="http://schemas.openxmlformats.org/drawingml/2006/wordprocessingDrawing" xmlns:w10="urn:schemas-microsoft-com:office:word" xmlns:w="http://schemas.openxmlformats.org/wordprocessingml/2006/main" xmlns:w14="http://schemas.microsoft.com/office/word/2010/wordml" xmlns:w15="http://schemas.microsoft.com/office/word/2012/wordml" xmlns:w16cex="http://schemas.microsoft.com/office/word/2018/wordml/cex" xmlns:w16cid="http://schemas.microsoft.com/office/word/2016/wordml/cid" xmlns:w16="http://schemas.microsoft.com/office/word/2018/wordml" xmlns:w16du="http://schemas.microsoft.com/office/word/2023/wordml/word16du" xmlns:w16sdtdh="http://schemas.microsoft.com/office/word/2020/wordml/sdtdatahash" xmlns:w16sdtfl="http://schemas.microsoft.com/office/word/2024/wordml/sdtformatlock" xmlns:w16se="http://schemas.microsoft.com/office/word/2015/wordml/symex" xmlns:wpg="http://schemas.microsoft.com/office/word/2010/wordprocessingGroup" xmlns:wpi="http://schemas.microsoft.com/office/word/2010/wordprocessingInk" xmlns:wne="http://schemas.microsoft.com/office/word/2006/wordml" xmlns:wps="http://schemas.microsoft.com/office/word/2010/wordprocessingShape" mc:Ignorable="w14 w15 w16se w16cid w16 w16cex w16sdtdh w16sdtfl w16du wp14">
   <w:body>
     <w:p>
       <w:pPr>
         <w:spacing w:after="0" w:line="240" w:lineRule="auto"/>
         <w:jc w:val="center"/>
         <w:rPr>
-          <w:rFonts w:eastAsia="Times New Roman" w:cs="Arial"/>
+          <w:rFonts w:eastAsia="Times New Roman" w:cstheme="minorHAnsi"/>
           <w:b/>
           <w:color w:val="000000"/>
           <w:sz w:val="36"/>
@@ -21,7 +21,7 @@
         <w:spacing w:after="0" w:line="240" w:lineRule="auto"/>
         <w:jc w:val="center"/>
         <w:rPr>
-          <w:rFonts w:eastAsia="Times New Roman" w:cs="Arial"/>
+          <w:rFonts w:eastAsia="Times New Roman" w:cstheme="minorHAnsi"/>
           <w:b/>
           <w:color w:val="000000"/>
           <w:sz w:val="36"/>
@@ -35,7 +35,7 @@
         <w:spacing w:after="0" w:line="240" w:lineRule="auto"/>
         <w:jc w:val="center"/>
         <w:rPr>
-          <w:rFonts w:eastAsia="Times New Roman" w:cs="Arial"/>
+          <w:rFonts w:eastAsia="Times New Roman" w:cstheme="minorHAnsi"/>
           <w:b/>
           <w:color w:val="000000"/>
           <w:sz w:val="36"/>
@@ -49,7 +49,7 @@
         <w:spacing w:after="0" w:line="240" w:lineRule="auto"/>
         <w:jc w:val="center"/>
         <w:rPr>
-          <w:rFonts w:eastAsia="Times New Roman" w:cs="Arial"/>
+          <w:rFonts w:eastAsia="Times New Roman" w:cstheme="minorHAnsi"/>
           <w:b/>
           <w:color w:val="000000"/>
           <w:sz w:val="36"/>
@@ -63,7 +63,7 @@
         <w:spacing w:after="0" w:line="240" w:lineRule="auto"/>
         <w:jc w:val="center"/>
         <w:rPr>
-          <w:rFonts w:eastAsia="Times New Roman" w:cs="Arial"/>
+          <w:rFonts w:eastAsia="Times New Roman" w:cstheme="minorHAnsi"/>
           <w:b/>
           <w:color w:val="000000"/>
           <w:sz w:val="36"/>
@@ -77,7 +77,7 @@
         <w:spacing w:after="0" w:line="240" w:lineRule="auto"/>
         <w:jc w:val="center"/>
         <w:rPr>
-          <w:rFonts w:eastAsia="Times New Roman" w:cs="Arial"/>
+          <w:rFonts w:eastAsia="Times New Roman" w:cstheme="minorHAnsi"/>
           <w:b/>
           <w:color w:val="000000"/>
           <w:sz w:val="36"/>
@@ -91,7 +91,7 @@
         <w:spacing w:after="0" w:line="240" w:lineRule="auto"/>
         <w:jc w:val="center"/>
         <w:rPr>
-          <w:rFonts w:eastAsia="Times New Roman" w:cs="Arial"/>
+          <w:rFonts w:eastAsia="Times New Roman" w:cstheme="minorHAnsi"/>
           <w:b/>
           <w:color w:val="000000"/>
           <w:sz w:val="36"/>
@@ -105,7 +105,7 @@
         <w:spacing w:after="0" w:line="240" w:lineRule="auto"/>
         <w:jc w:val="center"/>
         <w:rPr>
-          <w:rFonts w:eastAsia="Times New Roman" w:cs="Arial"/>
+          <w:rFonts w:eastAsia="Times New Roman" w:cstheme="minorHAnsi"/>
           <w:b/>
           <w:color w:val="000000"/>
           <w:sz w:val="36"/>
@@ -119,7 +119,7 @@
         <w:spacing w:after="0" w:line="240" w:lineRule="auto"/>
         <w:jc w:val="center"/>
         <w:rPr>
-          <w:rFonts w:eastAsia="Times New Roman" w:cs="Arial"/>
+          <w:rFonts w:eastAsia="Times New Roman" w:cstheme="minorHAnsi"/>
           <w:b/>
           <w:color w:val="000000"/>
           <w:sz w:val="36"/>
@@ -133,7 +133,7 @@
         <w:spacing w:after="0" w:line="240" w:lineRule="auto"/>
         <w:jc w:val="center"/>
         <w:rPr>
-          <w:rFonts w:eastAsia="Times New Roman" w:cs="Arial"/>
+          <w:rFonts w:eastAsia="Times New Roman" w:cstheme="minorHAnsi"/>
           <w:b/>
           <w:color w:val="000000"/>
           <w:sz w:val="36"/>
@@ -148,7 +148,7 @@
         <w:ind w:left="1416"/>
         <w:jc w:val="right"/>
         <w:rPr>
-          <w:rFonts w:eastAsia="Times New Roman" w:cs="Arial"/>
+          <w:rFonts w:eastAsia="Times New Roman" w:cstheme="minorHAnsi"/>
           <w:b/>
           <w:color w:val="000000"/>
           <w:sz w:val="48"/>
@@ -158,7 +158,7 @@
       </w:pPr>
       <w:r>
         <w:rPr>
-          <w:rFonts w:eastAsia="Times New Roman" w:cs="Arial"/>
+          <w:rFonts w:eastAsia="Times New Roman" w:cstheme="minorHAnsi"/>
           <w:b/>
           <w:color w:val="000000"/>
           <w:sz w:val="48"/>
@@ -173,7 +173,7 @@
         <w:spacing w:after="0" w:line="240" w:lineRule="auto"/>
         <w:jc w:val="right"/>
         <w:rPr>
-          <w:rFonts w:eastAsia="Times New Roman" w:cs="Arial"/>
+          <w:rFonts w:eastAsia="Times New Roman" w:cstheme="minorHAnsi"/>
           <w:b/>
           <w:color w:val="000000"/>
           <w:sz w:val="48"/>
@@ -183,14 +183,25 @@
       </w:pPr>
       <w:r>
         <w:rPr>
-          <w:rFonts w:eastAsia="Times New Roman" w:cs="Arial"/>
+          <w:rFonts w:eastAsia="Times New Roman" w:cstheme="minorHAnsi"/>
           <w:b/>
           <w:color w:val="000000"/>
           <w:sz w:val="48"/>
           <w:szCs w:val="48"/>
           <w:lang w:eastAsia="es-VE"/>
         </w:rPr>
-        <w:t>Proyecto xxx</w:t>
+        <w:t xml:space="preserve">Proyecto </w:t>
+      </w:r>
+      <w:r>
+        <w:rPr>
+          <w:rFonts w:eastAsia="Times New Roman" w:cstheme="minorHAnsi"/>
+          <w:b/>
+          <w:color w:val="000000"/>
+          <w:sz w:val="48"/>
+          <w:szCs w:val="48"/>
+          <w:lang w:eastAsia="es-VE"/>
+        </w:rPr>
+        <w:t>Mi Refugio</w:t>
       </w:r>
     </w:p>
     <w:p>
@@ -198,7 +209,7 @@
         <w:spacing w:after="0" w:line="240" w:lineRule="auto"/>
         <w:jc w:val="right"/>
         <w:rPr>
-          <w:rFonts w:ascii="Calibri" w:hAnsi="Calibri"/>
+          <w:rFonts w:cstheme="minorHAnsi"/>
           <w:b/>
           <w:i/>
           <w:color w:val="365F91"/>
@@ -208,6 +219,7 @@
       </w:pPr>
       <w:r>
         <w:rPr>
+          <w:rFonts w:cstheme="minorHAnsi"/>
           <w:b/>
           <w:sz w:val="36"/>
           <w:szCs w:val="36"/>
@@ -216,6 +228,7 @@
       </w:r>
       <w:r>
         <w:rPr>
+          <w:rFonts w:cstheme="minorHAnsi"/>
           <w:b/>
           <w:i/>
           <w:sz w:val="36"/>
@@ -225,6 +238,17 @@
       </w:r>
       <w:r>
         <w:rPr>
+          <w:rFonts w:cstheme="minorHAnsi"/>
+          <w:b/>
+          <w:i/>
+          <w:sz w:val="36"/>
+          <w:szCs w:val="36"/>
+        </w:rPr>
+        <w:t xml:space="preserve"> 03/12/2025</w:t>
+      </w:r>
+      <w:r>
+        <w:rPr>
+          <w:rFonts w:cstheme="minorHAnsi"/>
           <w:b/>
           <w:i/>
           <w:color w:val="00B050"/>
@@ -238,7 +262,7 @@
       <w:pPr>
         <w:spacing w:after="0" w:line="240" w:lineRule="auto"/>
         <w:rPr>
-          <w:rFonts w:eastAsia="Times New Roman" w:cs="Arial"/>
+          <w:rFonts w:eastAsia="Times New Roman" w:cstheme="minorHAnsi"/>
           <w:b/>
           <w:color w:val="365F91"/>
           <w:szCs w:val="24"/>
@@ -250,7 +274,7 @@
       <w:pPr>
         <w:spacing w:after="0" w:line="240" w:lineRule="auto"/>
         <w:rPr>
-          <w:rFonts w:eastAsia="Times New Roman" w:cs="Arial"/>
+          <w:rFonts w:eastAsia="Times New Roman" w:cstheme="minorHAnsi"/>
           <w:b/>
           <w:color w:val="365F91"/>
           <w:szCs w:val="24"/>
@@ -262,7 +286,7 @@
       <w:pPr>
         <w:spacing w:after="0" w:line="240" w:lineRule="auto"/>
         <w:rPr>
-          <w:rFonts w:eastAsia="Times New Roman" w:cs="Arial"/>
+          <w:rFonts w:eastAsia="Times New Roman" w:cstheme="minorHAnsi"/>
           <w:b/>
           <w:color w:val="365F91"/>
           <w:szCs w:val="24"/>
@@ -274,7 +298,7 @@
       <w:pPr>
         <w:spacing w:after="0" w:line="240" w:lineRule="auto"/>
         <w:rPr>
-          <w:rFonts w:eastAsia="Times New Roman" w:cs="Arial"/>
+          <w:rFonts w:eastAsia="Times New Roman" w:cstheme="minorHAnsi"/>
           <w:b/>
           <w:color w:val="365F91"/>
           <w:szCs w:val="24"/>
@@ -286,7 +310,7 @@
       <w:pPr>
         <w:spacing w:after="0" w:line="240" w:lineRule="auto"/>
         <w:rPr>
-          <w:rFonts w:eastAsia="Times New Roman" w:cs="Arial"/>
+          <w:rFonts w:eastAsia="Times New Roman" w:cstheme="minorHAnsi"/>
           <w:b/>
           <w:color w:val="365F91"/>
           <w:szCs w:val="24"/>
@@ -298,7 +322,7 @@
       <w:pPr>
         <w:spacing w:after="0" w:line="240" w:lineRule="auto"/>
         <w:rPr>
-          <w:rFonts w:eastAsia="Times New Roman" w:cs="Arial"/>
+          <w:rFonts w:eastAsia="Times New Roman" w:cstheme="minorHAnsi"/>
           <w:b/>
           <w:color w:val="365F91"/>
           <w:szCs w:val="24"/>
@@ -310,7 +334,7 @@
       <w:pPr>
         <w:spacing w:after="0" w:line="240" w:lineRule="auto"/>
         <w:rPr>
-          <w:rFonts w:eastAsia="Times New Roman" w:cs="Arial"/>
+          <w:rFonts w:eastAsia="Times New Roman" w:cstheme="minorHAnsi"/>
           <w:b/>
           <w:color w:val="365F91"/>
           <w:szCs w:val="24"/>
@@ -322,7 +346,7 @@
       <w:pPr>
         <w:spacing w:after="0" w:line="240" w:lineRule="auto"/>
         <w:rPr>
-          <w:rFonts w:eastAsia="Times New Roman" w:cs="Arial"/>
+          <w:rFonts w:eastAsia="Times New Roman" w:cstheme="minorHAnsi"/>
           <w:b/>
           <w:color w:val="365F91"/>
           <w:szCs w:val="24"/>
@@ -334,7 +358,7 @@
       <w:pPr>
         <w:spacing w:after="0" w:line="240" w:lineRule="auto"/>
         <w:rPr>
-          <w:rFonts w:eastAsia="Times New Roman" w:cs="Arial"/>
+          <w:rFonts w:eastAsia="Times New Roman" w:cstheme="minorHAnsi"/>
           <w:b/>
           <w:color w:val="365F91"/>
           <w:szCs w:val="24"/>
@@ -346,7 +370,7 @@
       <w:pPr>
         <w:spacing w:after="0" w:line="240" w:lineRule="auto"/>
         <w:rPr>
-          <w:rFonts w:eastAsia="Times New Roman" w:cs="Arial"/>
+          <w:rFonts w:eastAsia="Times New Roman" w:cstheme="minorHAnsi"/>
           <w:b/>
           <w:color w:val="365F91"/>
           <w:szCs w:val="24"/>
@@ -358,7 +382,7 @@
       <w:pPr>
         <w:spacing w:after="0" w:line="240" w:lineRule="auto"/>
         <w:rPr>
-          <w:rFonts w:eastAsia="Times New Roman" w:cs="Arial"/>
+          <w:rFonts w:eastAsia="Times New Roman" w:cstheme="minorHAnsi"/>
           <w:b/>
           <w:color w:val="365F91"/>
           <w:szCs w:val="24"/>
@@ -370,7 +394,7 @@
       <w:pPr>
         <w:spacing w:after="0" w:line="240" w:lineRule="auto"/>
         <w:rPr>
-          <w:rFonts w:eastAsia="Times New Roman" w:cs="Arial"/>
+          <w:rFonts w:eastAsia="Times New Roman" w:cstheme="minorHAnsi"/>
           <w:b/>
           <w:color w:val="365F91"/>
           <w:szCs w:val="24"/>
@@ -382,7 +406,7 @@
       <w:pPr>
         <w:spacing w:after="0" w:line="240" w:lineRule="auto"/>
         <w:rPr>
-          <w:rFonts w:eastAsia="Times New Roman" w:cs="Arial"/>
+          <w:rFonts w:eastAsia="Times New Roman" w:cstheme="minorHAnsi"/>
           <w:b/>
           <w:color w:val="365F91"/>
           <w:szCs w:val="24"/>
@@ -394,7 +418,7 @@
       <w:pPr>
         <w:spacing w:after="0" w:line="240" w:lineRule="auto"/>
         <w:rPr>
-          <w:rFonts w:eastAsia="Times New Roman" w:cs="Arial"/>
+          <w:rFonts w:eastAsia="Times New Roman" w:cstheme="minorHAnsi"/>
           <w:b/>
           <w:color w:val="365F91"/>
           <w:szCs w:val="24"/>
@@ -406,7 +430,7 @@
       <w:pPr>
         <w:spacing w:after="0" w:line="240" w:lineRule="auto"/>
         <w:rPr>
-          <w:rFonts w:eastAsia="Times New Roman" w:cs="Arial"/>
+          <w:rFonts w:eastAsia="Times New Roman" w:cstheme="minorHAnsi"/>
           <w:b/>
           <w:color w:val="365F91"/>
           <w:szCs w:val="24"/>
@@ -418,7 +442,7 @@
       <w:pPr>
         <w:spacing w:after="0" w:line="240" w:lineRule="auto"/>
         <w:rPr>
-          <w:rFonts w:eastAsia="Times New Roman" w:cs="Arial"/>
+          <w:rFonts w:eastAsia="Times New Roman" w:cstheme="minorHAnsi"/>
           <w:b/>
           <w:color w:val="365F91"/>
           <w:szCs w:val="24"/>
@@ -430,7 +454,7 @@
       <w:pPr>
         <w:spacing w:after="0" w:line="240" w:lineRule="auto"/>
         <w:rPr>
-          <w:rFonts w:eastAsia="Times New Roman" w:cs="Arial"/>
+          <w:rFonts w:eastAsia="Times New Roman" w:cstheme="minorHAnsi"/>
           <w:b/>
           <w:color w:val="365F91"/>
           <w:szCs w:val="24"/>
@@ -442,7 +466,7 @@
       <w:pPr>
         <w:spacing w:after="0" w:line="240" w:lineRule="auto"/>
         <w:rPr>
-          <w:rFonts w:eastAsia="Times New Roman" w:cs="Arial"/>
+          <w:rFonts w:eastAsia="Times New Roman" w:cstheme="minorHAnsi"/>
           <w:b/>
           <w:color w:val="365F91"/>
           <w:szCs w:val="24"/>
@@ -454,7 +478,7 @@
       <w:pPr>
         <w:spacing w:after="0" w:line="240" w:lineRule="auto"/>
         <w:rPr>
-          <w:rFonts w:eastAsia="Times New Roman" w:cs="Arial"/>
+          <w:rFonts w:eastAsia="Times New Roman" w:cstheme="minorHAnsi"/>
           <w:b/>
           <w:color w:val="365F91"/>
           <w:szCs w:val="24"/>
@@ -466,7 +490,7 @@
       <w:pPr>
         <w:spacing w:after="0" w:line="240" w:lineRule="auto"/>
         <w:rPr>
-          <w:rFonts w:eastAsia="Times New Roman" w:cs="Arial"/>
+          <w:rFonts w:eastAsia="Times New Roman" w:cstheme="minorHAnsi"/>
           <w:b/>
           <w:color w:val="365F91"/>
           <w:szCs w:val="24"/>
@@ -478,7 +502,7 @@
       <w:pPr>
         <w:spacing w:after="0" w:line="240" w:lineRule="auto"/>
         <w:rPr>
-          <w:rFonts w:eastAsia="Times New Roman" w:cs="Arial"/>
+          <w:rFonts w:eastAsia="Times New Roman" w:cstheme="minorHAnsi"/>
           <w:b/>
           <w:color w:val="365F91"/>
           <w:szCs w:val="24"/>
@@ -489,7 +513,7 @@
     <w:p>
       <w:pPr>
         <w:rPr>
-          <w:rFonts w:eastAsia="Times New Roman" w:cs="Arial"/>
+          <w:rFonts w:eastAsia="Times New Roman" w:cstheme="minorHAnsi"/>
           <w:b/>
           <w:color w:val="365F91"/>
           <w:szCs w:val="24"/>
@@ -498,7 +522,7 @@
       </w:pPr>
       <w:r>
         <w:rPr>
-          <w:rFonts w:eastAsia="Times New Roman" w:cs="Arial"/>
+          <w:rFonts w:eastAsia="Times New Roman" w:cstheme="minorHAnsi"/>
           <w:b/>
           <w:color w:val="365F91"/>
           <w:szCs w:val="24"/>
@@ -511,7 +535,7 @@
       <w:pPr>
         <w:spacing w:after="0" w:line="240" w:lineRule="auto"/>
         <w:rPr>
-          <w:rFonts w:eastAsia="Times New Roman" w:cs="Arial"/>
+          <w:rFonts w:eastAsia="Times New Roman" w:cstheme="minorHAnsi"/>
           <w:b/>
           <w:color w:val="365F91"/>
           <w:szCs w:val="24"/>
@@ -532,58 +556,14 @@
       </w:pPr>
       <w:r>
         <w:rPr>
-          <w:rFonts w:ascii="Arial" w:eastAsia="Times New Roman" w:hAnsi="Arial" w:cs="Arial"/>
+          <w:rFonts w:eastAsia="Times New Roman" w:cstheme="minorHAnsi"/>
           <w:b/>
           <w:color w:val="31849B" w:themeColor="accent5" w:themeShade="BF"/>
           <w:sz w:val="32"/>
           <w:szCs w:val="32"/>
           <w:lang w:eastAsia="es-VE"/>
         </w:rPr>
-        <w:t>Tabla</w:t>
-      </w:r>
-      <w:r>
-        <w:rPr>
-          <w:rFonts w:eastAsia="Times New Roman" w:cs="Arial"/>
-          <w:b/>
-          <w:color w:val="31849B" w:themeColor="accent5" w:themeShade="BF"/>
-          <w:sz w:val="32"/>
-          <w:szCs w:val="32"/>
-          <w:lang w:eastAsia="es-VE"/>
-        </w:rPr>
-        <w:t xml:space="preserve"> </w:t>
-      </w:r>
-      <w:r>
-        <w:rPr>
-          <w:rFonts w:ascii="Arial" w:eastAsia="Times New Roman" w:hAnsi="Arial" w:cs="Arial"/>
-          <w:b/>
-          <w:color w:val="31849B" w:themeColor="accent5" w:themeShade="BF"/>
-          <w:sz w:val="32"/>
-          <w:szCs w:val="32"/>
-          <w:lang w:eastAsia="es-VE"/>
-        </w:rPr>
-        <w:t>de</w:t>
-      </w:r>
-      <w:r>
-        <w:rPr>
-          <w:rFonts w:eastAsia="Times New Roman" w:cs="Arial"/>
-          <w:b/>
-          <w:color w:val="31849B" w:themeColor="accent5" w:themeShade="BF"/>
-          <w:sz w:val="32"/>
-          <w:szCs w:val="32"/>
-          <w:lang w:eastAsia="es-VE"/>
-        </w:rPr>
-        <w:t xml:space="preserve"> </w:t>
-      </w:r>
-      <w:r>
-        <w:rPr>
-          <w:rFonts w:ascii="Arial" w:eastAsia="Times New Roman" w:hAnsi="Arial" w:cs="Arial"/>
-          <w:b/>
-          <w:color w:val="31849B" w:themeColor="accent5" w:themeShade="BF"/>
-          <w:sz w:val="32"/>
-          <w:szCs w:val="32"/>
-          <w:lang w:eastAsia="es-VE"/>
-        </w:rPr>
-        <w:t>contenido</w:t>
+        <w:t>Tabla de contenido</w:t>
       </w:r>
     </w:p>
     <w:p>
@@ -600,7 +580,7 @@
     <w:sdt>
       <w:sdtPr>
         <w:rPr>
-          <w:rFonts w:asciiTheme="minorHAnsi" w:eastAsiaTheme="minorHAnsi" w:hAnsiTheme="minorHAnsi" w:cstheme="minorBidi"/>
+          <w:rFonts w:asciiTheme="minorHAnsi" w:eastAsiaTheme="minorHAnsi" w:hAnsiTheme="minorHAnsi" w:cstheme="minorHAnsi"/>
           <w:b w:val="0"/>
           <w:bCs w:val="0"/>
           <w:color w:val="auto"/>
@@ -623,10 +603,13 @@
         <w:p>
           <w:pPr>
             <w:pStyle w:val="TtuloTDC"/>
+            <w:rPr>
+              <w:rFonts w:asciiTheme="minorHAnsi" w:hAnsiTheme="minorHAnsi" w:cstheme="minorHAnsi"/>
+            </w:rPr>
           </w:pPr>
           <w:r>
             <w:rPr>
-              <w:rFonts w:ascii="Arial" w:hAnsi="Arial" w:cs="Arial"/>
+              <w:rFonts w:asciiTheme="minorHAnsi" w:hAnsiTheme="minorHAnsi" w:cstheme="minorHAnsi"/>
               <w:color w:val="31849B" w:themeColor="accent5" w:themeShade="BF"/>
             </w:rPr>
             <w:t>Contenido</w:t>
@@ -640,22 +623,35 @@
             </w:tabs>
             <w:rPr>
               <w:noProof/>
+              <w:kern w:val="2"/>
+              <w:sz w:val="24"/>
+              <w:szCs w:val="24"/>
+              <w14:ligatures w14:val="standardContextual"/>
             </w:rPr>
           </w:pPr>
           <w:r>
+            <w:rPr>
+              <w:rFonts w:cstheme="minorHAnsi"/>
+            </w:rPr>
             <w:fldChar w:fldCharType="begin"/>
           </w:r>
           <w:r>
+            <w:rPr>
+              <w:rFonts w:cstheme="minorHAnsi"/>
+            </w:rPr>
             <w:instrText xml:space="preserve"> TOC \o "1-3" \h \z \u </w:instrText>
           </w:r>
           <w:r>
+            <w:rPr>
+              <w:rFonts w:cstheme="minorHAnsi"/>
+            </w:rPr>
             <w:fldChar w:fldCharType="separate"/>
           </w:r>
-          <w:hyperlink w:anchor="_Toc497857968" w:history="1">
+          <w:hyperlink w:anchor="_Toc215589580" w:history="1">
             <w:r>
               <w:rPr>
                 <w:rStyle w:val="Hipervnculo"/>
-                <w:rFonts w:ascii="Arial" w:eastAsia="Times New Roman" w:hAnsi="Arial" w:cs="Arial"/>
+                <w:rFonts w:eastAsia="Times New Roman" w:cstheme="minorHAnsi"/>
                 <w:noProof/>
               </w:rPr>
               <w:t>Introducción</w:t>
@@ -679,7 +675,7 @@
                 <w:noProof/>
                 <w:webHidden/>
               </w:rPr>
-              <w:instrText xml:space="preserve"> PAGEREF _Toc497857968 \h </w:instrText>
+              <w:instrText xml:space="preserve"> PAGEREF _Toc215589580 \h </w:instrText>
             </w:r>
             <w:r>
               <w:rPr>
@@ -718,13 +714,17 @@
             </w:tabs>
             <w:rPr>
               <w:noProof/>
+              <w:kern w:val="2"/>
+              <w:sz w:val="24"/>
+              <w:szCs w:val="24"/>
+              <w14:ligatures w14:val="standardContextual"/>
             </w:rPr>
           </w:pPr>
-          <w:hyperlink w:anchor="_Toc497857969" w:history="1">
+          <w:hyperlink w:anchor="_Toc215589581" w:history="1">
             <w:r>
               <w:rPr>
                 <w:rStyle w:val="Hipervnculo"/>
-                <w:rFonts w:ascii="Arial" w:eastAsia="Times New Roman" w:hAnsi="Arial" w:cs="Arial"/>
+                <w:rFonts w:eastAsia="Times New Roman" w:cstheme="minorHAnsi"/>
                 <w:noProof/>
               </w:rPr>
               <w:t>Alcance</w:t>
@@ -748,7 +748,7 @@
                 <w:noProof/>
                 <w:webHidden/>
               </w:rPr>
-              <w:instrText xml:space="preserve"> PAGEREF _Toc497857969 \h </w:instrText>
+              <w:instrText xml:space="preserve"> PAGEREF _Toc215589581 \h </w:instrText>
             </w:r>
             <w:r>
               <w:rPr>
@@ -787,13 +787,17 @@
             </w:tabs>
             <w:rPr>
               <w:noProof/>
+              <w:kern w:val="2"/>
+              <w:sz w:val="24"/>
+              <w:szCs w:val="24"/>
+              <w14:ligatures w14:val="standardContextual"/>
             </w:rPr>
           </w:pPr>
-          <w:hyperlink w:anchor="_Toc497857970" w:history="1">
+          <w:hyperlink w:anchor="_Toc215589582" w:history="1">
             <w:r>
               <w:rPr>
                 <w:rStyle w:val="Hipervnculo"/>
-                <w:rFonts w:ascii="Arial" w:eastAsia="Times New Roman" w:hAnsi="Arial" w:cs="Arial"/>
+                <w:rFonts w:eastAsia="Times New Roman" w:cstheme="minorHAnsi"/>
                 <w:noProof/>
               </w:rPr>
               <w:t>Propósito</w:t>
@@ -817,7 +821,7 @@
                 <w:noProof/>
                 <w:webHidden/>
               </w:rPr>
-              <w:instrText xml:space="preserve"> PAGEREF _Toc497857970 \h </w:instrText>
+              <w:instrText xml:space="preserve"> PAGEREF _Toc215589582 \h </w:instrText>
             </w:r>
             <w:r>
               <w:rPr>
@@ -856,13 +860,17 @@
             </w:tabs>
             <w:rPr>
               <w:noProof/>
+              <w:kern w:val="2"/>
+              <w:sz w:val="24"/>
+              <w:szCs w:val="24"/>
+              <w14:ligatures w14:val="standardContextual"/>
             </w:rPr>
           </w:pPr>
-          <w:hyperlink w:anchor="_Toc497857971" w:history="1">
+          <w:hyperlink w:anchor="_Toc215589583" w:history="1">
             <w:r>
               <w:rPr>
                 <w:rStyle w:val="Hipervnculo"/>
-                <w:rFonts w:eastAsia="Times New Roman"/>
+                <w:rFonts w:eastAsia="Times New Roman" w:cstheme="minorHAnsi"/>
                 <w:noProof/>
               </w:rPr>
               <w:t>Participantes</w:t>
@@ -886,7 +894,7 @@
                 <w:noProof/>
                 <w:webHidden/>
               </w:rPr>
-              <w:instrText xml:space="preserve"> PAGEREF _Toc497857971 \h </w:instrText>
+              <w:instrText xml:space="preserve"> PAGEREF _Toc215589583 \h </w:instrText>
             </w:r>
             <w:r>
               <w:rPr>
@@ -906,7 +914,7 @@
                 <w:noProof/>
                 <w:webHidden/>
               </w:rPr>
-              <w:t>3</w:t>
+              <w:t>4</w:t>
             </w:r>
             <w:r>
               <w:rPr>
@@ -925,13 +933,17 @@
             </w:tabs>
             <w:rPr>
               <w:noProof/>
+              <w:kern w:val="2"/>
+              <w:sz w:val="24"/>
+              <w:szCs w:val="24"/>
+              <w14:ligatures w14:val="standardContextual"/>
             </w:rPr>
           </w:pPr>
-          <w:hyperlink w:anchor="_Toc497857972" w:history="1">
+          <w:hyperlink w:anchor="_Toc215589584" w:history="1">
             <w:r>
               <w:rPr>
                 <w:rStyle w:val="Hipervnculo"/>
-                <w:rFonts w:eastAsia="Times New Roman"/>
+                <w:rFonts w:eastAsia="Times New Roman" w:cstheme="minorHAnsi"/>
                 <w:noProof/>
               </w:rPr>
               <w:t>Módulos de Capacitaciones</w:t>
@@ -955,7 +967,7 @@
                 <w:noProof/>
                 <w:webHidden/>
               </w:rPr>
-              <w:instrText xml:space="preserve"> PAGEREF _Toc497857972 \h </w:instrText>
+              <w:instrText xml:space="preserve"> PAGEREF _Toc215589584 \h </w:instrText>
             </w:r>
             <w:r>
               <w:rPr>
@@ -975,7 +987,7 @@
                 <w:noProof/>
                 <w:webHidden/>
               </w:rPr>
-              <w:t>4</w:t>
+              <w:t>5</w:t>
             </w:r>
             <w:r>
               <w:rPr>
@@ -994,16 +1006,20 @@
             </w:tabs>
             <w:rPr>
               <w:noProof/>
+              <w:kern w:val="2"/>
+              <w:sz w:val="24"/>
+              <w:szCs w:val="24"/>
+              <w14:ligatures w14:val="standardContextual"/>
             </w:rPr>
           </w:pPr>
-          <w:hyperlink w:anchor="_Toc497857973" w:history="1">
+          <w:hyperlink w:anchor="_Toc215589585" w:history="1">
             <w:r>
               <w:rPr>
                 <w:rStyle w:val="Hipervnculo"/>
-                <w:rFonts w:eastAsia="Times New Roman"/>
+                <w:rFonts w:eastAsia="Times New Roman" w:cstheme="minorHAnsi"/>
                 <w:noProof/>
               </w:rPr>
-              <w:t>Exámenes de Aprendizaje</w:t>
+              <w:t>Exámenes de aprendizaje</w:t>
             </w:r>
             <w:r>
               <w:rPr>
@@ -1024,7 +1040,7 @@
                 <w:noProof/>
                 <w:webHidden/>
               </w:rPr>
-              <w:instrText xml:space="preserve"> PAGEREF _Toc497857973 \h </w:instrText>
+              <w:instrText xml:space="preserve"> PAGEREF _Toc215589585 \h </w:instrText>
             </w:r>
             <w:r>
               <w:rPr>
@@ -1044,7 +1060,7 @@
                 <w:noProof/>
                 <w:webHidden/>
               </w:rPr>
-              <w:t>4</w:t>
+              <w:t>6</w:t>
             </w:r>
             <w:r>
               <w:rPr>
@@ -1056,8 +1072,14 @@
           </w:hyperlink>
         </w:p>
         <w:p>
+          <w:pPr>
+            <w:rPr>
+              <w:rFonts w:cstheme="minorHAnsi"/>
+            </w:rPr>
+          </w:pPr>
           <w:r>
             <w:rPr>
+              <w:rFonts w:cstheme="minorHAnsi"/>
               <w:b/>
               <w:bCs/>
               <w:lang w:val="es-ES"/>
@@ -1070,7 +1092,7 @@
     <w:p>
       <w:pPr>
         <w:rPr>
-          <w:rFonts w:asciiTheme="majorHAnsi" w:eastAsia="Times New Roman" w:hAnsiTheme="majorHAnsi" w:cstheme="majorBidi"/>
+          <w:rFonts w:eastAsia="Times New Roman" w:cstheme="minorHAnsi"/>
           <w:b/>
           <w:bCs/>
           <w:color w:val="365F91" w:themeColor="accent1" w:themeShade="BF"/>
@@ -1080,7 +1102,7 @@
       </w:pPr>
       <w:r>
         <w:rPr>
-          <w:rFonts w:eastAsia="Times New Roman"/>
+          <w:rFonts w:eastAsia="Times New Roman" w:cstheme="minorHAnsi"/>
         </w:rPr>
         <w:br w:type="page"/>
       </w:r>
@@ -1089,7 +1111,7 @@
       <w:pPr>
         <w:pStyle w:val="Ttulo1"/>
         <w:rPr>
-          <w:rFonts w:ascii="Arial" w:eastAsia="Times New Roman" w:hAnsi="Arial" w:cs="Arial"/>
+          <w:rFonts w:asciiTheme="minorHAnsi" w:eastAsia="Times New Roman" w:hAnsiTheme="minorHAnsi" w:cstheme="minorHAnsi"/>
           <w:color w:val="31849B" w:themeColor="accent5" w:themeShade="BF"/>
         </w:rPr>
       </w:pPr>
@@ -1098,14 +1120,14 @@
       <w:pPr>
         <w:pStyle w:val="Ttulo1"/>
         <w:rPr>
-          <w:rFonts w:ascii="Arial" w:eastAsia="Times New Roman" w:hAnsi="Arial" w:cs="Arial"/>
+          <w:rFonts w:asciiTheme="minorHAnsi" w:eastAsia="Times New Roman" w:hAnsiTheme="minorHAnsi" w:cstheme="minorHAnsi"/>
           <w:color w:val="31849B" w:themeColor="accent5" w:themeShade="BF"/>
         </w:rPr>
       </w:pPr>
-      <w:bookmarkStart w:id="0" w:name="_Toc497857968"/>
+      <w:bookmarkStart w:id="0" w:name="_Toc215589580"/>
       <w:r>
         <w:rPr>
-          <w:rFonts w:ascii="Arial" w:eastAsia="Times New Roman" w:hAnsi="Arial" w:cs="Arial"/>
+          <w:rFonts w:asciiTheme="minorHAnsi" w:eastAsia="Times New Roman" w:hAnsiTheme="minorHAnsi" w:cstheme="minorHAnsi"/>
           <w:color w:val="31849B" w:themeColor="accent5" w:themeShade="BF"/>
         </w:rPr>
         <w:t>Introducción</w:t>
@@ -1116,38 +1138,46 @@
       <w:pPr>
         <w:jc w:val="both"/>
         <w:rPr>
-          <w:rFonts w:ascii="Arial" w:hAnsi="Arial" w:cs="Arial"/>
+          <w:rFonts w:cstheme="minorHAnsi"/>
           <w:sz w:val="24"/>
         </w:rPr>
       </w:pPr>
       <w:r>
         <w:rPr>
-          <w:rFonts w:ascii="Arial" w:hAnsi="Arial" w:cs="Arial"/>
-          <w:sz w:val="24"/>
-        </w:rPr>
-        <w:t xml:space="preserve">Introducción del documento </w:t>
+          <w:rFonts w:cstheme="minorHAnsi"/>
+          <w:sz w:val="24"/>
+        </w:rPr>
+        <w:t>El presente Plan de Capacitación tiene como objetivo establecer la metodología, los contenidos y los recursos necesarios para entrenar a los usuarios y administradores del sistema Mi Refugio.</w:t>
       </w:r>
     </w:p>
     <w:p>
       <w:pPr>
         <w:jc w:val="both"/>
         <w:rPr>
-          <w:rFonts w:ascii="Arial" w:hAnsi="Arial" w:cs="Arial"/>
-        </w:rPr>
-      </w:pPr>
+          <w:rFonts w:cstheme="minorHAnsi"/>
+          <w:sz w:val="24"/>
+        </w:rPr>
+      </w:pPr>
+      <w:r>
+        <w:rPr>
+          <w:rFonts w:cstheme="minorHAnsi"/>
+          <w:sz w:val="24"/>
+        </w:rPr>
+        <w:t>La capacitación permitirá que los participantes comprendan el funcionamiento general de la plataforma, sus tres componentes principales (Web, App Móvil y Aplicación Desktop), y los procesos asociados al backend, base de datos y módulo de recomendaciones.</w:t>
+      </w:r>
     </w:p>
     <w:p>
       <w:pPr>
         <w:pStyle w:val="Ttulo1"/>
         <w:rPr>
-          <w:rFonts w:ascii="Arial" w:eastAsia="Times New Roman" w:hAnsi="Arial" w:cs="Arial"/>
+          <w:rFonts w:asciiTheme="minorHAnsi" w:eastAsia="Times New Roman" w:hAnsiTheme="minorHAnsi" w:cstheme="minorHAnsi"/>
           <w:color w:val="31849B" w:themeColor="accent5" w:themeShade="BF"/>
         </w:rPr>
       </w:pPr>
-      <w:bookmarkStart w:id="1" w:name="_Toc497857969"/>
+      <w:bookmarkStart w:id="1" w:name="_Toc215589581"/>
       <w:r>
         <w:rPr>
-          <w:rFonts w:ascii="Arial" w:eastAsia="Times New Roman" w:hAnsi="Arial" w:cs="Arial"/>
+          <w:rFonts w:asciiTheme="minorHAnsi" w:eastAsia="Times New Roman" w:hAnsiTheme="minorHAnsi" w:cstheme="minorHAnsi"/>
           <w:color w:val="31849B" w:themeColor="accent5" w:themeShade="BF"/>
         </w:rPr>
         <w:t>Alcance</w:t>
@@ -1158,35 +1188,135 @@
       <w:pPr>
         <w:jc w:val="both"/>
         <w:rPr>
-          <w:rFonts w:ascii="Arial" w:hAnsi="Arial" w:cs="Arial"/>
-          <w:sz w:val="24"/>
+          <w:rFonts w:cstheme="minorHAnsi"/>
         </w:rPr>
       </w:pPr>
       <w:r>
         <w:rPr>
-          <w:rFonts w:ascii="Arial" w:hAnsi="Arial" w:cs="Arial"/>
-          <w:sz w:val="24"/>
-        </w:rPr>
-        <w:t>El alcance del plan se acota al tiempo inicialmente establecido y al entrenamiento de los participantes en el proyecto.</w:t>
+          <w:rFonts w:cstheme="minorHAnsi"/>
+          <w:sz w:val="24"/>
+        </w:rPr>
+        <w:t>E</w:t>
       </w:r>
-    </w:p>
-    <w:p>
-      <w:pPr>
+      <w:r>
+        <w:rPr>
+          <w:rFonts w:cstheme="minorHAnsi"/>
+        </w:rPr>
+        <w:t>l propósito de este plan abarca:</w:t>
+      </w:r>
+    </w:p>
+    <w:p>
+      <w:pPr>
+        <w:pStyle w:val="Prrafodelista"/>
+        <w:numPr>
+          <w:ilvl w:val="0"/>
+          <w:numId w:val="2"/>
+        </w:numPr>
         <w:jc w:val="both"/>
-      </w:pPr>
+        <w:rPr>
+          <w:rFonts w:cstheme="minorHAnsi"/>
+          <w:sz w:val="24"/>
+        </w:rPr>
+      </w:pPr>
+      <w:r>
+        <w:rPr>
+          <w:rFonts w:cstheme="minorHAnsi"/>
+          <w:sz w:val="24"/>
+        </w:rPr>
+        <w:t>Capacitación funcional para uso de la plataforma Mi Refugio.</w:t>
+      </w:r>
+    </w:p>
+    <w:p>
+      <w:pPr>
+        <w:pStyle w:val="Prrafodelista"/>
+        <w:numPr>
+          <w:ilvl w:val="0"/>
+          <w:numId w:val="2"/>
+        </w:numPr>
+        <w:jc w:val="both"/>
+        <w:rPr>
+          <w:rFonts w:cstheme="minorHAnsi"/>
+          <w:sz w:val="24"/>
+        </w:rPr>
+      </w:pPr>
+      <w:r>
+        <w:rPr>
+          <w:rFonts w:cstheme="minorHAnsi"/>
+          <w:sz w:val="24"/>
+        </w:rPr>
+        <w:t>Entrenamiento técnico básico para administradores y responsables de soporte.</w:t>
+      </w:r>
+    </w:p>
+    <w:p>
+      <w:pPr>
+        <w:pStyle w:val="Prrafodelista"/>
+        <w:numPr>
+          <w:ilvl w:val="0"/>
+          <w:numId w:val="2"/>
+        </w:numPr>
+        <w:jc w:val="both"/>
+        <w:rPr>
+          <w:rFonts w:cstheme="minorHAnsi"/>
+          <w:sz w:val="24"/>
+        </w:rPr>
+      </w:pPr>
+      <w:r>
+        <w:rPr>
+          <w:rFonts w:cstheme="minorHAnsi"/>
+          <w:sz w:val="24"/>
+        </w:rPr>
+        <w:t>Capacitación en el uso de los módulos de gestión, registro emocional, sugerencias, donaciones y chatbot.</w:t>
+      </w:r>
+    </w:p>
+    <w:p>
+      <w:pPr>
+        <w:pStyle w:val="Prrafodelista"/>
+        <w:numPr>
+          <w:ilvl w:val="0"/>
+          <w:numId w:val="2"/>
+        </w:numPr>
+        <w:jc w:val="both"/>
+        <w:rPr>
+          <w:rFonts w:cstheme="minorHAnsi"/>
+          <w:sz w:val="24"/>
+        </w:rPr>
+      </w:pPr>
+      <w:r>
+        <w:rPr>
+          <w:rFonts w:cstheme="minorHAnsi"/>
+          <w:sz w:val="24"/>
+        </w:rPr>
+        <w:t>Explicación del flujo general del sistema y de la interacción entre App, Web, Desktop y API NestJS.</w:t>
+      </w:r>
+    </w:p>
+    <w:p>
+      <w:pPr>
+        <w:jc w:val="both"/>
+        <w:rPr>
+          <w:rFonts w:cstheme="minorHAnsi"/>
+          <w:sz w:val="24"/>
+        </w:rPr>
+      </w:pPr>
+      <w:r>
+        <w:rPr>
+          <w:rFonts w:cstheme="minorHAnsi"/>
+          <w:sz w:val="24"/>
+        </w:rPr>
+        <w:t>El alcance considera únicamente el entrenamiento inicial del personal designado y no cubre capacitaciones masivas ni soporte extendido posterior</w:t>
+      </w:r>
     </w:p>
     <w:p>
       <w:pPr>
         <w:pStyle w:val="Ttulo1"/>
         <w:rPr>
-          <w:rFonts w:ascii="Arial" w:eastAsia="Times New Roman" w:hAnsi="Arial" w:cs="Arial"/>
+          <w:rFonts w:asciiTheme="minorHAnsi" w:eastAsia="Times New Roman" w:hAnsiTheme="minorHAnsi" w:cstheme="minorHAnsi"/>
           <w:color w:val="31849B" w:themeColor="accent5" w:themeShade="BF"/>
         </w:rPr>
       </w:pPr>
-      <w:bookmarkStart w:id="2" w:name="_Toc497857970"/>
+      <w:bookmarkStart w:id="2" w:name="_Toc215589582"/>
       <w:r>
         <w:rPr>
-          <w:rFonts w:ascii="Arial" w:eastAsia="Times New Roman" w:hAnsi="Arial" w:cs="Arial"/>
+          <w:rFonts w:asciiTheme="minorHAnsi" w:eastAsia="Times New Roman" w:hAnsiTheme="minorHAnsi" w:cstheme="minorHAnsi"/>
           <w:color w:val="31849B" w:themeColor="accent5" w:themeShade="BF"/>
         </w:rPr>
         <w:t>Propósito</w:t>
@@ -1197,23 +1327,139 @@
       <w:pPr>
         <w:jc w:val="both"/>
         <w:rPr>
-          <w:rFonts w:ascii="Arial" w:hAnsi="Arial" w:cs="Arial"/>
-          <w:sz w:val="24"/>
+          <w:rFonts w:cstheme="minorHAnsi"/>
         </w:rPr>
       </w:pPr>
       <w:r>
         <w:rPr>
-          <w:rFonts w:ascii="Arial" w:hAnsi="Arial" w:cs="Arial"/>
-          <w:sz w:val="24"/>
-        </w:rPr>
-        <w:t>El propósito es planificar correctamente las actividades de capacitación y entrenamiento para el personal que interactuará con el sistema.</w:t>
+          <w:rFonts w:cstheme="minorHAnsi"/>
+          <w:sz w:val="24"/>
+        </w:rPr>
+        <w:t>El</w:t>
       </w:r>
-    </w:p>
-    <w:p>
-      <w:pPr>
+      <w:r>
+        <w:rPr>
+          <w:rFonts w:eastAsia="Times New Roman" w:cstheme="minorHAnsi"/>
+          <w:sz w:val="24"/>
+          <w:szCs w:val="24"/>
+        </w:rPr>
+        <w:t xml:space="preserve"> </w:t>
+      </w:r>
+      <w:r>
+        <w:rPr>
+          <w:rFonts w:cstheme="minorHAnsi"/>
+        </w:rPr>
+        <w:t>propósito de este plan es:</w:t>
+      </w:r>
+    </w:p>
+    <w:p>
+      <w:pPr>
+        <w:pStyle w:val="Prrafodelista"/>
+        <w:numPr>
+          <w:ilvl w:val="0"/>
+          <w:numId w:val="3"/>
+        </w:numPr>
         <w:jc w:val="both"/>
         <w:rPr>
-          <w:rFonts w:ascii="Arial" w:hAnsi="Arial" w:cs="Arial"/>
+          <w:rFonts w:cstheme="minorHAnsi"/>
+          <w:sz w:val="24"/>
+        </w:rPr>
+      </w:pPr>
+      <w:r>
+        <w:rPr>
+          <w:rFonts w:cstheme="minorHAnsi"/>
+          <w:sz w:val="24"/>
+        </w:rPr>
+        <w:t>Garantizar que los usuarios finales comprendan cómo utilizar las funciones centrales de la plataforma.</w:t>
+      </w:r>
+    </w:p>
+    <w:p>
+      <w:pPr>
+        <w:pStyle w:val="Prrafodelista"/>
+        <w:numPr>
+          <w:ilvl w:val="0"/>
+          <w:numId w:val="3"/>
+        </w:numPr>
+        <w:jc w:val="both"/>
+        <w:rPr>
+          <w:rFonts w:cstheme="minorHAnsi"/>
+          <w:sz w:val="24"/>
+        </w:rPr>
+      </w:pPr>
+      <w:r>
+        <w:rPr>
+          <w:rFonts w:cstheme="minorHAnsi"/>
+          <w:sz w:val="24"/>
+        </w:rPr>
+        <w:t>Hay que asegurar que los administradores del sistema conozcan los procedimientos de configuración, supervisión y soporte.</w:t>
+      </w:r>
+    </w:p>
+    <w:p>
+      <w:pPr>
+        <w:pStyle w:val="Prrafodelista"/>
+        <w:numPr>
+          <w:ilvl w:val="0"/>
+          <w:numId w:val="3"/>
+        </w:numPr>
+        <w:jc w:val="both"/>
+        <w:rPr>
+          <w:rFonts w:cstheme="minorHAnsi"/>
+          <w:sz w:val="24"/>
+        </w:rPr>
+      </w:pPr>
+      <w:r>
+        <w:rPr>
+          <w:rFonts w:cstheme="minorHAnsi"/>
+          <w:sz w:val="24"/>
+        </w:rPr>
+        <w:t>Reducir errores operativos mediante aprendizaje práctico y guiado.</w:t>
+      </w:r>
+    </w:p>
+    <w:p>
+      <w:pPr>
+        <w:pStyle w:val="Prrafodelista"/>
+        <w:numPr>
+          <w:ilvl w:val="0"/>
+          <w:numId w:val="3"/>
+        </w:numPr>
+        <w:jc w:val="both"/>
+        <w:rPr>
+          <w:rFonts w:cstheme="minorHAnsi"/>
+          <w:sz w:val="24"/>
+        </w:rPr>
+      </w:pPr>
+      <w:r>
+        <w:rPr>
+          <w:rFonts w:cstheme="minorHAnsi"/>
+          <w:sz w:val="24"/>
+        </w:rPr>
+        <w:t>Preparar a los equipos para adoptar eficazmente la solución tecnológica.</w:t>
+      </w:r>
+    </w:p>
+    <w:p>
+      <w:pPr>
+        <w:jc w:val="both"/>
+        <w:rPr>
+          <w:rFonts w:cstheme="minorHAnsi"/>
+          <w:sz w:val="24"/>
+        </w:rPr>
+      </w:pPr>
+    </w:p>
+    <w:p>
+      <w:pPr>
+        <w:jc w:val="both"/>
+        <w:rPr>
+          <w:rFonts w:cstheme="minorHAnsi"/>
+          <w:sz w:val="24"/>
+        </w:rPr>
+      </w:pPr>
+    </w:p>
+    <w:p>
+      <w:pPr>
+        <w:jc w:val="both"/>
+        <w:rPr>
+          <w:rFonts w:cstheme="minorHAnsi"/>
+          <w:sz w:val="24"/>
         </w:rPr>
       </w:pPr>
     </w:p>
@@ -1221,96 +1467,409 @@
       <w:pPr>
         <w:pStyle w:val="Ttulo1"/>
         <w:rPr>
-          <w:rFonts w:eastAsia="Times New Roman"/>
+          <w:rFonts w:asciiTheme="minorHAnsi" w:eastAsia="Times New Roman" w:hAnsiTheme="minorHAnsi" w:cstheme="minorHAnsi"/>
           <w:color w:val="31849B" w:themeColor="accent5" w:themeShade="BF"/>
         </w:rPr>
       </w:pPr>
-      <w:bookmarkStart w:id="3" w:name="_Toc497857971"/>
+      <w:bookmarkStart w:id="3" w:name="_Toc215589583"/>
       <w:r>
         <w:rPr>
-          <w:rFonts w:eastAsia="Times New Roman"/>
+          <w:rFonts w:asciiTheme="minorHAnsi" w:eastAsia="Times New Roman" w:hAnsiTheme="minorHAnsi" w:cstheme="minorHAnsi"/>
           <w:color w:val="31849B" w:themeColor="accent5" w:themeShade="BF"/>
         </w:rPr>
+        <w:lastRenderedPageBreak/>
         <w:t>Participantes</w:t>
       </w:r>
       <w:bookmarkEnd w:id="3"/>
     </w:p>
-    <w:p/>
     <w:p>
       <w:pPr>
         <w:jc w:val="both"/>
         <w:rPr>
-          <w:sz w:val="28"/>
+          <w:rFonts w:cstheme="minorHAnsi"/>
+          <w:sz w:val="24"/>
+          <w:szCs w:val="24"/>
         </w:rPr>
       </w:pPr>
       <w:r>
         <w:rPr>
-          <w:sz w:val="28"/>
-        </w:rPr>
-        <w:t>Personal o colaboradores que participaran de la capacitación:</w:t>
+          <w:rFonts w:cstheme="minorHAnsi"/>
+          <w:sz w:val="24"/>
+          <w:szCs w:val="24"/>
+        </w:rPr>
+        <w:t>Los participantes involucrados en las actividades de capacitación son:</w:t>
       </w:r>
     </w:p>
-    <w:p/>
-    <w:p/>
-    <w:p/>
-    <w:p/>
-    <w:p/>
-    <w:p/>
-    <w:p/>
-    <w:p/>
-    <w:p/>
-    <w:p/>
-    <w:p/>
+    <w:p>
+      <w:pPr>
+        <w:jc w:val="both"/>
+        <w:rPr>
+          <w:rFonts w:cstheme="minorHAnsi"/>
+          <w:b/>
+          <w:bCs/>
+          <w:sz w:val="24"/>
+          <w:szCs w:val="24"/>
+        </w:rPr>
+      </w:pPr>
+      <w:r>
+        <w:rPr>
+          <w:rFonts w:cstheme="minorHAnsi"/>
+          <w:b/>
+          <w:bCs/>
+          <w:sz w:val="24"/>
+          <w:szCs w:val="24"/>
+        </w:rPr>
+        <w:t>Usuarios finales</w:t>
+      </w:r>
+    </w:p>
+    <w:p>
+      <w:pPr>
+        <w:numPr>
+          <w:ilvl w:val="0"/>
+          <w:numId w:val="4"/>
+        </w:numPr>
+        <w:jc w:val="both"/>
+        <w:rPr>
+          <w:rFonts w:cstheme="minorHAnsi"/>
+          <w:sz w:val="24"/>
+          <w:szCs w:val="24"/>
+        </w:rPr>
+      </w:pPr>
+      <w:r>
+        <w:rPr>
+          <w:rFonts w:cstheme="minorHAnsi"/>
+          <w:sz w:val="24"/>
+          <w:szCs w:val="24"/>
+        </w:rPr>
+        <w:t>Estudiantes o personas que utilizarán la App Móvil para registro emocional.</w:t>
+      </w:r>
+    </w:p>
+    <w:p>
+      <w:pPr>
+        <w:numPr>
+          <w:ilvl w:val="0"/>
+          <w:numId w:val="4"/>
+        </w:numPr>
+        <w:jc w:val="both"/>
+        <w:rPr>
+          <w:rFonts w:cstheme="minorHAnsi"/>
+          <w:sz w:val="24"/>
+          <w:szCs w:val="24"/>
+        </w:rPr>
+      </w:pPr>
+      <w:r>
+        <w:rPr>
+          <w:rFonts w:cstheme="minorHAnsi"/>
+          <w:sz w:val="24"/>
+          <w:szCs w:val="24"/>
+        </w:rPr>
+        <w:t>Usuarios que accederán a la Web para sugerencias, recursos y donaciones.</w:t>
+      </w:r>
+    </w:p>
+    <w:p>
+      <w:pPr>
+        <w:jc w:val="both"/>
+        <w:rPr>
+          <w:rFonts w:cstheme="minorHAnsi"/>
+          <w:b/>
+          <w:bCs/>
+          <w:sz w:val="24"/>
+          <w:szCs w:val="24"/>
+        </w:rPr>
+      </w:pPr>
+      <w:r>
+        <w:rPr>
+          <w:rFonts w:cstheme="minorHAnsi"/>
+          <w:b/>
+          <w:bCs/>
+          <w:sz w:val="24"/>
+          <w:szCs w:val="24"/>
+        </w:rPr>
+        <w:t>Administradores del sistema</w:t>
+      </w:r>
+    </w:p>
+    <w:p>
+      <w:pPr>
+        <w:numPr>
+          <w:ilvl w:val="0"/>
+          <w:numId w:val="5"/>
+        </w:numPr>
+        <w:jc w:val="both"/>
+        <w:rPr>
+          <w:rFonts w:cstheme="minorHAnsi"/>
+          <w:sz w:val="24"/>
+          <w:szCs w:val="24"/>
+        </w:rPr>
+      </w:pPr>
+      <w:r>
+        <w:rPr>
+          <w:rFonts w:cstheme="minorHAnsi"/>
+          <w:sz w:val="24"/>
+          <w:szCs w:val="24"/>
+        </w:rPr>
+        <w:t>Personal encargado de soporte y monitoreo.</w:t>
+      </w:r>
+    </w:p>
+    <w:p>
+      <w:pPr>
+        <w:numPr>
+          <w:ilvl w:val="0"/>
+          <w:numId w:val="5"/>
+        </w:numPr>
+        <w:jc w:val="both"/>
+        <w:rPr>
+          <w:rFonts w:cstheme="minorHAnsi"/>
+          <w:sz w:val="24"/>
+          <w:szCs w:val="24"/>
+        </w:rPr>
+      </w:pPr>
+      <w:r>
+        <w:rPr>
+          <w:rFonts w:cstheme="minorHAnsi"/>
+          <w:sz w:val="24"/>
+          <w:szCs w:val="24"/>
+        </w:rPr>
+        <w:t>Encargados de revisar base de datos y logs.</w:t>
+      </w:r>
+    </w:p>
+    <w:p>
+      <w:pPr>
+        <w:numPr>
+          <w:ilvl w:val="0"/>
+          <w:numId w:val="5"/>
+        </w:numPr>
+        <w:jc w:val="both"/>
+        <w:rPr>
+          <w:rFonts w:cstheme="minorHAnsi"/>
+          <w:sz w:val="24"/>
+          <w:szCs w:val="24"/>
+        </w:rPr>
+      </w:pPr>
+      <w:r>
+        <w:rPr>
+          <w:rFonts w:cstheme="minorHAnsi"/>
+          <w:sz w:val="24"/>
+          <w:szCs w:val="24"/>
+        </w:rPr>
+        <w:t>Encargados del mantenimiento del backend.</w:t>
+      </w:r>
+    </w:p>
+    <w:p>
+      <w:pPr>
+        <w:jc w:val="both"/>
+        <w:rPr>
+          <w:rFonts w:cstheme="minorHAnsi"/>
+          <w:b/>
+          <w:bCs/>
+          <w:sz w:val="24"/>
+          <w:szCs w:val="24"/>
+        </w:rPr>
+      </w:pPr>
+      <w:r>
+        <w:rPr>
+          <w:rFonts w:cstheme="minorHAnsi"/>
+          <w:b/>
+          <w:bCs/>
+          <w:sz w:val="24"/>
+          <w:szCs w:val="24"/>
+        </w:rPr>
+        <w:t>Equipo técnico</w:t>
+      </w:r>
+    </w:p>
+    <w:p>
+      <w:pPr>
+        <w:numPr>
+          <w:ilvl w:val="0"/>
+          <w:numId w:val="6"/>
+        </w:numPr>
+        <w:jc w:val="both"/>
+        <w:rPr>
+          <w:rFonts w:cstheme="minorHAnsi"/>
+          <w:sz w:val="24"/>
+          <w:szCs w:val="24"/>
+        </w:rPr>
+      </w:pPr>
+      <w:r>
+        <w:rPr>
+          <w:rFonts w:cstheme="minorHAnsi"/>
+          <w:sz w:val="24"/>
+          <w:szCs w:val="24"/>
+        </w:rPr>
+        <w:t>Desarrolladores de Mi Refugio</w:t>
+      </w:r>
+    </w:p>
+    <w:p>
+      <w:pPr>
+        <w:numPr>
+          <w:ilvl w:val="0"/>
+          <w:numId w:val="6"/>
+        </w:numPr>
+        <w:jc w:val="both"/>
+        <w:rPr>
+          <w:rFonts w:cstheme="minorHAnsi"/>
+          <w:sz w:val="24"/>
+          <w:szCs w:val="24"/>
+        </w:rPr>
+      </w:pPr>
+      <w:r>
+        <w:rPr>
+          <w:rFonts w:cstheme="minorHAnsi"/>
+          <w:sz w:val="24"/>
+          <w:szCs w:val="24"/>
+        </w:rPr>
+        <w:t>Personal encargado de actualizaciones o mejoras futuras</w:t>
+      </w:r>
+    </w:p>
+    <w:p>
+      <w:pPr>
+        <w:jc w:val="both"/>
+        <w:rPr>
+          <w:rFonts w:cstheme="minorHAnsi"/>
+          <w:sz w:val="24"/>
+          <w:szCs w:val="24"/>
+        </w:rPr>
+      </w:pPr>
+    </w:p>
+    <w:p>
+      <w:pPr>
+        <w:jc w:val="both"/>
+        <w:rPr>
+          <w:rFonts w:cstheme="minorHAnsi"/>
+          <w:sz w:val="24"/>
+          <w:szCs w:val="24"/>
+        </w:rPr>
+      </w:pPr>
+    </w:p>
+    <w:p>
+      <w:pPr>
+        <w:jc w:val="both"/>
+        <w:rPr>
+          <w:rFonts w:cstheme="minorHAnsi"/>
+          <w:sz w:val="24"/>
+          <w:szCs w:val="24"/>
+        </w:rPr>
+      </w:pPr>
+    </w:p>
+    <w:p>
+      <w:pPr>
+        <w:jc w:val="both"/>
+        <w:rPr>
+          <w:rFonts w:cstheme="minorHAnsi"/>
+          <w:sz w:val="24"/>
+          <w:szCs w:val="24"/>
+        </w:rPr>
+      </w:pPr>
+    </w:p>
+    <w:p>
+      <w:pPr>
+        <w:jc w:val="both"/>
+        <w:rPr>
+          <w:rFonts w:cstheme="minorHAnsi"/>
+          <w:sz w:val="24"/>
+          <w:szCs w:val="24"/>
+        </w:rPr>
+      </w:pPr>
+    </w:p>
+    <w:p>
+      <w:pPr>
+        <w:jc w:val="both"/>
+        <w:rPr>
+          <w:rFonts w:cstheme="minorHAnsi"/>
+          <w:sz w:val="24"/>
+          <w:szCs w:val="24"/>
+        </w:rPr>
+      </w:pPr>
+    </w:p>
+    <w:p>
+      <w:pPr>
+        <w:jc w:val="both"/>
+        <w:rPr>
+          <w:rFonts w:cstheme="minorHAnsi"/>
+          <w:sz w:val="24"/>
+          <w:szCs w:val="24"/>
+        </w:rPr>
+      </w:pPr>
+    </w:p>
+    <w:p>
+      <w:pPr>
+        <w:jc w:val="both"/>
+        <w:rPr>
+          <w:rFonts w:cstheme="minorHAnsi"/>
+          <w:sz w:val="24"/>
+          <w:szCs w:val="24"/>
+        </w:rPr>
+      </w:pPr>
+    </w:p>
+    <w:p>
+      <w:pPr>
+        <w:jc w:val="both"/>
+        <w:rPr>
+          <w:rFonts w:cstheme="minorHAnsi"/>
+          <w:sz w:val="24"/>
+          <w:szCs w:val="24"/>
+        </w:rPr>
+      </w:pPr>
+    </w:p>
+    <w:p>
+      <w:pPr>
+        <w:jc w:val="both"/>
+        <w:rPr>
+          <w:rFonts w:cstheme="minorHAnsi"/>
+          <w:sz w:val="24"/>
+          <w:szCs w:val="24"/>
+        </w:rPr>
+      </w:pPr>
+    </w:p>
+    <w:p>
+      <w:pPr>
+        <w:jc w:val="both"/>
+        <w:rPr>
+          <w:rFonts w:cstheme="minorHAnsi"/>
+          <w:sz w:val="24"/>
+          <w:szCs w:val="24"/>
+        </w:rPr>
+      </w:pPr>
+    </w:p>
     <w:p>
       <w:pPr>
         <w:pStyle w:val="Ttulo1"/>
         <w:rPr>
-          <w:rFonts w:eastAsia="Times New Roman"/>
+          <w:rFonts w:asciiTheme="minorHAnsi" w:hAnsiTheme="minorHAnsi" w:cstheme="minorHAnsi"/>
+          <w:i/>
+          <w:color w:val="0070C0"/>
+        </w:rPr>
+      </w:pPr>
+      <w:bookmarkStart w:id="4" w:name="_Toc215589584"/>
+      <w:r>
+        <w:rPr>
+          <w:rFonts w:asciiTheme="minorHAnsi" w:eastAsia="Times New Roman" w:hAnsiTheme="minorHAnsi" w:cstheme="minorHAnsi"/>
           <w:color w:val="31849B" w:themeColor="accent5" w:themeShade="BF"/>
         </w:rPr>
-      </w:pPr>
-      <w:bookmarkStart w:id="4" w:name="_Toc497857972"/>
-      <w:r>
-        <w:rPr>
-          <w:rFonts w:eastAsia="Times New Roman"/>
-          <w:color w:val="31849B" w:themeColor="accent5" w:themeShade="BF"/>
-        </w:rPr>
+        <w:lastRenderedPageBreak/>
         <w:t>Módulos de Capacitaciones</w:t>
       </w:r>
       <w:bookmarkEnd w:id="4"/>
-    </w:p>
-    <w:p>
-      <w:pPr>
-        <w:rPr>
+      <w:r>
+        <w:rPr>
+          <w:rFonts w:asciiTheme="minorHAnsi" w:hAnsiTheme="minorHAnsi" w:cstheme="minorHAnsi"/>
           <w:i/>
           <w:color w:val="0070C0"/>
         </w:rPr>
+        <w:t xml:space="preserve"> </w:t>
+      </w:r>
+    </w:p>
+    <w:p>
+      <w:pPr>
+        <w:rPr>
+          <w:rFonts w:cstheme="minorHAnsi"/>
+        </w:rPr>
       </w:pPr>
       <w:r>
         <w:rPr>
-          <w:i/>
-          <w:color w:val="0070C0"/>
-        </w:rPr>
-        <w:t xml:space="preserve">Descripción de las capacitaciones que se desarrollaran </w:t>
-      </w:r>
-    </w:p>
-    <w:p>
-      <w:pPr>
-        <w:jc w:val="both"/>
-        <w:rPr>
+          <w:rFonts w:cstheme="minorHAnsi"/>
           <w:sz w:val="28"/>
         </w:rPr>
-      </w:pPr>
-      <w:r>
-        <w:rPr>
-          <w:sz w:val="28"/>
-        </w:rPr>
-        <w:t>Los módulos de capacitación a desarrollarse son:</w:t>
-      </w:r>
-    </w:p>
-    <w:p>
-      <w:r>
-        <w:t>Ejemplo:</w:t>
+        <w:t>A continuación, se detallan los módulos de capacitación definidos para el proyecto:</w:t>
       </w:r>
     </w:p>
     <w:tbl>
@@ -1336,13 +1895,17 @@
             <w:pPr>
               <w:pStyle w:val="Sinespaciado"/>
               <w:rPr>
+                <w:rFonts w:cstheme="minorHAnsi"/>
                 <w:b w:val="0"/>
-                <w:sz w:val="28"/>
+                <w:sz w:val="24"/>
+                <w:szCs w:val="24"/>
               </w:rPr>
             </w:pPr>
             <w:r>
               <w:rPr>
-                <w:sz w:val="28"/>
+                <w:rFonts w:cstheme="minorHAnsi"/>
+                <w:sz w:val="24"/>
+                <w:szCs w:val="24"/>
               </w:rPr>
               <w:t>Nro.</w:t>
             </w:r>
@@ -1357,12 +1920,16 @@
               <w:pStyle w:val="Sinespaciado"/>
               <w:cnfStyle w:val="100000000000" w:firstRow="1" w:lastRow="0" w:firstColumn="0" w:lastColumn="0" w:oddVBand="0" w:evenVBand="0" w:oddHBand="0" w:evenHBand="0" w:firstRowFirstColumn="0" w:firstRowLastColumn="0" w:lastRowFirstColumn="0" w:lastRowLastColumn="0"/>
               <w:rPr>
-                <w:sz w:val="28"/>
+                <w:rFonts w:cstheme="minorHAnsi"/>
+                <w:sz w:val="24"/>
+                <w:szCs w:val="24"/>
               </w:rPr>
             </w:pPr>
             <w:r>
               <w:rPr>
-                <w:sz w:val="28"/>
+                <w:rFonts w:cstheme="minorHAnsi"/>
+                <w:sz w:val="24"/>
+                <w:szCs w:val="24"/>
               </w:rPr>
               <w:t>1</w:t>
             </w:r>
@@ -1382,13 +1949,17 @@
             <w:pPr>
               <w:pStyle w:val="Sinespaciado"/>
               <w:rPr>
+                <w:rFonts w:cstheme="minorHAnsi"/>
                 <w:b w:val="0"/>
-                <w:sz w:val="28"/>
+                <w:sz w:val="24"/>
+                <w:szCs w:val="24"/>
               </w:rPr>
             </w:pPr>
             <w:r>
               <w:rPr>
-                <w:sz w:val="28"/>
+                <w:rFonts w:cstheme="minorHAnsi"/>
+                <w:sz w:val="24"/>
+                <w:szCs w:val="24"/>
               </w:rPr>
               <w:t>Nombre Capacitación</w:t>
             </w:r>
@@ -1403,14 +1974,18 @@
               <w:pStyle w:val="Sinespaciado"/>
               <w:cnfStyle w:val="000000100000" w:firstRow="0" w:lastRow="0" w:firstColumn="0" w:lastColumn="0" w:oddVBand="0" w:evenVBand="0" w:oddHBand="1" w:evenHBand="0" w:firstRowFirstColumn="0" w:firstRowLastColumn="0" w:lastRowFirstColumn="0" w:lastRowLastColumn="0"/>
               <w:rPr>
-                <w:sz w:val="28"/>
+                <w:rFonts w:cstheme="minorHAnsi"/>
+                <w:sz w:val="24"/>
+                <w:szCs w:val="24"/>
               </w:rPr>
             </w:pPr>
             <w:r>
               <w:rPr>
-                <w:sz w:val="28"/>
-              </w:rPr>
-              <w:t>Administración Principal de Sistema</w:t>
+                <w:rFonts w:cstheme="minorHAnsi"/>
+                <w:sz w:val="24"/>
+                <w:szCs w:val="24"/>
+              </w:rPr>
+              <w:t>Introducción y uso de la plataforma web</w:t>
             </w:r>
           </w:p>
         </w:tc>
@@ -1425,13 +2000,17 @@
             <w:pPr>
               <w:pStyle w:val="Sinespaciado"/>
               <w:rPr>
+                <w:rFonts w:cstheme="minorHAnsi"/>
                 <w:b w:val="0"/>
-                <w:sz w:val="28"/>
+                <w:sz w:val="24"/>
+                <w:szCs w:val="24"/>
               </w:rPr>
             </w:pPr>
             <w:r>
               <w:rPr>
-                <w:sz w:val="28"/>
+                <w:rFonts w:cstheme="minorHAnsi"/>
+                <w:sz w:val="24"/>
+                <w:szCs w:val="24"/>
               </w:rPr>
               <w:t>Descripción</w:t>
             </w:r>
@@ -1446,14 +2025,19 @@
               <w:pStyle w:val="Sinespaciado"/>
               <w:cnfStyle w:val="000000000000" w:firstRow="0" w:lastRow="0" w:firstColumn="0" w:lastColumn="0" w:oddVBand="0" w:evenVBand="0" w:oddHBand="0" w:evenHBand="0" w:firstRowFirstColumn="0" w:firstRowLastColumn="0" w:lastRowFirstColumn="0" w:lastRowLastColumn="0"/>
               <w:rPr>
-                <w:sz w:val="28"/>
+                <w:rFonts w:cstheme="minorHAnsi"/>
+                <w:sz w:val="24"/>
+                <w:szCs w:val="24"/>
               </w:rPr>
             </w:pPr>
             <w:r>
               <w:rPr>
-                <w:sz w:val="28"/>
-              </w:rPr>
-              <w:t>En este entrenamiento se abordará la administración general y las configuraciones principales para que este sistema funcione.</w:t>
+                <w:rFonts w:cstheme="minorHAnsi"/>
+                <w:sz w:val="24"/>
+                <w:szCs w:val="24"/>
+                <w:lang w:val="es-CL"/>
+              </w:rPr>
+              <w:t>Capacitación sobre acceso, navegación, visualización de recursos, envío de sugerencias y flujo de donaciones.</w:t>
             </w:r>
           </w:p>
         </w:tc>
@@ -1471,13 +2055,17 @@
             <w:pPr>
               <w:pStyle w:val="Sinespaciado"/>
               <w:rPr>
+                <w:rFonts w:cstheme="minorHAnsi"/>
                 <w:b w:val="0"/>
-                <w:sz w:val="28"/>
+                <w:sz w:val="24"/>
+                <w:szCs w:val="24"/>
               </w:rPr>
             </w:pPr>
             <w:r>
               <w:rPr>
-                <w:sz w:val="28"/>
+                <w:rFonts w:cstheme="minorHAnsi"/>
+                <w:sz w:val="24"/>
+                <w:szCs w:val="24"/>
               </w:rPr>
               <w:t>Contenido</w:t>
             </w:r>
@@ -1496,110 +2084,120 @@
               </w:numPr>
               <w:cnfStyle w:val="000000100000" w:firstRow="0" w:lastRow="0" w:firstColumn="0" w:lastColumn="0" w:oddVBand="0" w:evenVBand="0" w:oddHBand="1" w:evenHBand="0" w:firstRowFirstColumn="0" w:firstRowLastColumn="0" w:lastRowFirstColumn="0" w:lastRowLastColumn="0"/>
               <w:rPr>
-                <w:sz w:val="28"/>
+                <w:rFonts w:cstheme="minorHAnsi"/>
+                <w:vanish/>
+                <w:sz w:val="24"/>
+                <w:szCs w:val="24"/>
+                <w:lang w:val="es-CL"/>
               </w:rPr>
             </w:pPr>
-            <w:r>
-              <w:rPr>
-                <w:sz w:val="28"/>
-              </w:rPr>
-              <w:t>Administrar Usuarios</w:t>
-            </w:r>
           </w:p>
+          <w:tbl>
+            <w:tblPr>
+              <w:tblW w:w="0" w:type="auto"/>
+              <w:tblCellSpacing w:w="15" w:type="dxa"/>
+              <w:tblCellMar>
+                <w:top w:w="15" w:type="dxa"/>
+                <w:left w:w="15" w:type="dxa"/>
+                <w:bottom w:w="15" w:type="dxa"/>
+                <w:right w:w="15" w:type="dxa"/>
+              </w:tblCellMar>
+              <w:tblLook w:val="04A0" w:firstRow="1" w:lastRow="0" w:firstColumn="1" w:lastColumn="0" w:noHBand="0" w:noVBand="1"/>
+            </w:tblPr>
+            <w:tblGrid>
+              <w:gridCol w:w="3602"/>
+            </w:tblGrid>
+            <w:tr>
+              <w:trPr>
+                <w:tblCellSpacing w:w="15" w:type="dxa"/>
+              </w:trPr>
+              <w:tc>
+                <w:tcPr>
+                  <w:tcW w:w="0" w:type="auto"/>
+                  <w:vAlign w:val="center"/>
+                  <w:hideMark/>
+                </w:tcPr>
+                <w:p>
+                  <w:pPr>
+                    <w:pStyle w:val="Sinespaciado"/>
+                    <w:ind w:left="360"/>
+                    <w:rPr>
+                      <w:rFonts w:cstheme="minorHAnsi"/>
+                      <w:color w:val="31849B" w:themeColor="accent5" w:themeShade="BF"/>
+                      <w:sz w:val="24"/>
+                      <w:szCs w:val="24"/>
+                      <w:lang w:val="es-CL"/>
+                    </w:rPr>
+                  </w:pPr>
+                  <w:r>
+                    <w:rPr>
+                      <w:rFonts w:cstheme="minorHAnsi"/>
+                      <w:color w:val="31849B" w:themeColor="accent5" w:themeShade="BF"/>
+                      <w:sz w:val="24"/>
+                      <w:szCs w:val="24"/>
+                      <w:lang w:val="es-CL"/>
+                    </w:rPr>
+                    <w:t>- Inicio de sesión</w:t>
+                  </w:r>
+                  <w:r>
+                    <w:rPr>
+                      <w:rFonts w:cstheme="minorHAnsi"/>
+                      <w:color w:val="31849B" w:themeColor="accent5" w:themeShade="BF"/>
+                      <w:sz w:val="24"/>
+                      <w:szCs w:val="24"/>
+                      <w:lang w:val="es-CL"/>
+                    </w:rPr>
+                    <w:br/>
+                    <w:t>- Gestión de perfil</w:t>
+                  </w:r>
+                  <w:r>
+                    <w:rPr>
+                      <w:rFonts w:cstheme="minorHAnsi"/>
+                      <w:color w:val="31849B" w:themeColor="accent5" w:themeShade="BF"/>
+                      <w:sz w:val="24"/>
+                      <w:szCs w:val="24"/>
+                      <w:lang w:val="es-CL"/>
+                    </w:rPr>
+                    <w:br/>
+                    <w:t>- Envío de sugerencias</w:t>
+                  </w:r>
+                  <w:r>
+                    <w:rPr>
+                      <w:rFonts w:cstheme="minorHAnsi"/>
+                      <w:color w:val="31849B" w:themeColor="accent5" w:themeShade="BF"/>
+                      <w:sz w:val="24"/>
+                      <w:szCs w:val="24"/>
+                      <w:lang w:val="es-CL"/>
+                    </w:rPr>
+                    <w:br/>
+                    <w:t>- Acceso a recursos informativos</w:t>
+                  </w:r>
+                  <w:r>
+                    <w:rPr>
+                      <w:rFonts w:cstheme="minorHAnsi"/>
+                      <w:color w:val="31849B" w:themeColor="accent5" w:themeShade="BF"/>
+                      <w:sz w:val="24"/>
+                      <w:szCs w:val="24"/>
+                      <w:lang w:val="es-CL"/>
+                    </w:rPr>
+                    <w:br/>
+                    <w:t>- Flujo de donaciones</w:t>
+                  </w:r>
+                </w:p>
+              </w:tc>
+            </w:tr>
+          </w:tbl>
           <w:p>
             <w:pPr>
               <w:pStyle w:val="Sinespaciado"/>
-              <w:numPr>
-                <w:ilvl w:val="0"/>
-                <w:numId w:val="1"/>
-              </w:numPr>
+              <w:ind w:left="720"/>
               <w:cnfStyle w:val="000000100000" w:firstRow="0" w:lastRow="0" w:firstColumn="0" w:lastColumn="0" w:oddVBand="0" w:evenVBand="0" w:oddHBand="1" w:evenHBand="0" w:firstRowFirstColumn="0" w:firstRowLastColumn="0" w:lastRowFirstColumn="0" w:lastRowLastColumn="0"/>
               <w:rPr>
-                <w:sz w:val="28"/>
+                <w:rFonts w:cstheme="minorHAnsi"/>
+                <w:sz w:val="24"/>
+                <w:szCs w:val="24"/>
               </w:rPr>
             </w:pPr>
-            <w:r>
-              <w:rPr>
-                <w:sz w:val="28"/>
-              </w:rPr>
-              <w:t>Administrar Roles</w:t>
-            </w:r>
-          </w:p>
-          <w:p>
-            <w:pPr>
-              <w:pStyle w:val="Sinespaciado"/>
-              <w:numPr>
-                <w:ilvl w:val="0"/>
-                <w:numId w:val="1"/>
-              </w:numPr>
-              <w:cnfStyle w:val="000000100000" w:firstRow="0" w:lastRow="0" w:firstColumn="0" w:lastColumn="0" w:oddVBand="0" w:evenVBand="0" w:oddHBand="1" w:evenHBand="0" w:firstRowFirstColumn="0" w:firstRowLastColumn="0" w:lastRowFirstColumn="0" w:lastRowLastColumn="0"/>
-              <w:rPr>
-                <w:sz w:val="28"/>
-              </w:rPr>
-            </w:pPr>
-            <w:r>
-              <w:rPr>
-                <w:sz w:val="28"/>
-              </w:rPr>
-              <w:t>Administrar Salas</w:t>
-            </w:r>
-          </w:p>
-          <w:p>
-            <w:pPr>
-              <w:pStyle w:val="Sinespaciado"/>
-              <w:numPr>
-                <w:ilvl w:val="0"/>
-                <w:numId w:val="1"/>
-              </w:numPr>
-              <w:cnfStyle w:val="000000100000" w:firstRow="0" w:lastRow="0" w:firstColumn="0" w:lastColumn="0" w:oddVBand="0" w:evenVBand="0" w:oddHBand="1" w:evenHBand="0" w:firstRowFirstColumn="0" w:firstRowLastColumn="0" w:lastRowFirstColumn="0" w:lastRowLastColumn="0"/>
-              <w:rPr>
-                <w:sz w:val="28"/>
-              </w:rPr>
-            </w:pPr>
-            <w:r>
-              <w:rPr>
-                <w:sz w:val="28"/>
-              </w:rPr>
-              <w:t>Administrar Racks</w:t>
-            </w:r>
-          </w:p>
-          <w:p>
-            <w:pPr>
-              <w:pStyle w:val="Sinespaciado"/>
-              <w:numPr>
-                <w:ilvl w:val="0"/>
-                <w:numId w:val="1"/>
-              </w:numPr>
-              <w:cnfStyle w:val="000000100000" w:firstRow="0" w:lastRow="0" w:firstColumn="0" w:lastColumn="0" w:oddVBand="0" w:evenVBand="0" w:oddHBand="1" w:evenHBand="0" w:firstRowFirstColumn="0" w:firstRowLastColumn="0" w:lastRowFirstColumn="0" w:lastRowLastColumn="0"/>
-              <w:rPr>
-                <w:sz w:val="28"/>
-              </w:rPr>
-            </w:pPr>
-            <w:r>
-              <w:rPr>
-                <w:sz w:val="28"/>
-              </w:rPr>
-              <w:t>Administrar Ubicaciones Físicas</w:t>
-            </w:r>
-          </w:p>
-          <w:p>
-            <w:pPr>
-              <w:pStyle w:val="Sinespaciado"/>
-              <w:numPr>
-                <w:ilvl w:val="0"/>
-                <w:numId w:val="1"/>
-              </w:numPr>
-              <w:cnfStyle w:val="000000100000" w:firstRow="0" w:lastRow="0" w:firstColumn="0" w:lastColumn="0" w:oddVBand="0" w:evenVBand="0" w:oddHBand="1" w:evenHBand="0" w:firstRowFirstColumn="0" w:firstRowLastColumn="0" w:lastRowFirstColumn="0" w:lastRowLastColumn="0"/>
-              <w:rPr>
-                <w:sz w:val="28"/>
-              </w:rPr>
-            </w:pPr>
-            <w:r>
-              <w:rPr>
-                <w:sz w:val="28"/>
-              </w:rPr>
-              <w:t>Administrar Servidores</w:t>
-            </w:r>
           </w:p>
         </w:tc>
       </w:tr>
@@ -1613,13 +2211,17 @@
             <w:pPr>
               <w:pStyle w:val="Sinespaciado"/>
               <w:rPr>
+                <w:rFonts w:cstheme="minorHAnsi"/>
                 <w:b w:val="0"/>
-                <w:sz w:val="28"/>
+                <w:sz w:val="24"/>
+                <w:szCs w:val="24"/>
               </w:rPr>
             </w:pPr>
             <w:r>
               <w:rPr>
-                <w:sz w:val="28"/>
+                <w:rFonts w:cstheme="minorHAnsi"/>
+                <w:sz w:val="24"/>
+                <w:szCs w:val="24"/>
               </w:rPr>
               <w:t>Relator</w:t>
             </w:r>
@@ -1634,14 +2236,18 @@
               <w:pStyle w:val="Sinespaciado"/>
               <w:cnfStyle w:val="000000000000" w:firstRow="0" w:lastRow="0" w:firstColumn="0" w:lastColumn="0" w:oddVBand="0" w:evenVBand="0" w:oddHBand="0" w:evenHBand="0" w:firstRowFirstColumn="0" w:firstRowLastColumn="0" w:lastRowFirstColumn="0" w:lastRowLastColumn="0"/>
               <w:rPr>
-                <w:sz w:val="28"/>
+                <w:rFonts w:cstheme="minorHAnsi"/>
+                <w:sz w:val="24"/>
+                <w:szCs w:val="24"/>
               </w:rPr>
             </w:pPr>
             <w:r>
               <w:rPr>
-                <w:sz w:val="28"/>
-              </w:rPr>
-              <w:t>Manuel Urbina</w:t>
+                <w:rFonts w:cstheme="minorHAnsi"/>
+                <w:sz w:val="24"/>
+                <w:szCs w:val="24"/>
+              </w:rPr>
+              <w:t>Mateo Flores</w:t>
             </w:r>
           </w:p>
         </w:tc>
@@ -1659,13 +2265,17 @@
             <w:pPr>
               <w:pStyle w:val="Sinespaciado"/>
               <w:rPr>
+                <w:rFonts w:cstheme="minorHAnsi"/>
                 <w:b w:val="0"/>
-                <w:sz w:val="28"/>
+                <w:sz w:val="24"/>
+                <w:szCs w:val="24"/>
               </w:rPr>
             </w:pPr>
             <w:r>
               <w:rPr>
-                <w:sz w:val="28"/>
+                <w:rFonts w:cstheme="minorHAnsi"/>
+                <w:sz w:val="24"/>
+                <w:szCs w:val="24"/>
               </w:rPr>
               <w:t>Duración</w:t>
             </w:r>
@@ -1680,14 +2290,18 @@
               <w:pStyle w:val="Sinespaciado"/>
               <w:cnfStyle w:val="000000100000" w:firstRow="0" w:lastRow="0" w:firstColumn="0" w:lastColumn="0" w:oddVBand="0" w:evenVBand="0" w:oddHBand="1" w:evenHBand="0" w:firstRowFirstColumn="0" w:firstRowLastColumn="0" w:lastRowFirstColumn="0" w:lastRowLastColumn="0"/>
               <w:rPr>
-                <w:sz w:val="28"/>
+                <w:rFonts w:cstheme="minorHAnsi"/>
+                <w:sz w:val="24"/>
+                <w:szCs w:val="24"/>
               </w:rPr>
             </w:pPr>
             <w:r>
               <w:rPr>
-                <w:sz w:val="28"/>
-              </w:rPr>
-              <w:t>3 Días</w:t>
+                <w:rFonts w:cstheme="minorHAnsi"/>
+                <w:sz w:val="24"/>
+                <w:szCs w:val="24"/>
+              </w:rPr>
+              <w:t>1 día</w:t>
             </w:r>
           </w:p>
         </w:tc>
@@ -1702,13 +2316,17 @@
             <w:pPr>
               <w:pStyle w:val="Sinespaciado"/>
               <w:rPr>
+                <w:rFonts w:cstheme="minorHAnsi"/>
                 <w:b w:val="0"/>
-                <w:sz w:val="28"/>
+                <w:sz w:val="24"/>
+                <w:szCs w:val="24"/>
               </w:rPr>
             </w:pPr>
             <w:r>
               <w:rPr>
-                <w:sz w:val="28"/>
+                <w:rFonts w:cstheme="minorHAnsi"/>
+                <w:sz w:val="24"/>
+                <w:szCs w:val="24"/>
               </w:rPr>
               <w:t>Participantes</w:t>
             </w:r>
@@ -1723,14 +2341,149 @@
               <w:pStyle w:val="Sinespaciado"/>
               <w:cnfStyle w:val="000000000000" w:firstRow="0" w:lastRow="0" w:firstColumn="0" w:lastColumn="0" w:oddVBand="0" w:evenVBand="0" w:oddHBand="0" w:evenHBand="0" w:firstRowFirstColumn="0" w:firstRowLastColumn="0" w:lastRowFirstColumn="0" w:lastRowLastColumn="0"/>
               <w:rPr>
-                <w:sz w:val="28"/>
+                <w:rFonts w:cstheme="minorHAnsi"/>
+                <w:sz w:val="24"/>
+                <w:szCs w:val="24"/>
               </w:rPr>
             </w:pPr>
             <w:r>
               <w:rPr>
-                <w:sz w:val="28"/>
-              </w:rPr>
-              <w:t>Administradores</w:t>
+                <w:rFonts w:cstheme="minorHAnsi"/>
+                <w:sz w:val="24"/>
+                <w:szCs w:val="24"/>
+              </w:rPr>
+              <w:t>Usuarios finales</w:t>
+            </w:r>
+          </w:p>
+        </w:tc>
+      </w:tr>
+      <w:tr>
+        <w:trPr>
+          <w:cnfStyle w:val="000000100000" w:firstRow="0" w:lastRow="0" w:firstColumn="0" w:lastColumn="0" w:oddVBand="0" w:evenVBand="0" w:oddHBand="1" w:evenHBand="0" w:firstRowFirstColumn="0" w:firstRowLastColumn="0" w:lastRowFirstColumn="0" w:lastRowLastColumn="0"/>
+          <w:trHeight w:val="80"/>
+        </w:trPr>
+        <w:tc>
+          <w:tcPr>
+            <w:cnfStyle w:val="001000000000" w:firstRow="0" w:lastRow="0" w:firstColumn="1" w:lastColumn="0" w:oddVBand="0" w:evenVBand="0" w:oddHBand="0" w:evenHBand="0" w:firstRowFirstColumn="0" w:firstRowLastColumn="0" w:lastRowFirstColumn="0" w:lastRowLastColumn="0"/>
+            <w:tcW w:w="2376" w:type="dxa"/>
+          </w:tcPr>
+          <w:p>
+            <w:pPr>
+              <w:pStyle w:val="Sinespaciado"/>
+              <w:rPr>
+                <w:rFonts w:cstheme="minorHAnsi"/>
+                <w:b w:val="0"/>
+                <w:sz w:val="24"/>
+                <w:szCs w:val="24"/>
+              </w:rPr>
+            </w:pPr>
+            <w:r>
+              <w:rPr>
+                <w:rFonts w:cstheme="minorHAnsi"/>
+                <w:sz w:val="24"/>
+                <w:szCs w:val="24"/>
+              </w:rPr>
+              <w:t>Lugar</w:t>
+            </w:r>
+          </w:p>
+        </w:tc>
+        <w:tc>
+          <w:tcPr>
+            <w:tcW w:w="7262" w:type="dxa"/>
+          </w:tcPr>
+          <w:p>
+            <w:pPr>
+              <w:pStyle w:val="Sinespaciado"/>
+              <w:cnfStyle w:val="000000100000" w:firstRow="0" w:lastRow="0" w:firstColumn="0" w:lastColumn="0" w:oddVBand="0" w:evenVBand="0" w:oddHBand="1" w:evenHBand="0" w:firstRowFirstColumn="0" w:firstRowLastColumn="0" w:lastRowFirstColumn="0" w:lastRowLastColumn="0"/>
+              <w:rPr>
+                <w:rFonts w:cstheme="minorHAnsi"/>
+                <w:sz w:val="24"/>
+                <w:szCs w:val="24"/>
+              </w:rPr>
+            </w:pPr>
+            <w:r>
+              <w:rPr>
+                <w:rFonts w:cstheme="minorHAnsi"/>
+                <w:sz w:val="24"/>
+                <w:szCs w:val="24"/>
+                <w:lang w:val="es-CL"/>
+              </w:rPr>
+              <w:t>Laboratorio de informática DUOC UC</w:t>
+            </w:r>
+          </w:p>
+        </w:tc>
+      </w:tr>
+    </w:tbl>
+    <w:p>
+      <w:pPr>
+        <w:pStyle w:val="Sinespaciado"/>
+        <w:rPr>
+          <w:rFonts w:cstheme="minorHAnsi"/>
+          <w:sz w:val="24"/>
+          <w:szCs w:val="24"/>
+        </w:rPr>
+      </w:pPr>
+    </w:p>
+    <w:tbl>
+      <w:tblPr>
+        <w:tblStyle w:val="Sombreadoclaro-nfasis5"/>
+        <w:tblW w:w="0" w:type="auto"/>
+        <w:tblLook w:val="04A0" w:firstRow="1" w:lastRow="0" w:firstColumn="1" w:lastColumn="0" w:noHBand="0" w:noVBand="1"/>
+      </w:tblPr>
+      <w:tblGrid>
+        <w:gridCol w:w="2376"/>
+        <w:gridCol w:w="7262"/>
+      </w:tblGrid>
+      <w:tr>
+        <w:trPr>
+          <w:cnfStyle w:val="100000000000" w:firstRow="1" w:lastRow="0" w:firstColumn="0" w:lastColumn="0" w:oddVBand="0" w:evenVBand="0" w:oddHBand="0" w:evenHBand="0" w:firstRowFirstColumn="0" w:firstRowLastColumn="0" w:lastRowFirstColumn="0" w:lastRowLastColumn="0"/>
+        </w:trPr>
+        <w:tc>
+          <w:tcPr>
+            <w:cnfStyle w:val="001000000000" w:firstRow="0" w:lastRow="0" w:firstColumn="1" w:lastColumn="0" w:oddVBand="0" w:evenVBand="0" w:oddHBand="0" w:evenHBand="0" w:firstRowFirstColumn="0" w:firstRowLastColumn="0" w:lastRowFirstColumn="0" w:lastRowLastColumn="0"/>
+            <w:tcW w:w="2376" w:type="dxa"/>
+          </w:tcPr>
+          <w:p>
+            <w:pPr>
+              <w:pStyle w:val="Sinespaciado"/>
+              <w:rPr>
+                <w:rFonts w:cstheme="minorHAnsi"/>
+                <w:b w:val="0"/>
+                <w:sz w:val="24"/>
+                <w:szCs w:val="24"/>
+              </w:rPr>
+            </w:pPr>
+            <w:r>
+              <w:rPr>
+                <w:rFonts w:cstheme="minorHAnsi"/>
+                <w:sz w:val="24"/>
+                <w:szCs w:val="24"/>
+              </w:rPr>
+              <w:t>Nro.</w:t>
+            </w:r>
+          </w:p>
+        </w:tc>
+        <w:tc>
+          <w:tcPr>
+            <w:tcW w:w="7262" w:type="dxa"/>
+          </w:tcPr>
+          <w:p>
+            <w:pPr>
+              <w:pStyle w:val="Sinespaciado"/>
+              <w:cnfStyle w:val="100000000000" w:firstRow="1" w:lastRow="0" w:firstColumn="0" w:lastColumn="0" w:oddVBand="0" w:evenVBand="0" w:oddHBand="0" w:evenHBand="0" w:firstRowFirstColumn="0" w:firstRowLastColumn="0" w:lastRowFirstColumn="0" w:lastRowLastColumn="0"/>
+              <w:rPr>
+                <w:rFonts w:cstheme="minorHAnsi"/>
+                <w:sz w:val="24"/>
+                <w:szCs w:val="24"/>
+              </w:rPr>
+            </w:pPr>
+            <w:r>
+              <w:rPr>
+                <w:rFonts w:cstheme="minorHAnsi"/>
+                <w:sz w:val="24"/>
+                <w:szCs w:val="24"/>
+              </w:rPr>
+              <w:t xml:space="preserve">2 </w:t>
             </w:r>
           </w:p>
         </w:tc>
@@ -1748,15 +2501,19 @@
             <w:pPr>
               <w:pStyle w:val="Sinespaciado"/>
               <w:rPr>
+                <w:rFonts w:cstheme="minorHAnsi"/>
                 <w:b w:val="0"/>
-                <w:sz w:val="28"/>
+                <w:sz w:val="24"/>
+                <w:szCs w:val="24"/>
               </w:rPr>
             </w:pPr>
             <w:r>
               <w:rPr>
-                <w:sz w:val="28"/>
-              </w:rPr>
-              <w:t>Lugar</w:t>
+                <w:rFonts w:cstheme="minorHAnsi"/>
+                <w:sz w:val="24"/>
+                <w:szCs w:val="24"/>
+              </w:rPr>
+              <w:t>Nombre Capacitación</w:t>
             </w:r>
           </w:p>
         </w:tc>
@@ -1769,69 +2526,775 @@
               <w:pStyle w:val="Sinespaciado"/>
               <w:cnfStyle w:val="000000100000" w:firstRow="0" w:lastRow="0" w:firstColumn="0" w:lastColumn="0" w:oddVBand="0" w:evenVBand="0" w:oddHBand="1" w:evenHBand="0" w:firstRowFirstColumn="0" w:firstRowLastColumn="0" w:lastRowFirstColumn="0" w:lastRowLastColumn="0"/>
               <w:rPr>
-                <w:sz w:val="28"/>
+                <w:rFonts w:cstheme="minorHAnsi"/>
+                <w:sz w:val="24"/>
+                <w:szCs w:val="24"/>
               </w:rPr>
             </w:pPr>
             <w:r>
               <w:rPr>
-                <w:sz w:val="28"/>
-              </w:rPr>
-              <w:t>Sala de Capacitaciones, Edificio Central Santiago Piso 10</w:t>
+                <w:rFonts w:cstheme="minorHAnsi"/>
+                <w:sz w:val="24"/>
+                <w:szCs w:val="24"/>
+              </w:rPr>
+              <w:t>Administración técnica del sistema</w:t>
+            </w:r>
+          </w:p>
+        </w:tc>
+      </w:tr>
+      <w:tr>
+        <w:tc>
+          <w:tcPr>
+            <w:cnfStyle w:val="001000000000" w:firstRow="0" w:lastRow="0" w:firstColumn="1" w:lastColumn="0" w:oddVBand="0" w:evenVBand="0" w:oddHBand="0" w:evenHBand="0" w:firstRowFirstColumn="0" w:firstRowLastColumn="0" w:lastRowFirstColumn="0" w:lastRowLastColumn="0"/>
+            <w:tcW w:w="2376" w:type="dxa"/>
+          </w:tcPr>
+          <w:p>
+            <w:pPr>
+              <w:pStyle w:val="Sinespaciado"/>
+              <w:rPr>
+                <w:rFonts w:cstheme="minorHAnsi"/>
+                <w:b w:val="0"/>
+                <w:sz w:val="24"/>
+                <w:szCs w:val="24"/>
+              </w:rPr>
+            </w:pPr>
+            <w:r>
+              <w:rPr>
+                <w:rFonts w:cstheme="minorHAnsi"/>
+                <w:sz w:val="24"/>
+                <w:szCs w:val="24"/>
+              </w:rPr>
+              <w:t>Descripción</w:t>
+            </w:r>
+          </w:p>
+        </w:tc>
+        <w:tc>
+          <w:tcPr>
+            <w:tcW w:w="7262" w:type="dxa"/>
+          </w:tcPr>
+          <w:tbl>
+            <w:tblPr>
+              <w:tblW w:w="0" w:type="auto"/>
+              <w:tblCellSpacing w:w="15" w:type="dxa"/>
+              <w:tblCellMar>
+                <w:top w:w="15" w:type="dxa"/>
+                <w:left w:w="15" w:type="dxa"/>
+                <w:bottom w:w="15" w:type="dxa"/>
+                <w:right w:w="15" w:type="dxa"/>
+              </w:tblCellMar>
+              <w:tblLook w:val="04A0" w:firstRow="1" w:lastRow="0" w:firstColumn="1" w:lastColumn="0" w:noHBand="0" w:noVBand="1"/>
+            </w:tblPr>
+            <w:tblGrid>
+              <w:gridCol w:w="96"/>
+            </w:tblGrid>
+            <w:tr>
+              <w:trPr>
+                <w:tblCellSpacing w:w="15" w:type="dxa"/>
+              </w:trPr>
+              <w:tc>
+                <w:tcPr>
+                  <w:tcW w:w="0" w:type="auto"/>
+                  <w:vAlign w:val="center"/>
+                  <w:hideMark/>
+                </w:tcPr>
+                <w:p>
+                  <w:pPr>
+                    <w:pStyle w:val="Sinespaciado"/>
+                    <w:rPr>
+                      <w:rFonts w:cstheme="minorHAnsi"/>
+                      <w:color w:val="31849B" w:themeColor="accent5" w:themeShade="BF"/>
+                      <w:sz w:val="24"/>
+                      <w:szCs w:val="24"/>
+                    </w:rPr>
+                  </w:pPr>
+                </w:p>
+              </w:tc>
+            </w:tr>
+          </w:tbl>
+          <w:p>
+            <w:pPr>
+              <w:pStyle w:val="Sinespaciado"/>
+              <w:cnfStyle w:val="000000000000" w:firstRow="0" w:lastRow="0" w:firstColumn="0" w:lastColumn="0" w:oddVBand="0" w:evenVBand="0" w:oddHBand="0" w:evenHBand="0" w:firstRowFirstColumn="0" w:firstRowLastColumn="0" w:lastRowFirstColumn="0" w:lastRowLastColumn="0"/>
+              <w:rPr>
+                <w:rFonts w:cstheme="minorHAnsi"/>
+                <w:vanish/>
+                <w:sz w:val="24"/>
+                <w:szCs w:val="24"/>
+              </w:rPr>
+            </w:pPr>
+          </w:p>
+          <w:tbl>
+            <w:tblPr>
+              <w:tblW w:w="0" w:type="auto"/>
+              <w:tblCellSpacing w:w="15" w:type="dxa"/>
+              <w:tblCellMar>
+                <w:top w:w="15" w:type="dxa"/>
+                <w:left w:w="15" w:type="dxa"/>
+                <w:bottom w:w="15" w:type="dxa"/>
+                <w:right w:w="15" w:type="dxa"/>
+              </w:tblCellMar>
+              <w:tblLook w:val="04A0" w:firstRow="1" w:lastRow="0" w:firstColumn="1" w:lastColumn="0" w:noHBand="0" w:noVBand="1"/>
+            </w:tblPr>
+            <w:tblGrid>
+              <w:gridCol w:w="7046"/>
+            </w:tblGrid>
+            <w:tr>
+              <w:trPr>
+                <w:tblCellSpacing w:w="15" w:type="dxa"/>
+              </w:trPr>
+              <w:tc>
+                <w:tcPr>
+                  <w:tcW w:w="0" w:type="auto"/>
+                  <w:vAlign w:val="center"/>
+                  <w:hideMark/>
+                </w:tcPr>
+                <w:p>
+                  <w:pPr>
+                    <w:pStyle w:val="Sinespaciado"/>
+                    <w:rPr>
+                      <w:rFonts w:cstheme="minorHAnsi"/>
+                      <w:color w:val="31849B" w:themeColor="accent5" w:themeShade="BF"/>
+                      <w:sz w:val="24"/>
+                      <w:szCs w:val="24"/>
+                    </w:rPr>
+                  </w:pPr>
+                  <w:r>
+                    <w:rPr>
+                      <w:rFonts w:cstheme="minorHAnsi"/>
+                      <w:color w:val="31849B" w:themeColor="accent5" w:themeShade="BF"/>
+                      <w:sz w:val="24"/>
+                      <w:szCs w:val="24"/>
+                    </w:rPr>
+                    <w:t>Entrenamiento para administradores sobre la infraestructura técnica de Mi Refugio: backend, base de datos y monitoreo.</w:t>
+                  </w:r>
+                </w:p>
+              </w:tc>
+            </w:tr>
+          </w:tbl>
+          <w:p>
+            <w:pPr>
+              <w:pStyle w:val="Sinespaciado"/>
+              <w:cnfStyle w:val="000000000000" w:firstRow="0" w:lastRow="0" w:firstColumn="0" w:lastColumn="0" w:oddVBand="0" w:evenVBand="0" w:oddHBand="0" w:evenHBand="0" w:firstRowFirstColumn="0" w:firstRowLastColumn="0" w:lastRowFirstColumn="0" w:lastRowLastColumn="0"/>
+              <w:rPr>
+                <w:rFonts w:cstheme="minorHAnsi"/>
+                <w:sz w:val="24"/>
+                <w:szCs w:val="24"/>
+              </w:rPr>
+            </w:pPr>
+          </w:p>
+        </w:tc>
+      </w:tr>
+      <w:tr>
+        <w:trPr>
+          <w:cnfStyle w:val="000000100000" w:firstRow="0" w:lastRow="0" w:firstColumn="0" w:lastColumn="0" w:oddVBand="0" w:evenVBand="0" w:oddHBand="1" w:evenHBand="0" w:firstRowFirstColumn="0" w:firstRowLastColumn="0" w:lastRowFirstColumn="0" w:lastRowLastColumn="0"/>
+        </w:trPr>
+        <w:tc>
+          <w:tcPr>
+            <w:cnfStyle w:val="001000000000" w:firstRow="0" w:lastRow="0" w:firstColumn="1" w:lastColumn="0" w:oddVBand="0" w:evenVBand="0" w:oddHBand="0" w:evenHBand="0" w:firstRowFirstColumn="0" w:firstRowLastColumn="0" w:lastRowFirstColumn="0" w:lastRowLastColumn="0"/>
+            <w:tcW w:w="2376" w:type="dxa"/>
+          </w:tcPr>
+          <w:p>
+            <w:pPr>
+              <w:pStyle w:val="Sinespaciado"/>
+              <w:rPr>
+                <w:rFonts w:cstheme="minorHAnsi"/>
+                <w:b w:val="0"/>
+                <w:sz w:val="24"/>
+                <w:szCs w:val="24"/>
+              </w:rPr>
+            </w:pPr>
+            <w:r>
+              <w:rPr>
+                <w:rFonts w:cstheme="minorHAnsi"/>
+                <w:sz w:val="24"/>
+                <w:szCs w:val="24"/>
+              </w:rPr>
+              <w:t>Contenido</w:t>
+            </w:r>
+          </w:p>
+        </w:tc>
+        <w:tc>
+          <w:tcPr>
+            <w:tcW w:w="7262" w:type="dxa"/>
+          </w:tcPr>
+          <w:p>
+            <w:pPr>
+              <w:pStyle w:val="Sinespaciado"/>
+              <w:numPr>
+                <w:ilvl w:val="0"/>
+                <w:numId w:val="1"/>
+              </w:numPr>
+              <w:cnfStyle w:val="000000100000" w:firstRow="0" w:lastRow="0" w:firstColumn="0" w:lastColumn="0" w:oddVBand="0" w:evenVBand="0" w:oddHBand="1" w:evenHBand="0" w:firstRowFirstColumn="0" w:firstRowLastColumn="0" w:lastRowFirstColumn="0" w:lastRowLastColumn="0"/>
+              <w:rPr>
+                <w:rFonts w:cstheme="minorHAnsi"/>
+                <w:vanish/>
+                <w:sz w:val="24"/>
+                <w:szCs w:val="24"/>
+                <w:lang w:val="es-CL"/>
+              </w:rPr>
+            </w:pPr>
+          </w:p>
+          <w:tbl>
+            <w:tblPr>
+              <w:tblW w:w="0" w:type="auto"/>
+              <w:tblCellSpacing w:w="15" w:type="dxa"/>
+              <w:tblCellMar>
+                <w:top w:w="15" w:type="dxa"/>
+                <w:left w:w="15" w:type="dxa"/>
+                <w:bottom w:w="15" w:type="dxa"/>
+                <w:right w:w="15" w:type="dxa"/>
+              </w:tblCellMar>
+              <w:tblLook w:val="04A0" w:firstRow="1" w:lastRow="0" w:firstColumn="1" w:lastColumn="0" w:noHBand="0" w:noVBand="1"/>
+            </w:tblPr>
+            <w:tblGrid>
+              <w:gridCol w:w="3743"/>
+            </w:tblGrid>
+            <w:tr>
+              <w:trPr>
+                <w:tblCellSpacing w:w="15" w:type="dxa"/>
+              </w:trPr>
+              <w:tc>
+                <w:tcPr>
+                  <w:tcW w:w="0" w:type="auto"/>
+                  <w:vAlign w:val="center"/>
+                  <w:hideMark/>
+                </w:tcPr>
+                <w:p>
+                  <w:pPr>
+                    <w:pStyle w:val="Sinespaciado"/>
+                    <w:ind w:left="360"/>
+                    <w:rPr>
+                      <w:rFonts w:cstheme="minorHAnsi"/>
+                      <w:color w:val="31849B" w:themeColor="accent5" w:themeShade="BF"/>
+                      <w:sz w:val="24"/>
+                      <w:szCs w:val="24"/>
+                      <w:lang w:val="es-CL"/>
+                    </w:rPr>
+                  </w:pPr>
+                  <w:r>
+                    <w:rPr>
+                      <w:rFonts w:cstheme="minorHAnsi"/>
+                      <w:color w:val="31849B" w:themeColor="accent5" w:themeShade="BF"/>
+                      <w:sz w:val="24"/>
+                      <w:szCs w:val="24"/>
+                      <w:lang w:val="es-CL"/>
+                    </w:rPr>
+                    <w:t xml:space="preserve">- Revisión de </w:t>
+                  </w:r>
+                  <w:proofErr w:type="spellStart"/>
+                  <w:r>
+                    <w:rPr>
+                      <w:rFonts w:cstheme="minorHAnsi"/>
+                      <w:color w:val="31849B" w:themeColor="accent5" w:themeShade="BF"/>
+                      <w:sz w:val="24"/>
+                      <w:szCs w:val="24"/>
+                      <w:lang w:val="es-CL"/>
+                    </w:rPr>
+                    <w:t>endpoints</w:t>
+                  </w:r>
+                  <w:proofErr w:type="spellEnd"/>
+                  <w:r>
+                    <w:rPr>
+                      <w:rFonts w:cstheme="minorHAnsi"/>
+                      <w:color w:val="31849B" w:themeColor="accent5" w:themeShade="BF"/>
+                      <w:sz w:val="24"/>
+                      <w:szCs w:val="24"/>
+                      <w:lang w:val="es-CL"/>
+                    </w:rPr>
+                    <w:br/>
+                    <w:t>- Logs del backend</w:t>
+                  </w:r>
+                  <w:r>
+                    <w:rPr>
+                      <w:rFonts w:cstheme="minorHAnsi"/>
+                      <w:color w:val="31849B" w:themeColor="accent5" w:themeShade="BF"/>
+                      <w:sz w:val="24"/>
+                      <w:szCs w:val="24"/>
+                      <w:lang w:val="es-CL"/>
+                    </w:rPr>
+                    <w:br/>
+                    <w:t>- Monitoreo de la BD en AWS RDS</w:t>
+                  </w:r>
+                  <w:r>
+                    <w:rPr>
+                      <w:rFonts w:cstheme="minorHAnsi"/>
+                      <w:color w:val="31849B" w:themeColor="accent5" w:themeShade="BF"/>
+                      <w:sz w:val="24"/>
+                      <w:szCs w:val="24"/>
+                      <w:lang w:val="es-CL"/>
+                    </w:rPr>
+                    <w:br/>
+                    <w:t>- Estructura de tablas</w:t>
+                  </w:r>
+                  <w:r>
+                    <w:rPr>
+                      <w:rFonts w:cstheme="minorHAnsi"/>
+                      <w:color w:val="31849B" w:themeColor="accent5" w:themeShade="BF"/>
+                      <w:sz w:val="24"/>
+                      <w:szCs w:val="24"/>
+                      <w:lang w:val="es-CL"/>
+                    </w:rPr>
+                    <w:br/>
+                    <w:t>- Control de datos</w:t>
+                  </w:r>
+                  <w:r>
+                    <w:rPr>
+                      <w:rFonts w:cstheme="minorHAnsi"/>
+                      <w:color w:val="31849B" w:themeColor="accent5" w:themeShade="BF"/>
+                      <w:sz w:val="24"/>
+                      <w:szCs w:val="24"/>
+                      <w:lang w:val="es-CL"/>
+                    </w:rPr>
+                    <w:br/>
+                    <w:t>- Seguridad y buenas prácticas</w:t>
+                  </w:r>
+                </w:p>
+              </w:tc>
+            </w:tr>
+          </w:tbl>
+          <w:p>
+            <w:pPr>
+              <w:pStyle w:val="Sinespaciado"/>
+              <w:ind w:left="720"/>
+              <w:cnfStyle w:val="000000100000" w:firstRow="0" w:lastRow="0" w:firstColumn="0" w:lastColumn="0" w:oddVBand="0" w:evenVBand="0" w:oddHBand="1" w:evenHBand="0" w:firstRowFirstColumn="0" w:firstRowLastColumn="0" w:lastRowFirstColumn="0" w:lastRowLastColumn="0"/>
+              <w:rPr>
+                <w:rFonts w:cstheme="minorHAnsi"/>
+                <w:sz w:val="24"/>
+                <w:szCs w:val="24"/>
+              </w:rPr>
+            </w:pPr>
+          </w:p>
+        </w:tc>
+      </w:tr>
+      <w:tr>
+        <w:tc>
+          <w:tcPr>
+            <w:cnfStyle w:val="001000000000" w:firstRow="0" w:lastRow="0" w:firstColumn="1" w:lastColumn="0" w:oddVBand="0" w:evenVBand="0" w:oddHBand="0" w:evenHBand="0" w:firstRowFirstColumn="0" w:firstRowLastColumn="0" w:lastRowFirstColumn="0" w:lastRowLastColumn="0"/>
+            <w:tcW w:w="2376" w:type="dxa"/>
+          </w:tcPr>
+          <w:p>
+            <w:pPr>
+              <w:pStyle w:val="Sinespaciado"/>
+              <w:rPr>
+                <w:rFonts w:cstheme="minorHAnsi"/>
+                <w:b w:val="0"/>
+                <w:sz w:val="24"/>
+                <w:szCs w:val="24"/>
+              </w:rPr>
+            </w:pPr>
+            <w:r>
+              <w:rPr>
+                <w:rFonts w:cstheme="minorHAnsi"/>
+                <w:sz w:val="24"/>
+                <w:szCs w:val="24"/>
+              </w:rPr>
+              <w:t>Relator</w:t>
+            </w:r>
+          </w:p>
+        </w:tc>
+        <w:tc>
+          <w:tcPr>
+            <w:tcW w:w="7262" w:type="dxa"/>
+          </w:tcPr>
+          <w:p>
+            <w:pPr>
+              <w:pStyle w:val="Sinespaciado"/>
+              <w:cnfStyle w:val="000000000000" w:firstRow="0" w:lastRow="0" w:firstColumn="0" w:lastColumn="0" w:oddVBand="0" w:evenVBand="0" w:oddHBand="0" w:evenHBand="0" w:firstRowFirstColumn="0" w:firstRowLastColumn="0" w:lastRowFirstColumn="0" w:lastRowLastColumn="0"/>
+              <w:rPr>
+                <w:rFonts w:cstheme="minorHAnsi"/>
+                <w:sz w:val="24"/>
+                <w:szCs w:val="24"/>
+              </w:rPr>
+            </w:pPr>
+            <w:r>
+              <w:rPr>
+                <w:rFonts w:cstheme="minorHAnsi"/>
+                <w:sz w:val="24"/>
+                <w:szCs w:val="24"/>
+              </w:rPr>
+              <w:t>Mateo Flores y Pierre Salas</w:t>
+            </w:r>
+          </w:p>
+        </w:tc>
+      </w:tr>
+      <w:tr>
+        <w:trPr>
+          <w:cnfStyle w:val="000000100000" w:firstRow="0" w:lastRow="0" w:firstColumn="0" w:lastColumn="0" w:oddVBand="0" w:evenVBand="0" w:oddHBand="1" w:evenHBand="0" w:firstRowFirstColumn="0" w:firstRowLastColumn="0" w:lastRowFirstColumn="0" w:lastRowLastColumn="0"/>
+        </w:trPr>
+        <w:tc>
+          <w:tcPr>
+            <w:cnfStyle w:val="001000000000" w:firstRow="0" w:lastRow="0" w:firstColumn="1" w:lastColumn="0" w:oddVBand="0" w:evenVBand="0" w:oddHBand="0" w:evenHBand="0" w:firstRowFirstColumn="0" w:firstRowLastColumn="0" w:lastRowFirstColumn="0" w:lastRowLastColumn="0"/>
+            <w:tcW w:w="2376" w:type="dxa"/>
+          </w:tcPr>
+          <w:p>
+            <w:pPr>
+              <w:pStyle w:val="Sinespaciado"/>
+              <w:rPr>
+                <w:rFonts w:cstheme="minorHAnsi"/>
+                <w:b w:val="0"/>
+                <w:sz w:val="24"/>
+                <w:szCs w:val="24"/>
+              </w:rPr>
+            </w:pPr>
+            <w:r>
+              <w:rPr>
+                <w:rFonts w:cstheme="minorHAnsi"/>
+                <w:sz w:val="24"/>
+                <w:szCs w:val="24"/>
+              </w:rPr>
+              <w:t>Duración</w:t>
+            </w:r>
+          </w:p>
+        </w:tc>
+        <w:tc>
+          <w:tcPr>
+            <w:tcW w:w="7262" w:type="dxa"/>
+          </w:tcPr>
+          <w:p>
+            <w:pPr>
+              <w:pStyle w:val="Sinespaciado"/>
+              <w:cnfStyle w:val="000000100000" w:firstRow="0" w:lastRow="0" w:firstColumn="0" w:lastColumn="0" w:oddVBand="0" w:evenVBand="0" w:oddHBand="1" w:evenHBand="0" w:firstRowFirstColumn="0" w:firstRowLastColumn="0" w:lastRowFirstColumn="0" w:lastRowLastColumn="0"/>
+              <w:rPr>
+                <w:rFonts w:cstheme="minorHAnsi"/>
+                <w:sz w:val="24"/>
+                <w:szCs w:val="24"/>
+              </w:rPr>
+            </w:pPr>
+            <w:r>
+              <w:rPr>
+                <w:rFonts w:cstheme="minorHAnsi"/>
+                <w:sz w:val="24"/>
+                <w:szCs w:val="24"/>
+              </w:rPr>
+              <w:t>2 días</w:t>
+            </w:r>
+          </w:p>
+        </w:tc>
+      </w:tr>
+      <w:tr>
+        <w:tc>
+          <w:tcPr>
+            <w:cnfStyle w:val="001000000000" w:firstRow="0" w:lastRow="0" w:firstColumn="1" w:lastColumn="0" w:oddVBand="0" w:evenVBand="0" w:oddHBand="0" w:evenHBand="0" w:firstRowFirstColumn="0" w:firstRowLastColumn="0" w:lastRowFirstColumn="0" w:lastRowLastColumn="0"/>
+            <w:tcW w:w="2376" w:type="dxa"/>
+          </w:tcPr>
+          <w:p>
+            <w:pPr>
+              <w:pStyle w:val="Sinespaciado"/>
+              <w:rPr>
+                <w:rFonts w:cstheme="minorHAnsi"/>
+                <w:b w:val="0"/>
+                <w:sz w:val="24"/>
+                <w:szCs w:val="24"/>
+              </w:rPr>
+            </w:pPr>
+            <w:r>
+              <w:rPr>
+                <w:rFonts w:cstheme="minorHAnsi"/>
+                <w:sz w:val="24"/>
+                <w:szCs w:val="24"/>
+              </w:rPr>
+              <w:t>Participantes</w:t>
+            </w:r>
+          </w:p>
+        </w:tc>
+        <w:tc>
+          <w:tcPr>
+            <w:tcW w:w="7262" w:type="dxa"/>
+          </w:tcPr>
+          <w:p>
+            <w:pPr>
+              <w:pStyle w:val="Sinespaciado"/>
+              <w:cnfStyle w:val="000000000000" w:firstRow="0" w:lastRow="0" w:firstColumn="0" w:lastColumn="0" w:oddVBand="0" w:evenVBand="0" w:oddHBand="0" w:evenHBand="0" w:firstRowFirstColumn="0" w:firstRowLastColumn="0" w:lastRowFirstColumn="0" w:lastRowLastColumn="0"/>
+              <w:rPr>
+                <w:rFonts w:cstheme="minorHAnsi"/>
+                <w:sz w:val="24"/>
+                <w:szCs w:val="24"/>
+              </w:rPr>
+            </w:pPr>
+            <w:r>
+              <w:rPr>
+                <w:rFonts w:cstheme="minorHAnsi"/>
+                <w:sz w:val="24"/>
+                <w:szCs w:val="24"/>
+              </w:rPr>
+              <w:t>Administradores del sistema</w:t>
+            </w:r>
+          </w:p>
+        </w:tc>
+      </w:tr>
+      <w:tr>
+        <w:trPr>
+          <w:cnfStyle w:val="000000100000" w:firstRow="0" w:lastRow="0" w:firstColumn="0" w:lastColumn="0" w:oddVBand="0" w:evenVBand="0" w:oddHBand="1" w:evenHBand="0" w:firstRowFirstColumn="0" w:firstRowLastColumn="0" w:lastRowFirstColumn="0" w:lastRowLastColumn="0"/>
+          <w:trHeight w:val="80"/>
+        </w:trPr>
+        <w:tc>
+          <w:tcPr>
+            <w:cnfStyle w:val="001000000000" w:firstRow="0" w:lastRow="0" w:firstColumn="1" w:lastColumn="0" w:oddVBand="0" w:evenVBand="0" w:oddHBand="0" w:evenHBand="0" w:firstRowFirstColumn="0" w:firstRowLastColumn="0" w:lastRowFirstColumn="0" w:lastRowLastColumn="0"/>
+            <w:tcW w:w="2376" w:type="dxa"/>
+          </w:tcPr>
+          <w:p>
+            <w:pPr>
+              <w:pStyle w:val="Sinespaciado"/>
+              <w:rPr>
+                <w:rFonts w:cstheme="minorHAnsi"/>
+                <w:b w:val="0"/>
+                <w:sz w:val="24"/>
+                <w:szCs w:val="24"/>
+              </w:rPr>
+            </w:pPr>
+            <w:r>
+              <w:rPr>
+                <w:rFonts w:cstheme="minorHAnsi"/>
+                <w:sz w:val="24"/>
+                <w:szCs w:val="24"/>
+              </w:rPr>
+              <w:t>Lugar</w:t>
+            </w:r>
+          </w:p>
+        </w:tc>
+        <w:tc>
+          <w:tcPr>
+            <w:tcW w:w="7262" w:type="dxa"/>
+          </w:tcPr>
+          <w:p>
+            <w:pPr>
+              <w:pStyle w:val="Sinespaciado"/>
+              <w:cnfStyle w:val="000000100000" w:firstRow="0" w:lastRow="0" w:firstColumn="0" w:lastColumn="0" w:oddVBand="0" w:evenVBand="0" w:oddHBand="1" w:evenHBand="0" w:firstRowFirstColumn="0" w:firstRowLastColumn="0" w:lastRowFirstColumn="0" w:lastRowLastColumn="0"/>
+              <w:rPr>
+                <w:rFonts w:cstheme="minorHAnsi"/>
+                <w:sz w:val="24"/>
+                <w:szCs w:val="24"/>
+              </w:rPr>
+            </w:pPr>
+            <w:r>
+              <w:rPr>
+                <w:rFonts w:cstheme="minorHAnsi"/>
+                <w:sz w:val="24"/>
+                <w:szCs w:val="24"/>
+                <w:lang w:val="es-CL"/>
+              </w:rPr>
+              <w:t>Laboratorio de informática DUOC UC</w:t>
             </w:r>
           </w:p>
         </w:tc>
       </w:tr>
     </w:tbl>
-    <w:p>
-      <w:pPr>
-        <w:pStyle w:val="Sinespaciado"/>
-      </w:pPr>
-    </w:p>
     <w:p/>
+    <w:p/>
+    <w:p/>
+    <w:p/>
+    <w:p/>
     <w:p>
       <w:pPr>
         <w:pStyle w:val="Ttulo1"/>
         <w:rPr>
-          <w:rFonts w:eastAsia="Times New Roman"/>
+          <w:rFonts w:asciiTheme="minorHAnsi" w:eastAsia="Times New Roman" w:hAnsiTheme="minorHAnsi" w:cstheme="minorHAnsi"/>
           <w:color w:val="31849B" w:themeColor="accent5" w:themeShade="BF"/>
         </w:rPr>
       </w:pPr>
-      <w:bookmarkStart w:id="5" w:name="_Toc497857973"/>
+      <w:bookmarkStart w:id="5" w:name="_Toc215589585"/>
       <w:r>
         <w:rPr>
-          <w:rFonts w:eastAsia="Times New Roman"/>
+          <w:rFonts w:asciiTheme="minorHAnsi" w:eastAsia="Times New Roman" w:hAnsiTheme="minorHAnsi" w:cstheme="minorHAnsi"/>
           <w:color w:val="31849B" w:themeColor="accent5" w:themeShade="BF"/>
         </w:rPr>
-        <w:t>Exámenes de Aprendizaje</w:t>
+        <w:lastRenderedPageBreak/>
+        <w:t>Exámenes de aprendizaje</w:t>
       </w:r>
       <w:bookmarkEnd w:id="5"/>
     </w:p>
     <w:p>
       <w:pPr>
-        <w:jc w:val="both"/>
-        <w:rPr>
-          <w:i/>
-          <w:color w:val="0070C0"/>
-          <w:sz w:val="28"/>
+        <w:rPr>
+          <w:sz w:val="24"/>
+          <w:szCs w:val="24"/>
         </w:rPr>
       </w:pPr>
       <w:r>
         <w:rPr>
-          <w:i/>
-          <w:color w:val="0070C0"/>
-          <w:sz w:val="28"/>
-        </w:rPr>
-        <w:t>Al término de cada módulo de capacitación como se evaluará el aprendizaje de los participantes.</w:t>
+          <w:sz w:val="24"/>
+          <w:szCs w:val="24"/>
+        </w:rPr>
+        <w:t>Para validar el aprendizaje de los participantes se aplicarán los siguientes métodos:</w:t>
       </w:r>
     </w:p>
+    <w:p>
+      <w:pPr>
+        <w:rPr>
+          <w:b/>
+          <w:bCs/>
+          <w:sz w:val="24"/>
+          <w:szCs w:val="24"/>
+        </w:rPr>
+      </w:pPr>
+      <w:r>
+        <w:rPr>
+          <w:b/>
+          <w:bCs/>
+          <w:sz w:val="24"/>
+          <w:szCs w:val="24"/>
+        </w:rPr>
+        <w:t>Usuarios finales</w:t>
+      </w:r>
+    </w:p>
+    <w:p>
+      <w:pPr>
+        <w:numPr>
+          <w:ilvl w:val="0"/>
+          <w:numId w:val="7"/>
+        </w:numPr>
+        <w:rPr>
+          <w:sz w:val="24"/>
+          <w:szCs w:val="24"/>
+        </w:rPr>
+      </w:pPr>
+      <w:r>
+        <w:rPr>
+          <w:sz w:val="24"/>
+          <w:szCs w:val="24"/>
+        </w:rPr>
+        <w:t>Evaluación práctica: registrar una emoción, revisar historial y enviar sugerencia.</w:t>
+      </w:r>
+    </w:p>
+    <w:p>
+      <w:pPr>
+        <w:numPr>
+          <w:ilvl w:val="0"/>
+          <w:numId w:val="7"/>
+        </w:numPr>
+        <w:rPr>
+          <w:sz w:val="24"/>
+          <w:szCs w:val="24"/>
+        </w:rPr>
+      </w:pPr>
+      <w:r>
+        <w:rPr>
+          <w:sz w:val="24"/>
+          <w:szCs w:val="24"/>
+        </w:rPr>
+        <w:t>Cuestionario corto (5 preguntas).</w:t>
+      </w:r>
+    </w:p>
+    <w:p>
+      <w:pPr>
+        <w:rPr>
+          <w:b/>
+          <w:bCs/>
+          <w:sz w:val="24"/>
+          <w:szCs w:val="24"/>
+        </w:rPr>
+      </w:pPr>
+      <w:r>
+        <w:rPr>
+          <w:b/>
+          <w:bCs/>
+          <w:sz w:val="24"/>
+          <w:szCs w:val="24"/>
+        </w:rPr>
+        <w:t>Administradores</w:t>
+      </w:r>
+    </w:p>
+    <w:p>
+      <w:pPr>
+        <w:numPr>
+          <w:ilvl w:val="0"/>
+          <w:numId w:val="8"/>
+        </w:numPr>
+        <w:rPr>
+          <w:sz w:val="24"/>
+          <w:szCs w:val="24"/>
+        </w:rPr>
+      </w:pPr>
+      <w:r>
+        <w:rPr>
+          <w:sz w:val="24"/>
+          <w:szCs w:val="24"/>
+        </w:rPr>
+        <w:t>Resolución de casos simulados (errores de conexión, duplicidad de datos, etc.).</w:t>
+      </w:r>
+    </w:p>
+    <w:p>
+      <w:pPr>
+        <w:numPr>
+          <w:ilvl w:val="0"/>
+          <w:numId w:val="8"/>
+        </w:numPr>
+        <w:rPr>
+          <w:sz w:val="24"/>
+          <w:szCs w:val="24"/>
+        </w:rPr>
+      </w:pPr>
+      <w:r>
+        <w:rPr>
+          <w:sz w:val="24"/>
+          <w:szCs w:val="24"/>
+        </w:rPr>
+        <w:t>Validación de manejo de la base de datos y revisión de logs.</w:t>
+      </w:r>
+    </w:p>
+    <w:p>
+      <w:pPr>
+        <w:rPr>
+          <w:b/>
+          <w:bCs/>
+          <w:sz w:val="24"/>
+          <w:szCs w:val="24"/>
+        </w:rPr>
+      </w:pPr>
+      <w:r>
+        <w:rPr>
+          <w:b/>
+          <w:bCs/>
+          <w:sz w:val="24"/>
+          <w:szCs w:val="24"/>
+        </w:rPr>
+        <w:t>Criterios de aprobación</w:t>
+      </w:r>
+    </w:p>
+    <w:p>
+      <w:pPr>
+        <w:numPr>
+          <w:ilvl w:val="0"/>
+          <w:numId w:val="9"/>
+        </w:numPr>
+        <w:rPr>
+          <w:sz w:val="24"/>
+          <w:szCs w:val="24"/>
+        </w:rPr>
+      </w:pPr>
+      <w:r>
+        <w:rPr>
+          <w:sz w:val="24"/>
+          <w:szCs w:val="24"/>
+        </w:rPr>
+        <w:t>80% de logro en actividades prácticas.</w:t>
+      </w:r>
+    </w:p>
+    <w:p>
+      <w:pPr>
+        <w:numPr>
+          <w:ilvl w:val="0"/>
+          <w:numId w:val="9"/>
+        </w:numPr>
+        <w:rPr>
+          <w:sz w:val="24"/>
+          <w:szCs w:val="24"/>
+        </w:rPr>
+      </w:pPr>
+      <w:r>
+        <w:rPr>
+          <w:sz w:val="24"/>
+          <w:szCs w:val="24"/>
+        </w:rPr>
+        <w:t>Resolución correcta de al menos 2 de 3 escenarios planteados.</w:t>
+      </w:r>
+    </w:p>
+    <w:p/>
+    <w:p/>
     <w:p/>
     <w:sectPr>
-      <w:headerReference w:type="even" r:id="rId7"/>
-      <w:headerReference w:type="default" r:id="rId8"/>
-      <w:footerReference w:type="even" r:id="rId9"/>
-      <w:footerReference w:type="default" r:id="rId10"/>
-      <w:headerReference w:type="first" r:id="rId11"/>
-      <w:footerReference w:type="first" r:id="rId12"/>
+      <w:headerReference w:type="default" r:id="rId7"/>
+      <w:footerReference w:type="default" r:id="rId8"/>
       <w:pgSz w:w="12240" w:h="15840"/>
       <w:pgMar w:top="1418" w:right="1041" w:bottom="1418" w:left="1701" w:header="709" w:footer="709" w:gutter="0"/>
       <w:cols w:space="708"/>
@@ -1842,7 +3305,7 @@
 </file>
 
 <file path=word/endnotes.xml><?xml version="1.0" encoding="utf-8"?>
-<w:endnotes xmlns:wpc="http://schemas.microsoft.com/office/word/2010/wordprocessingCanvas" xmlns:cx="http://schemas.microsoft.com/office/drawing/2014/chartex" xmlns:cx1="http://schemas.microsoft.com/office/drawing/2015/9/8/chartex" xmlns:cx2="http://schemas.microsoft.com/office/drawing/2015/10/21/chartex" xmlns:cx3="http://schemas.microsoft.com/office/drawing/2016/5/9/chartex" xmlns:cx4="http://schemas.microsoft.com/office/drawing/2016/5/10/chartex" xmlns:cx5="http://schemas.microsoft.com/office/drawing/2016/5/11/chartex" xmlns:cx6="http://schemas.microsoft.com/office/drawing/2016/5/12/chartex" xmlns:cx7="http://schemas.microsoft.com/office/drawing/2016/5/13/chartex" xmlns:cx8="http://schemas.microsoft.com/office/drawing/2016/5/14/chartex" xmlns:mc="http://schemas.openxmlformats.org/markup-compatibility/2006" xmlns:aink="http://schemas.microsoft.com/office/drawing/2016/ink" xmlns:am3d="http://schemas.microsoft.com/office/drawing/2017/model3d" xmlns:o="urn:schemas-microsoft-com:office:office" xmlns:oel="http://schemas.microsoft.com/office/2019/extlst" xmlns:r="http://schemas.openxmlformats.org/officeDocument/2006/relationships" xmlns:m="http://schemas.openxmlformats.org/officeDocument/2006/math" xmlns:v="urn:schemas-microsoft-com:vml" xmlns:wp14="http://schemas.microsoft.com/office/word/2010/wordprocessingDrawing" xmlns:wp="http://schemas.openxmlformats.org/drawingml/2006/wordprocessingDrawing" xmlns:w10="urn:schemas-microsoft-com:office:word" xmlns:w="http://schemas.openxmlformats.org/wordprocessingml/2006/main" xmlns:w14="http://schemas.microsoft.com/office/word/2010/wordml" xmlns:w15="http://schemas.microsoft.com/office/word/2012/wordml" xmlns:w16cex="http://schemas.microsoft.com/office/word/2018/wordml/cex" xmlns:w16cid="http://schemas.microsoft.com/office/word/2016/wordml/cid" xmlns:w16="http://schemas.microsoft.com/office/word/2018/wordml" xmlns:w16du="http://schemas.microsoft.com/office/word/2023/wordml/word16du" xmlns:w16sdtdh="http://schemas.microsoft.com/office/word/2020/wordml/sdtdatahash" xmlns:w16se="http://schemas.microsoft.com/office/word/2015/wordml/symex" xmlns:wpg="http://schemas.microsoft.com/office/word/2010/wordprocessingGroup" xmlns:wpi="http://schemas.microsoft.com/office/word/2010/wordprocessingInk" xmlns:wne="http://schemas.microsoft.com/office/word/2006/wordml" xmlns:wps="http://schemas.microsoft.com/office/word/2010/wordprocessingShape" mc:Ignorable="w14 w15 w16se w16cid w16 w16cex w16sdtdh w16du wp14">
+<w:endnotes xmlns:wpc="http://schemas.microsoft.com/office/word/2010/wordprocessingCanvas" xmlns:cx="http://schemas.microsoft.com/office/drawing/2014/chartex" xmlns:cx1="http://schemas.microsoft.com/office/drawing/2015/9/8/chartex" xmlns:cx2="http://schemas.microsoft.com/office/drawing/2015/10/21/chartex" xmlns:cx3="http://schemas.microsoft.com/office/drawing/2016/5/9/chartex" xmlns:cx4="http://schemas.microsoft.com/office/drawing/2016/5/10/chartex" xmlns:cx5="http://schemas.microsoft.com/office/drawing/2016/5/11/chartex" xmlns:cx6="http://schemas.microsoft.com/office/drawing/2016/5/12/chartex" xmlns:cx7="http://schemas.microsoft.com/office/drawing/2016/5/13/chartex" xmlns:cx8="http://schemas.microsoft.com/office/drawing/2016/5/14/chartex" xmlns:mc="http://schemas.openxmlformats.org/markup-compatibility/2006" xmlns:aink="http://schemas.microsoft.com/office/drawing/2016/ink" xmlns:am3d="http://schemas.microsoft.com/office/drawing/2017/model3d" xmlns:o="urn:schemas-microsoft-com:office:office" xmlns:oel="http://schemas.microsoft.com/office/2019/extlst" xmlns:r="http://schemas.openxmlformats.org/officeDocument/2006/relationships" xmlns:m="http://schemas.openxmlformats.org/officeDocument/2006/math" xmlns:v="urn:schemas-microsoft-com:vml" xmlns:wp14="http://schemas.microsoft.com/office/word/2010/wordprocessingDrawing" xmlns:wp="http://schemas.openxmlformats.org/drawingml/2006/wordprocessingDrawing" xmlns:w10="urn:schemas-microsoft-com:office:word" xmlns:w="http://schemas.openxmlformats.org/wordprocessingml/2006/main" xmlns:w14="http://schemas.microsoft.com/office/word/2010/wordml" xmlns:w15="http://schemas.microsoft.com/office/word/2012/wordml" xmlns:w16cex="http://schemas.microsoft.com/office/word/2018/wordml/cex" xmlns:w16cid="http://schemas.microsoft.com/office/word/2016/wordml/cid" xmlns:w16="http://schemas.microsoft.com/office/word/2018/wordml" xmlns:w16du="http://schemas.microsoft.com/office/word/2023/wordml/word16du" xmlns:w16sdtdh="http://schemas.microsoft.com/office/word/2020/wordml/sdtdatahash" xmlns:w16sdtfl="http://schemas.microsoft.com/office/word/2024/wordml/sdtformatlock" xmlns:w16se="http://schemas.microsoft.com/office/word/2015/wordml/symex" xmlns:wpg="http://schemas.microsoft.com/office/word/2010/wordprocessingGroup" xmlns:wpi="http://schemas.microsoft.com/office/word/2010/wordprocessingInk" xmlns:wne="http://schemas.microsoft.com/office/word/2006/wordml" xmlns:wps="http://schemas.microsoft.com/office/word/2010/wordprocessingShape" mc:Ignorable="w14 w15 w16se w16cid w16 w16cex w16sdtdh w16sdtfl w16du wp14">
   <w:endnote w:type="separator" w:id="-1">
     <w:p>
       <w:pPr>
@@ -1867,17 +3330,7 @@
 </file>
 
 <file path=word/footer1.xml><?xml version="1.0" encoding="utf-8"?>
-<w:ftr xmlns:wpc="http://schemas.microsoft.com/office/word/2010/wordprocessingCanvas" xmlns:cx="http://schemas.microsoft.com/office/drawing/2014/chartex" xmlns:cx1="http://schemas.microsoft.com/office/drawing/2015/9/8/chartex" xmlns:cx2="http://schemas.microsoft.com/office/drawing/2015/10/21/chartex" xmlns:cx3="http://schemas.microsoft.com/office/drawing/2016/5/9/chartex" xmlns:cx4="http://schemas.microsoft.com/office/drawing/2016/5/10/chartex" xmlns:cx5="http://schemas.microsoft.com/office/drawing/2016/5/11/chartex" xmlns:cx6="http://schemas.microsoft.com/office/drawing/2016/5/12/chartex" xmlns:cx7="http://schemas.microsoft.com/office/drawing/2016/5/13/chartex" xmlns:cx8="http://schemas.microsoft.com/office/drawing/2016/5/14/chartex" xmlns:mc="http://schemas.openxmlformats.org/markup-compatibility/2006" xmlns:aink="http://schemas.microsoft.com/office/drawing/2016/ink" xmlns:am3d="http://schemas.microsoft.com/office/drawing/2017/model3d" xmlns:o="urn:schemas-microsoft-com:office:office" xmlns:oel="http://schemas.microsoft.com/office/2019/extlst" xmlns:r="http://schemas.openxmlformats.org/officeDocument/2006/relationships" xmlns:m="http://schemas.openxmlformats.org/officeDocument/2006/math" xmlns:v="urn:schemas-microsoft-com:vml" xmlns:wp14="http://schemas.microsoft.com/office/word/2010/wordprocessingDrawing" xmlns:wp="http://schemas.openxmlformats.org/drawingml/2006/wordprocessingDrawing" xmlns:w10="urn:schemas-microsoft-com:office:word" xmlns:w="http://schemas.openxmlformats.org/wordprocessingml/2006/main" xmlns:w14="http://schemas.microsoft.com/office/word/2010/wordml" xmlns:w15="http://schemas.microsoft.com/office/word/2012/wordml" xmlns:w16cex="http://schemas.microsoft.com/office/word/2018/wordml/cex" xmlns:w16cid="http://schemas.microsoft.com/office/word/2016/wordml/cid" xmlns:w16="http://schemas.microsoft.com/office/word/2018/wordml" xmlns:w16du="http://schemas.microsoft.com/office/word/2023/wordml/word16du" xmlns:w16sdtdh="http://schemas.microsoft.com/office/word/2020/wordml/sdtdatahash" xmlns:w16se="http://schemas.microsoft.com/office/word/2015/wordml/symex" xmlns:wpg="http://schemas.microsoft.com/office/word/2010/wordprocessingGroup" xmlns:wpi="http://schemas.microsoft.com/office/word/2010/wordprocessingInk" xmlns:wne="http://schemas.microsoft.com/office/word/2006/wordml" xmlns:wps="http://schemas.microsoft.com/office/word/2010/wordprocessingShape" mc:Ignorable="w14 w15 w16se w16cid w16 w16cex w16sdtdh w16du wp14">
-  <w:p>
-    <w:pPr>
-      <w:pStyle w:val="Piedepgina"/>
-    </w:pPr>
-  </w:p>
-</w:ftr>
-</file>
-
-<file path=word/footer2.xml><?xml version="1.0" encoding="utf-8"?>
-<w:ftr xmlns:wpc="http://schemas.microsoft.com/office/word/2010/wordprocessingCanvas" xmlns:cx="http://schemas.microsoft.com/office/drawing/2014/chartex" xmlns:cx1="http://schemas.microsoft.com/office/drawing/2015/9/8/chartex" xmlns:cx2="http://schemas.microsoft.com/office/drawing/2015/10/21/chartex" xmlns:cx3="http://schemas.microsoft.com/office/drawing/2016/5/9/chartex" xmlns:cx4="http://schemas.microsoft.com/office/drawing/2016/5/10/chartex" xmlns:cx5="http://schemas.microsoft.com/office/drawing/2016/5/11/chartex" xmlns:cx6="http://schemas.microsoft.com/office/drawing/2016/5/12/chartex" xmlns:cx7="http://schemas.microsoft.com/office/drawing/2016/5/13/chartex" xmlns:cx8="http://schemas.microsoft.com/office/drawing/2016/5/14/chartex" xmlns:mc="http://schemas.openxmlformats.org/markup-compatibility/2006" xmlns:aink="http://schemas.microsoft.com/office/drawing/2016/ink" xmlns:am3d="http://schemas.microsoft.com/office/drawing/2017/model3d" xmlns:o="urn:schemas-microsoft-com:office:office" xmlns:oel="http://schemas.microsoft.com/office/2019/extlst" xmlns:r="http://schemas.openxmlformats.org/officeDocument/2006/relationships" xmlns:m="http://schemas.openxmlformats.org/officeDocument/2006/math" xmlns:v="urn:schemas-microsoft-com:vml" xmlns:wp14="http://schemas.microsoft.com/office/word/2010/wordprocessingDrawing" xmlns:wp="http://schemas.openxmlformats.org/drawingml/2006/wordprocessingDrawing" xmlns:w10="urn:schemas-microsoft-com:office:word" xmlns:w="http://schemas.openxmlformats.org/wordprocessingml/2006/main" xmlns:w14="http://schemas.microsoft.com/office/word/2010/wordml" xmlns:w15="http://schemas.microsoft.com/office/word/2012/wordml" xmlns:w16cex="http://schemas.microsoft.com/office/word/2018/wordml/cex" xmlns:w16cid="http://schemas.microsoft.com/office/word/2016/wordml/cid" xmlns:w16="http://schemas.microsoft.com/office/word/2018/wordml" xmlns:w16du="http://schemas.microsoft.com/office/word/2023/wordml/word16du" xmlns:w16sdtdh="http://schemas.microsoft.com/office/word/2020/wordml/sdtdatahash" xmlns:w16se="http://schemas.microsoft.com/office/word/2015/wordml/symex" xmlns:wpg="http://schemas.microsoft.com/office/word/2010/wordprocessingGroup" xmlns:wpi="http://schemas.microsoft.com/office/word/2010/wordprocessingInk" xmlns:wne="http://schemas.microsoft.com/office/word/2006/wordml" xmlns:wps="http://schemas.microsoft.com/office/word/2010/wordprocessingShape" mc:Ignorable="w14 w15 w16se w16cid w16 w16cex w16sdtdh w16du wp14">
+<w:ftr xmlns:wpc="http://schemas.microsoft.com/office/word/2010/wordprocessingCanvas" xmlns:cx="http://schemas.microsoft.com/office/drawing/2014/chartex" xmlns:cx1="http://schemas.microsoft.com/office/drawing/2015/9/8/chartex" xmlns:cx2="http://schemas.microsoft.com/office/drawing/2015/10/21/chartex" xmlns:cx3="http://schemas.microsoft.com/office/drawing/2016/5/9/chartex" xmlns:cx4="http://schemas.microsoft.com/office/drawing/2016/5/10/chartex" xmlns:cx5="http://schemas.microsoft.com/office/drawing/2016/5/11/chartex" xmlns:cx6="http://schemas.microsoft.com/office/drawing/2016/5/12/chartex" xmlns:cx7="http://schemas.microsoft.com/office/drawing/2016/5/13/chartex" xmlns:cx8="http://schemas.microsoft.com/office/drawing/2016/5/14/chartex" xmlns:mc="http://schemas.openxmlformats.org/markup-compatibility/2006" xmlns:aink="http://schemas.microsoft.com/office/drawing/2016/ink" xmlns:am3d="http://schemas.microsoft.com/office/drawing/2017/model3d" xmlns:o="urn:schemas-microsoft-com:office:office" xmlns:oel="http://schemas.microsoft.com/office/2019/extlst" xmlns:r="http://schemas.openxmlformats.org/officeDocument/2006/relationships" xmlns:m="http://schemas.openxmlformats.org/officeDocument/2006/math" xmlns:v="urn:schemas-microsoft-com:vml" xmlns:wp14="http://schemas.microsoft.com/office/word/2010/wordprocessingDrawing" xmlns:wp="http://schemas.openxmlformats.org/drawingml/2006/wordprocessingDrawing" xmlns:w10="urn:schemas-microsoft-com:office:word" xmlns:w="http://schemas.openxmlformats.org/wordprocessingml/2006/main" xmlns:w14="http://schemas.microsoft.com/office/word/2010/wordml" xmlns:w15="http://schemas.microsoft.com/office/word/2012/wordml" xmlns:w16cex="http://schemas.microsoft.com/office/word/2018/wordml/cex" xmlns:w16cid="http://schemas.microsoft.com/office/word/2016/wordml/cid" xmlns:w16="http://schemas.microsoft.com/office/word/2018/wordml" xmlns:w16du="http://schemas.microsoft.com/office/word/2023/wordml/word16du" xmlns:w16sdtdh="http://schemas.microsoft.com/office/word/2020/wordml/sdtdatahash" xmlns:w16sdtfl="http://schemas.microsoft.com/office/word/2024/wordml/sdtformatlock" xmlns:w16se="http://schemas.microsoft.com/office/word/2015/wordml/symex" xmlns:wpg="http://schemas.microsoft.com/office/word/2010/wordprocessingGroup" xmlns:wpi="http://schemas.microsoft.com/office/word/2010/wordprocessingInk" xmlns:wne="http://schemas.microsoft.com/office/word/2006/wordml" xmlns:wps="http://schemas.microsoft.com/office/word/2010/wordprocessingShape" mc:Ignorable="w14 w15 w16se w16cid w16 w16cex w16sdtdh w16sdtfl w16du wp14">
   <w:p>
     <w:pPr>
       <w:pStyle w:val="Piedepgina"/>
@@ -1892,24 +3345,50 @@
         <w:sz w:val="20"/>
         <w:szCs w:val="20"/>
       </w:rPr>
-      <w:t xml:space="preserve">Plan de Capacitación – </w:t>
+      <w:t>Plan de Capacitación</w:t>
     </w:r>
     <w:r>
       <w:rPr>
         <w:sz w:val="20"/>
         <w:szCs w:val="20"/>
       </w:rPr>
+      <w:t xml:space="preserve"> Mi Refugio</w:t>
+    </w:r>
+    <w:r>
+      <w:rPr>
+        <w:sz w:val="20"/>
+        <w:szCs w:val="20"/>
+      </w:rPr>
+      <w:t xml:space="preserve"> – </w:t>
+    </w:r>
+    <w:r>
+      <w:rPr>
+        <w:sz w:val="20"/>
+        <w:szCs w:val="20"/>
+      </w:rPr>
       <w:t xml:space="preserve">CAPSTONE </w:t>
     </w:r>
-    <w:proofErr w:type="spellStart"/>
     <w:r>
       <w:rPr>
         <w:sz w:val="20"/>
         <w:szCs w:val="20"/>
       </w:rPr>
-      <w:t>DuocUC</w:t>
+      <w:t>Duoc</w:t>
     </w:r>
-    <w:proofErr w:type="spellEnd"/>
+    <w:r>
+      <w:rPr>
+        <w:sz w:val="20"/>
+        <w:szCs w:val="20"/>
+      </w:rPr>
+      <w:t xml:space="preserve"> </w:t>
+    </w:r>
+    <w:r>
+      <w:rPr>
+        <w:sz w:val="20"/>
+        <w:szCs w:val="20"/>
+      </w:rPr>
+      <w:t>UC</w:t>
+    </w:r>
   </w:p>
   <w:p>
     <w:pPr>
@@ -1919,18 +3398,8 @@
 </w:ftr>
 </file>
 
-<file path=word/footer3.xml><?xml version="1.0" encoding="utf-8"?>
-<w:ftr xmlns:wpc="http://schemas.microsoft.com/office/word/2010/wordprocessingCanvas" xmlns:cx="http://schemas.microsoft.com/office/drawing/2014/chartex" xmlns:cx1="http://schemas.microsoft.com/office/drawing/2015/9/8/chartex" xmlns:cx2="http://schemas.microsoft.com/office/drawing/2015/10/21/chartex" xmlns:cx3="http://schemas.microsoft.com/office/drawing/2016/5/9/chartex" xmlns:cx4="http://schemas.microsoft.com/office/drawing/2016/5/10/chartex" xmlns:cx5="http://schemas.microsoft.com/office/drawing/2016/5/11/chartex" xmlns:cx6="http://schemas.microsoft.com/office/drawing/2016/5/12/chartex" xmlns:cx7="http://schemas.microsoft.com/office/drawing/2016/5/13/chartex" xmlns:cx8="http://schemas.microsoft.com/office/drawing/2016/5/14/chartex" xmlns:mc="http://schemas.openxmlformats.org/markup-compatibility/2006" xmlns:aink="http://schemas.microsoft.com/office/drawing/2016/ink" xmlns:am3d="http://schemas.microsoft.com/office/drawing/2017/model3d" xmlns:o="urn:schemas-microsoft-com:office:office" xmlns:oel="http://schemas.microsoft.com/office/2019/extlst" xmlns:r="http://schemas.openxmlformats.org/officeDocument/2006/relationships" xmlns:m="http://schemas.openxmlformats.org/officeDocument/2006/math" xmlns:v="urn:schemas-microsoft-com:vml" xmlns:wp14="http://schemas.microsoft.com/office/word/2010/wordprocessingDrawing" xmlns:wp="http://schemas.openxmlformats.org/drawingml/2006/wordprocessingDrawing" xmlns:w10="urn:schemas-microsoft-com:office:word" xmlns:w="http://schemas.openxmlformats.org/wordprocessingml/2006/main" xmlns:w14="http://schemas.microsoft.com/office/word/2010/wordml" xmlns:w15="http://schemas.microsoft.com/office/word/2012/wordml" xmlns:w16cex="http://schemas.microsoft.com/office/word/2018/wordml/cex" xmlns:w16cid="http://schemas.microsoft.com/office/word/2016/wordml/cid" xmlns:w16="http://schemas.microsoft.com/office/word/2018/wordml" xmlns:w16du="http://schemas.microsoft.com/office/word/2023/wordml/word16du" xmlns:w16sdtdh="http://schemas.microsoft.com/office/word/2020/wordml/sdtdatahash" xmlns:w16se="http://schemas.microsoft.com/office/word/2015/wordml/symex" xmlns:wpg="http://schemas.microsoft.com/office/word/2010/wordprocessingGroup" xmlns:wpi="http://schemas.microsoft.com/office/word/2010/wordprocessingInk" xmlns:wne="http://schemas.microsoft.com/office/word/2006/wordml" xmlns:wps="http://schemas.microsoft.com/office/word/2010/wordprocessingShape" mc:Ignorable="w14 w15 w16se w16cid w16 w16cex w16sdtdh w16du wp14">
-  <w:p>
-    <w:pPr>
-      <w:pStyle w:val="Piedepgina"/>
-    </w:pPr>
-  </w:p>
-</w:ftr>
-</file>
-
 <file path=word/footnotes.xml><?xml version="1.0" encoding="utf-8"?>
-<w:footnotes xmlns:wpc="http://schemas.microsoft.com/office/word/2010/wordprocessingCanvas" xmlns:cx="http://schemas.microsoft.com/office/drawing/2014/chartex" xmlns:cx1="http://schemas.microsoft.com/office/drawing/2015/9/8/chartex" xmlns:cx2="http://schemas.microsoft.com/office/drawing/2015/10/21/chartex" xmlns:cx3="http://schemas.microsoft.com/office/drawing/2016/5/9/chartex" xmlns:cx4="http://schemas.microsoft.com/office/drawing/2016/5/10/chartex" xmlns:cx5="http://schemas.microsoft.com/office/drawing/2016/5/11/chartex" xmlns:cx6="http://schemas.microsoft.com/office/drawing/2016/5/12/chartex" xmlns:cx7="http://schemas.microsoft.com/office/drawing/2016/5/13/chartex" xmlns:cx8="http://schemas.microsoft.com/office/drawing/2016/5/14/chartex" xmlns:mc="http://schemas.openxmlformats.org/markup-compatibility/2006" xmlns:aink="http://schemas.microsoft.com/office/drawing/2016/ink" xmlns:am3d="http://schemas.microsoft.com/office/drawing/2017/model3d" xmlns:o="urn:schemas-microsoft-com:office:office" xmlns:oel="http://schemas.microsoft.com/office/2019/extlst" xmlns:r="http://schemas.openxmlformats.org/officeDocument/2006/relationships" xmlns:m="http://schemas.openxmlformats.org/officeDocument/2006/math" xmlns:v="urn:schemas-microsoft-com:vml" xmlns:wp14="http://schemas.microsoft.com/office/word/2010/wordprocessingDrawing" xmlns:wp="http://schemas.openxmlformats.org/drawingml/2006/wordprocessingDrawing" xmlns:w10="urn:schemas-microsoft-com:office:word" xmlns:w="http://schemas.openxmlformats.org/wordprocessingml/2006/main" xmlns:w14="http://schemas.microsoft.com/office/word/2010/wordml" xmlns:w15="http://schemas.microsoft.com/office/word/2012/wordml" xmlns:w16cex="http://schemas.microsoft.com/office/word/2018/wordml/cex" xmlns:w16cid="http://schemas.microsoft.com/office/word/2016/wordml/cid" xmlns:w16="http://schemas.microsoft.com/office/word/2018/wordml" xmlns:w16du="http://schemas.microsoft.com/office/word/2023/wordml/word16du" xmlns:w16sdtdh="http://schemas.microsoft.com/office/word/2020/wordml/sdtdatahash" xmlns:w16se="http://schemas.microsoft.com/office/word/2015/wordml/symex" xmlns:wpg="http://schemas.microsoft.com/office/word/2010/wordprocessingGroup" xmlns:wpi="http://schemas.microsoft.com/office/word/2010/wordprocessingInk" xmlns:wne="http://schemas.microsoft.com/office/word/2006/wordml" xmlns:wps="http://schemas.microsoft.com/office/word/2010/wordprocessingShape" mc:Ignorable="w14 w15 w16se w16cid w16 w16cex w16sdtdh w16du wp14">
+<w:footnotes xmlns:wpc="http://schemas.microsoft.com/office/word/2010/wordprocessingCanvas" xmlns:cx="http://schemas.microsoft.com/office/drawing/2014/chartex" xmlns:cx1="http://schemas.microsoft.com/office/drawing/2015/9/8/chartex" xmlns:cx2="http://schemas.microsoft.com/office/drawing/2015/10/21/chartex" xmlns:cx3="http://schemas.microsoft.com/office/drawing/2016/5/9/chartex" xmlns:cx4="http://schemas.microsoft.com/office/drawing/2016/5/10/chartex" xmlns:cx5="http://schemas.microsoft.com/office/drawing/2016/5/11/chartex" xmlns:cx6="http://schemas.microsoft.com/office/drawing/2016/5/12/chartex" xmlns:cx7="http://schemas.microsoft.com/office/drawing/2016/5/13/chartex" xmlns:cx8="http://schemas.microsoft.com/office/drawing/2016/5/14/chartex" xmlns:mc="http://schemas.openxmlformats.org/markup-compatibility/2006" xmlns:aink="http://schemas.microsoft.com/office/drawing/2016/ink" xmlns:am3d="http://schemas.microsoft.com/office/drawing/2017/model3d" xmlns:o="urn:schemas-microsoft-com:office:office" xmlns:oel="http://schemas.microsoft.com/office/2019/extlst" xmlns:r="http://schemas.openxmlformats.org/officeDocument/2006/relationships" xmlns:m="http://schemas.openxmlformats.org/officeDocument/2006/math" xmlns:v="urn:schemas-microsoft-com:vml" xmlns:wp14="http://schemas.microsoft.com/office/word/2010/wordprocessingDrawing" xmlns:wp="http://schemas.openxmlformats.org/drawingml/2006/wordprocessingDrawing" xmlns:w10="urn:schemas-microsoft-com:office:word" xmlns:w="http://schemas.openxmlformats.org/wordprocessingml/2006/main" xmlns:w14="http://schemas.microsoft.com/office/word/2010/wordml" xmlns:w15="http://schemas.microsoft.com/office/word/2012/wordml" xmlns:w16cex="http://schemas.microsoft.com/office/word/2018/wordml/cex" xmlns:w16cid="http://schemas.microsoft.com/office/word/2016/wordml/cid" xmlns:w16="http://schemas.microsoft.com/office/word/2018/wordml" xmlns:w16du="http://schemas.microsoft.com/office/word/2023/wordml/word16du" xmlns:w16sdtdh="http://schemas.microsoft.com/office/word/2020/wordml/sdtdatahash" xmlns:w16sdtfl="http://schemas.microsoft.com/office/word/2024/wordml/sdtformatlock" xmlns:w16se="http://schemas.microsoft.com/office/word/2015/wordml/symex" xmlns:wpg="http://schemas.microsoft.com/office/word/2010/wordprocessingGroup" xmlns:wpi="http://schemas.microsoft.com/office/word/2010/wordprocessingInk" xmlns:wne="http://schemas.microsoft.com/office/word/2006/wordml" xmlns:wps="http://schemas.microsoft.com/office/word/2010/wordprocessingShape" mc:Ignorable="w14 w15 w16se w16cid w16 w16cex w16sdtdh w16sdtfl w16du wp14">
   <w:footnote w:type="separator" w:id="-1">
     <w:p>
       <w:pPr>
@@ -1955,17 +3424,7 @@
 </file>
 
 <file path=word/header1.xml><?xml version="1.0" encoding="utf-8"?>
-<w:hdr xmlns:wpc="http://schemas.microsoft.com/office/word/2010/wordprocessingCanvas" xmlns:cx="http://schemas.microsoft.com/office/drawing/2014/chartex" xmlns:cx1="http://schemas.microsoft.com/office/drawing/2015/9/8/chartex" xmlns:cx2="http://schemas.microsoft.com/office/drawing/2015/10/21/chartex" xmlns:cx3="http://schemas.microsoft.com/office/drawing/2016/5/9/chartex" xmlns:cx4="http://schemas.microsoft.com/office/drawing/2016/5/10/chartex" xmlns:cx5="http://schemas.microsoft.com/office/drawing/2016/5/11/chartex" xmlns:cx6="http://schemas.microsoft.com/office/drawing/2016/5/12/chartex" xmlns:cx7="http://schemas.microsoft.com/office/drawing/2016/5/13/chartex" xmlns:cx8="http://schemas.microsoft.com/office/drawing/2016/5/14/chartex" xmlns:mc="http://schemas.openxmlformats.org/markup-compatibility/2006" xmlns:aink="http://schemas.microsoft.com/office/drawing/2016/ink" xmlns:am3d="http://schemas.microsoft.com/office/drawing/2017/model3d" xmlns:o="urn:schemas-microsoft-com:office:office" xmlns:oel="http://schemas.microsoft.com/office/2019/extlst" xmlns:r="http://schemas.openxmlformats.org/officeDocument/2006/relationships" xmlns:m="http://schemas.openxmlformats.org/officeDocument/2006/math" xmlns:v="urn:schemas-microsoft-com:vml" xmlns:wp14="http://schemas.microsoft.com/office/word/2010/wordprocessingDrawing" xmlns:wp="http://schemas.openxmlformats.org/drawingml/2006/wordprocessingDrawing" xmlns:w10="urn:schemas-microsoft-com:office:word" xmlns:w="http://schemas.openxmlformats.org/wordprocessingml/2006/main" xmlns:w14="http://schemas.microsoft.com/office/word/2010/wordml" xmlns:w15="http://schemas.microsoft.com/office/word/2012/wordml" xmlns:w16cex="http://schemas.microsoft.com/office/word/2018/wordml/cex" xmlns:w16cid="http://schemas.microsoft.com/office/word/2016/wordml/cid" xmlns:w16="http://schemas.microsoft.com/office/word/2018/wordml" xmlns:w16du="http://schemas.microsoft.com/office/word/2023/wordml/word16du" xmlns:w16sdtdh="http://schemas.microsoft.com/office/word/2020/wordml/sdtdatahash" xmlns:w16se="http://schemas.microsoft.com/office/word/2015/wordml/symex" xmlns:wpg="http://schemas.microsoft.com/office/word/2010/wordprocessingGroup" xmlns:wpi="http://schemas.microsoft.com/office/word/2010/wordprocessingInk" xmlns:wne="http://schemas.microsoft.com/office/word/2006/wordml" xmlns:wps="http://schemas.microsoft.com/office/word/2010/wordprocessingShape" mc:Ignorable="w14 w15 w16se w16cid w16 w16cex w16sdtdh w16du wp14">
-  <w:p>
-    <w:pPr>
-      <w:pStyle w:val="Encabezado"/>
-    </w:pPr>
-  </w:p>
-</w:hdr>
-</file>
-
-<file path=word/header2.xml><?xml version="1.0" encoding="utf-8"?>
-<w:hdr xmlns:wpc="http://schemas.microsoft.com/office/word/2010/wordprocessingCanvas" xmlns:cx="http://schemas.microsoft.com/office/drawing/2014/chartex" xmlns:cx1="http://schemas.microsoft.com/office/drawing/2015/9/8/chartex" xmlns:cx2="http://schemas.microsoft.com/office/drawing/2015/10/21/chartex" xmlns:cx3="http://schemas.microsoft.com/office/drawing/2016/5/9/chartex" xmlns:cx4="http://schemas.microsoft.com/office/drawing/2016/5/10/chartex" xmlns:cx5="http://schemas.microsoft.com/office/drawing/2016/5/11/chartex" xmlns:cx6="http://schemas.microsoft.com/office/drawing/2016/5/12/chartex" xmlns:cx7="http://schemas.microsoft.com/office/drawing/2016/5/13/chartex" xmlns:cx8="http://schemas.microsoft.com/office/drawing/2016/5/14/chartex" xmlns:mc="http://schemas.openxmlformats.org/markup-compatibility/2006" xmlns:aink="http://schemas.microsoft.com/office/drawing/2016/ink" xmlns:am3d="http://schemas.microsoft.com/office/drawing/2017/model3d" xmlns:o="urn:schemas-microsoft-com:office:office" xmlns:oel="http://schemas.microsoft.com/office/2019/extlst" xmlns:r="http://schemas.openxmlformats.org/officeDocument/2006/relationships" xmlns:m="http://schemas.openxmlformats.org/officeDocument/2006/math" xmlns:v="urn:schemas-microsoft-com:vml" xmlns:wp14="http://schemas.microsoft.com/office/word/2010/wordprocessingDrawing" xmlns:wp="http://schemas.openxmlformats.org/drawingml/2006/wordprocessingDrawing" xmlns:w10="urn:schemas-microsoft-com:office:word" xmlns:w="http://schemas.openxmlformats.org/wordprocessingml/2006/main" xmlns:w14="http://schemas.microsoft.com/office/word/2010/wordml" xmlns:w15="http://schemas.microsoft.com/office/word/2012/wordml" xmlns:w16cex="http://schemas.microsoft.com/office/word/2018/wordml/cex" xmlns:w16cid="http://schemas.microsoft.com/office/word/2016/wordml/cid" xmlns:w16="http://schemas.microsoft.com/office/word/2018/wordml" xmlns:w16du="http://schemas.microsoft.com/office/word/2023/wordml/word16du" xmlns:w16sdtdh="http://schemas.microsoft.com/office/word/2020/wordml/sdtdatahash" xmlns:w16se="http://schemas.microsoft.com/office/word/2015/wordml/symex" xmlns:wpg="http://schemas.microsoft.com/office/word/2010/wordprocessingGroup" xmlns:wpi="http://schemas.microsoft.com/office/word/2010/wordprocessingInk" xmlns:wne="http://schemas.microsoft.com/office/word/2006/wordml" xmlns:wps="http://schemas.microsoft.com/office/word/2010/wordprocessingShape" mc:Ignorable="w14 w15 w16se w16cid w16 w16cex w16sdtdh w16du wp14">
+<w:hdr xmlns:wpc="http://schemas.microsoft.com/office/word/2010/wordprocessingCanvas" xmlns:cx="http://schemas.microsoft.com/office/drawing/2014/chartex" xmlns:cx1="http://schemas.microsoft.com/office/drawing/2015/9/8/chartex" xmlns:cx2="http://schemas.microsoft.com/office/drawing/2015/10/21/chartex" xmlns:cx3="http://schemas.microsoft.com/office/drawing/2016/5/9/chartex" xmlns:cx4="http://schemas.microsoft.com/office/drawing/2016/5/10/chartex" xmlns:cx5="http://schemas.microsoft.com/office/drawing/2016/5/11/chartex" xmlns:cx6="http://schemas.microsoft.com/office/drawing/2016/5/12/chartex" xmlns:cx7="http://schemas.microsoft.com/office/drawing/2016/5/13/chartex" xmlns:cx8="http://schemas.microsoft.com/office/drawing/2016/5/14/chartex" xmlns:mc="http://schemas.openxmlformats.org/markup-compatibility/2006" xmlns:aink="http://schemas.microsoft.com/office/drawing/2016/ink" xmlns:am3d="http://schemas.microsoft.com/office/drawing/2017/model3d" xmlns:o="urn:schemas-microsoft-com:office:office" xmlns:oel="http://schemas.microsoft.com/office/2019/extlst" xmlns:r="http://schemas.openxmlformats.org/officeDocument/2006/relationships" xmlns:m="http://schemas.openxmlformats.org/officeDocument/2006/math" xmlns:v="urn:schemas-microsoft-com:vml" xmlns:wp14="http://schemas.microsoft.com/office/word/2010/wordprocessingDrawing" xmlns:wp="http://schemas.openxmlformats.org/drawingml/2006/wordprocessingDrawing" xmlns:w10="urn:schemas-microsoft-com:office:word" xmlns:w="http://schemas.openxmlformats.org/wordprocessingml/2006/main" xmlns:w14="http://schemas.microsoft.com/office/word/2010/wordml" xmlns:w15="http://schemas.microsoft.com/office/word/2012/wordml" xmlns:w16cex="http://schemas.microsoft.com/office/word/2018/wordml/cex" xmlns:w16cid="http://schemas.microsoft.com/office/word/2016/wordml/cid" xmlns:w16="http://schemas.microsoft.com/office/word/2018/wordml" xmlns:w16du="http://schemas.microsoft.com/office/word/2023/wordml/word16du" xmlns:w16sdtdh="http://schemas.microsoft.com/office/word/2020/wordml/sdtdatahash" xmlns:w16sdtfl="http://schemas.microsoft.com/office/word/2024/wordml/sdtformatlock" xmlns:w16se="http://schemas.microsoft.com/office/word/2015/wordml/symex" xmlns:wpg="http://schemas.microsoft.com/office/word/2010/wordprocessingGroup" xmlns:wpi="http://schemas.microsoft.com/office/word/2010/wordprocessingInk" xmlns:wne="http://schemas.microsoft.com/office/word/2006/wordml" xmlns:wps="http://schemas.microsoft.com/office/word/2010/wordprocessingShape" mc:Ignorable="w14 w15 w16se w16cid w16 w16cex w16sdtdh w16sdtfl w16du wp14">
   <w:p>
     <w:pPr>
       <w:tabs>
@@ -2069,19 +3528,980 @@
 </w:hdr>
 </file>
 
-<file path=word/header3.xml><?xml version="1.0" encoding="utf-8"?>
-<w:hdr xmlns:wpc="http://schemas.microsoft.com/office/word/2010/wordprocessingCanvas" xmlns:cx="http://schemas.microsoft.com/office/drawing/2014/chartex" xmlns:cx1="http://schemas.microsoft.com/office/drawing/2015/9/8/chartex" xmlns:cx2="http://schemas.microsoft.com/office/drawing/2015/10/21/chartex" xmlns:cx3="http://schemas.microsoft.com/office/drawing/2016/5/9/chartex" xmlns:cx4="http://schemas.microsoft.com/office/drawing/2016/5/10/chartex" xmlns:cx5="http://schemas.microsoft.com/office/drawing/2016/5/11/chartex" xmlns:cx6="http://schemas.microsoft.com/office/drawing/2016/5/12/chartex" xmlns:cx7="http://schemas.microsoft.com/office/drawing/2016/5/13/chartex" xmlns:cx8="http://schemas.microsoft.com/office/drawing/2016/5/14/chartex" xmlns:mc="http://schemas.openxmlformats.org/markup-compatibility/2006" xmlns:aink="http://schemas.microsoft.com/office/drawing/2016/ink" xmlns:am3d="http://schemas.microsoft.com/office/drawing/2017/model3d" xmlns:o="urn:schemas-microsoft-com:office:office" xmlns:oel="http://schemas.microsoft.com/office/2019/extlst" xmlns:r="http://schemas.openxmlformats.org/officeDocument/2006/relationships" xmlns:m="http://schemas.openxmlformats.org/officeDocument/2006/math" xmlns:v="urn:schemas-microsoft-com:vml" xmlns:wp14="http://schemas.microsoft.com/office/word/2010/wordprocessingDrawing" xmlns:wp="http://schemas.openxmlformats.org/drawingml/2006/wordprocessingDrawing" xmlns:w10="urn:schemas-microsoft-com:office:word" xmlns:w="http://schemas.openxmlformats.org/wordprocessingml/2006/main" xmlns:w14="http://schemas.microsoft.com/office/word/2010/wordml" xmlns:w15="http://schemas.microsoft.com/office/word/2012/wordml" xmlns:w16cex="http://schemas.microsoft.com/office/word/2018/wordml/cex" xmlns:w16cid="http://schemas.microsoft.com/office/word/2016/wordml/cid" xmlns:w16="http://schemas.microsoft.com/office/word/2018/wordml" xmlns:w16du="http://schemas.microsoft.com/office/word/2023/wordml/word16du" xmlns:w16sdtdh="http://schemas.microsoft.com/office/word/2020/wordml/sdtdatahash" xmlns:w16se="http://schemas.microsoft.com/office/word/2015/wordml/symex" xmlns:wpg="http://schemas.microsoft.com/office/word/2010/wordprocessingGroup" xmlns:wpi="http://schemas.microsoft.com/office/word/2010/wordprocessingInk" xmlns:wne="http://schemas.microsoft.com/office/word/2006/wordml" xmlns:wps="http://schemas.microsoft.com/office/word/2010/wordprocessingShape" mc:Ignorable="w14 w15 w16se w16cid w16 w16cex w16sdtdh w16du wp14">
-  <w:p>
-    <w:pPr>
-      <w:pStyle w:val="Encabezado"/>
-    </w:pPr>
-  </w:p>
-</w:hdr>
-</file>
-
 <file path=word/numbering.xml><?xml version="1.0" encoding="utf-8"?>
-<w:numbering xmlns:wpc="http://schemas.microsoft.com/office/word/2010/wordprocessingCanvas" xmlns:cx="http://schemas.microsoft.com/office/drawing/2014/chartex" xmlns:cx1="http://schemas.microsoft.com/office/drawing/2015/9/8/chartex" xmlns:cx2="http://schemas.microsoft.com/office/drawing/2015/10/21/chartex" xmlns:cx3="http://schemas.microsoft.com/office/drawing/2016/5/9/chartex" xmlns:cx4="http://schemas.microsoft.com/office/drawing/2016/5/10/chartex" xmlns:cx5="http://schemas.microsoft.com/office/drawing/2016/5/11/chartex" xmlns:cx6="http://schemas.microsoft.com/office/drawing/2016/5/12/chartex" xmlns:cx7="http://schemas.microsoft.com/office/drawing/2016/5/13/chartex" xmlns:cx8="http://schemas.microsoft.com/office/drawing/2016/5/14/chartex" xmlns:mc="http://schemas.openxmlformats.org/markup-compatibility/2006" xmlns:aink="http://schemas.microsoft.com/office/drawing/2016/ink" xmlns:am3d="http://schemas.microsoft.com/office/drawing/2017/model3d" xmlns:o="urn:schemas-microsoft-com:office:office" xmlns:oel="http://schemas.microsoft.com/office/2019/extlst" xmlns:r="http://schemas.openxmlformats.org/officeDocument/2006/relationships" xmlns:m="http://schemas.openxmlformats.org/officeDocument/2006/math" xmlns:v="urn:schemas-microsoft-com:vml" xmlns:wp14="http://schemas.microsoft.com/office/word/2010/wordprocessingDrawing" xmlns:wp="http://schemas.openxmlformats.org/drawingml/2006/wordprocessingDrawing" xmlns:w10="urn:schemas-microsoft-com:office:word" xmlns:w="http://schemas.openxmlformats.org/wordprocessingml/2006/main" xmlns:w14="http://schemas.microsoft.com/office/word/2010/wordml" xmlns:w15="http://schemas.microsoft.com/office/word/2012/wordml" xmlns:w16cex="http://schemas.microsoft.com/office/word/2018/wordml/cex" xmlns:w16cid="http://schemas.microsoft.com/office/word/2016/wordml/cid" xmlns:w16="http://schemas.microsoft.com/office/word/2018/wordml" xmlns:w16du="http://schemas.microsoft.com/office/word/2023/wordml/word16du" xmlns:w16sdtdh="http://schemas.microsoft.com/office/word/2020/wordml/sdtdatahash" xmlns:w16se="http://schemas.microsoft.com/office/word/2015/wordml/symex" xmlns:wpg="http://schemas.microsoft.com/office/word/2010/wordprocessingGroup" xmlns:wpi="http://schemas.microsoft.com/office/word/2010/wordprocessingInk" xmlns:wne="http://schemas.microsoft.com/office/word/2006/wordml" xmlns:wps="http://schemas.microsoft.com/office/word/2010/wordprocessingShape" mc:Ignorable="w14 w15 w16se w16cid w16 w16cex w16sdtdh w16du wp14">
+<w:numbering xmlns:wpc="http://schemas.microsoft.com/office/word/2010/wordprocessingCanvas" xmlns:cx="http://schemas.microsoft.com/office/drawing/2014/chartex" xmlns:cx1="http://schemas.microsoft.com/office/drawing/2015/9/8/chartex" xmlns:cx2="http://schemas.microsoft.com/office/drawing/2015/10/21/chartex" xmlns:cx3="http://schemas.microsoft.com/office/drawing/2016/5/9/chartex" xmlns:cx4="http://schemas.microsoft.com/office/drawing/2016/5/10/chartex" xmlns:cx5="http://schemas.microsoft.com/office/drawing/2016/5/11/chartex" xmlns:cx6="http://schemas.microsoft.com/office/drawing/2016/5/12/chartex" xmlns:cx7="http://schemas.microsoft.com/office/drawing/2016/5/13/chartex" xmlns:cx8="http://schemas.microsoft.com/office/drawing/2016/5/14/chartex" xmlns:mc="http://schemas.openxmlformats.org/markup-compatibility/2006" xmlns:aink="http://schemas.microsoft.com/office/drawing/2016/ink" xmlns:am3d="http://schemas.microsoft.com/office/drawing/2017/model3d" xmlns:o="urn:schemas-microsoft-com:office:office" xmlns:oel="http://schemas.microsoft.com/office/2019/extlst" xmlns:r="http://schemas.openxmlformats.org/officeDocument/2006/relationships" xmlns:m="http://schemas.openxmlformats.org/officeDocument/2006/math" xmlns:v="urn:schemas-microsoft-com:vml" xmlns:wp14="http://schemas.microsoft.com/office/word/2010/wordprocessingDrawing" xmlns:wp="http://schemas.openxmlformats.org/drawingml/2006/wordprocessingDrawing" xmlns:w10="urn:schemas-microsoft-com:office:word" xmlns:w="http://schemas.openxmlformats.org/wordprocessingml/2006/main" xmlns:w14="http://schemas.microsoft.com/office/word/2010/wordml" xmlns:w15="http://schemas.microsoft.com/office/word/2012/wordml" xmlns:w16cex="http://schemas.microsoft.com/office/word/2018/wordml/cex" xmlns:w16cid="http://schemas.microsoft.com/office/word/2016/wordml/cid" xmlns:w16="http://schemas.microsoft.com/office/word/2018/wordml" xmlns:w16du="http://schemas.microsoft.com/office/word/2023/wordml/word16du" xmlns:w16sdtdh="http://schemas.microsoft.com/office/word/2020/wordml/sdtdatahash" xmlns:w16sdtfl="http://schemas.microsoft.com/office/word/2024/wordml/sdtformatlock" xmlns:w16se="http://schemas.microsoft.com/office/word/2015/wordml/symex" xmlns:wpg="http://schemas.microsoft.com/office/word/2010/wordprocessingGroup" xmlns:wpi="http://schemas.microsoft.com/office/word/2010/wordprocessingInk" xmlns:wne="http://schemas.microsoft.com/office/word/2006/wordml" xmlns:wps="http://schemas.microsoft.com/office/word/2010/wordprocessingShape" mc:Ignorable="w14 w15 w16se w16cid w16 w16cex w16sdtdh w16sdtfl w16du wp14">
   <w:abstractNum w:abstractNumId="0" w15:restartNumberingAfterBreak="0">
+    <w:nsid w:val="0D1B641C"/>
+    <w:multiLevelType w:val="multilevel"/>
+    <w:tmpl w:val="903EFF04"/>
+    <w:lvl w:ilvl="0">
+      <w:start w:val="1"/>
+      <w:numFmt w:val="bullet"/>
+      <w:lvlText w:val=""/>
+      <w:lvlJc w:val="left"/>
+      <w:pPr>
+        <w:tabs>
+          <w:tab w:val="num" w:pos="720"/>
+        </w:tabs>
+        <w:ind w:left="720" w:hanging="360"/>
+      </w:pPr>
+      <w:rPr>
+        <w:rFonts w:ascii="Symbol" w:hAnsi="Symbol" w:hint="default"/>
+        <w:sz w:val="20"/>
+      </w:rPr>
+    </w:lvl>
+    <w:lvl w:ilvl="1" w:tentative="1">
+      <w:start w:val="1"/>
+      <w:numFmt w:val="bullet"/>
+      <w:lvlText w:val="o"/>
+      <w:lvlJc w:val="left"/>
+      <w:pPr>
+        <w:tabs>
+          <w:tab w:val="num" w:pos="1440"/>
+        </w:tabs>
+        <w:ind w:left="1440" w:hanging="360"/>
+      </w:pPr>
+      <w:rPr>
+        <w:rFonts w:ascii="Courier New" w:hAnsi="Courier New" w:hint="default"/>
+        <w:sz w:val="20"/>
+      </w:rPr>
+    </w:lvl>
+    <w:lvl w:ilvl="2" w:tentative="1">
+      <w:start w:val="1"/>
+      <w:numFmt w:val="bullet"/>
+      <w:lvlText w:val=""/>
+      <w:lvlJc w:val="left"/>
+      <w:pPr>
+        <w:tabs>
+          <w:tab w:val="num" w:pos="2160"/>
+        </w:tabs>
+        <w:ind w:left="2160" w:hanging="360"/>
+      </w:pPr>
+      <w:rPr>
+        <w:rFonts w:ascii="Wingdings" w:hAnsi="Wingdings" w:hint="default"/>
+        <w:sz w:val="20"/>
+      </w:rPr>
+    </w:lvl>
+    <w:lvl w:ilvl="3" w:tentative="1">
+      <w:start w:val="1"/>
+      <w:numFmt w:val="bullet"/>
+      <w:lvlText w:val=""/>
+      <w:lvlJc w:val="left"/>
+      <w:pPr>
+        <w:tabs>
+          <w:tab w:val="num" w:pos="2880"/>
+        </w:tabs>
+        <w:ind w:left="2880" w:hanging="360"/>
+      </w:pPr>
+      <w:rPr>
+        <w:rFonts w:ascii="Wingdings" w:hAnsi="Wingdings" w:hint="default"/>
+        <w:sz w:val="20"/>
+      </w:rPr>
+    </w:lvl>
+    <w:lvl w:ilvl="4" w:tentative="1">
+      <w:start w:val="1"/>
+      <w:numFmt w:val="bullet"/>
+      <w:lvlText w:val=""/>
+      <w:lvlJc w:val="left"/>
+      <w:pPr>
+        <w:tabs>
+          <w:tab w:val="num" w:pos="3600"/>
+        </w:tabs>
+        <w:ind w:left="3600" w:hanging="360"/>
+      </w:pPr>
+      <w:rPr>
+        <w:rFonts w:ascii="Wingdings" w:hAnsi="Wingdings" w:hint="default"/>
+        <w:sz w:val="20"/>
+      </w:rPr>
+    </w:lvl>
+    <w:lvl w:ilvl="5" w:tentative="1">
+      <w:start w:val="1"/>
+      <w:numFmt w:val="bullet"/>
+      <w:lvlText w:val=""/>
+      <w:lvlJc w:val="left"/>
+      <w:pPr>
+        <w:tabs>
+          <w:tab w:val="num" w:pos="4320"/>
+        </w:tabs>
+        <w:ind w:left="4320" w:hanging="360"/>
+      </w:pPr>
+      <w:rPr>
+        <w:rFonts w:ascii="Wingdings" w:hAnsi="Wingdings" w:hint="default"/>
+        <w:sz w:val="20"/>
+      </w:rPr>
+    </w:lvl>
+    <w:lvl w:ilvl="6" w:tentative="1">
+      <w:start w:val="1"/>
+      <w:numFmt w:val="bullet"/>
+      <w:lvlText w:val=""/>
+      <w:lvlJc w:val="left"/>
+      <w:pPr>
+        <w:tabs>
+          <w:tab w:val="num" w:pos="5040"/>
+        </w:tabs>
+        <w:ind w:left="5040" w:hanging="360"/>
+      </w:pPr>
+      <w:rPr>
+        <w:rFonts w:ascii="Wingdings" w:hAnsi="Wingdings" w:hint="default"/>
+        <w:sz w:val="20"/>
+      </w:rPr>
+    </w:lvl>
+    <w:lvl w:ilvl="7" w:tentative="1">
+      <w:start w:val="1"/>
+      <w:numFmt w:val="bullet"/>
+      <w:lvlText w:val=""/>
+      <w:lvlJc w:val="left"/>
+      <w:pPr>
+        <w:tabs>
+          <w:tab w:val="num" w:pos="5760"/>
+        </w:tabs>
+        <w:ind w:left="5760" w:hanging="360"/>
+      </w:pPr>
+      <w:rPr>
+        <w:rFonts w:ascii="Wingdings" w:hAnsi="Wingdings" w:hint="default"/>
+        <w:sz w:val="20"/>
+      </w:rPr>
+    </w:lvl>
+    <w:lvl w:ilvl="8" w:tentative="1">
+      <w:start w:val="1"/>
+      <w:numFmt w:val="bullet"/>
+      <w:lvlText w:val=""/>
+      <w:lvlJc w:val="left"/>
+      <w:pPr>
+        <w:tabs>
+          <w:tab w:val="num" w:pos="6480"/>
+        </w:tabs>
+        <w:ind w:left="6480" w:hanging="360"/>
+      </w:pPr>
+      <w:rPr>
+        <w:rFonts w:ascii="Wingdings" w:hAnsi="Wingdings" w:hint="default"/>
+        <w:sz w:val="20"/>
+      </w:rPr>
+    </w:lvl>
+  </w:abstractNum>
+  <w:abstractNum w:abstractNumId="1" w15:restartNumberingAfterBreak="0">
+    <w:nsid w:val="192560CE"/>
+    <w:multiLevelType w:val="multilevel"/>
+    <w:tmpl w:val="32D688A4"/>
+    <w:lvl w:ilvl="0">
+      <w:start w:val="1"/>
+      <w:numFmt w:val="bullet"/>
+      <w:lvlText w:val=""/>
+      <w:lvlJc w:val="left"/>
+      <w:pPr>
+        <w:tabs>
+          <w:tab w:val="num" w:pos="720"/>
+        </w:tabs>
+        <w:ind w:left="720" w:hanging="360"/>
+      </w:pPr>
+      <w:rPr>
+        <w:rFonts w:ascii="Symbol" w:hAnsi="Symbol" w:hint="default"/>
+        <w:sz w:val="20"/>
+      </w:rPr>
+    </w:lvl>
+    <w:lvl w:ilvl="1" w:tentative="1">
+      <w:start w:val="1"/>
+      <w:numFmt w:val="bullet"/>
+      <w:lvlText w:val="o"/>
+      <w:lvlJc w:val="left"/>
+      <w:pPr>
+        <w:tabs>
+          <w:tab w:val="num" w:pos="1440"/>
+        </w:tabs>
+        <w:ind w:left="1440" w:hanging="360"/>
+      </w:pPr>
+      <w:rPr>
+        <w:rFonts w:ascii="Courier New" w:hAnsi="Courier New" w:hint="default"/>
+        <w:sz w:val="20"/>
+      </w:rPr>
+    </w:lvl>
+    <w:lvl w:ilvl="2" w:tentative="1">
+      <w:start w:val="1"/>
+      <w:numFmt w:val="bullet"/>
+      <w:lvlText w:val=""/>
+      <w:lvlJc w:val="left"/>
+      <w:pPr>
+        <w:tabs>
+          <w:tab w:val="num" w:pos="2160"/>
+        </w:tabs>
+        <w:ind w:left="2160" w:hanging="360"/>
+      </w:pPr>
+      <w:rPr>
+        <w:rFonts w:ascii="Wingdings" w:hAnsi="Wingdings" w:hint="default"/>
+        <w:sz w:val="20"/>
+      </w:rPr>
+    </w:lvl>
+    <w:lvl w:ilvl="3" w:tentative="1">
+      <w:start w:val="1"/>
+      <w:numFmt w:val="bullet"/>
+      <w:lvlText w:val=""/>
+      <w:lvlJc w:val="left"/>
+      <w:pPr>
+        <w:tabs>
+          <w:tab w:val="num" w:pos="2880"/>
+        </w:tabs>
+        <w:ind w:left="2880" w:hanging="360"/>
+      </w:pPr>
+      <w:rPr>
+        <w:rFonts w:ascii="Wingdings" w:hAnsi="Wingdings" w:hint="default"/>
+        <w:sz w:val="20"/>
+      </w:rPr>
+    </w:lvl>
+    <w:lvl w:ilvl="4" w:tentative="1">
+      <w:start w:val="1"/>
+      <w:numFmt w:val="bullet"/>
+      <w:lvlText w:val=""/>
+      <w:lvlJc w:val="left"/>
+      <w:pPr>
+        <w:tabs>
+          <w:tab w:val="num" w:pos="3600"/>
+        </w:tabs>
+        <w:ind w:left="3600" w:hanging="360"/>
+      </w:pPr>
+      <w:rPr>
+        <w:rFonts w:ascii="Wingdings" w:hAnsi="Wingdings" w:hint="default"/>
+        <w:sz w:val="20"/>
+      </w:rPr>
+    </w:lvl>
+    <w:lvl w:ilvl="5" w:tentative="1">
+      <w:start w:val="1"/>
+      <w:numFmt w:val="bullet"/>
+      <w:lvlText w:val=""/>
+      <w:lvlJc w:val="left"/>
+      <w:pPr>
+        <w:tabs>
+          <w:tab w:val="num" w:pos="4320"/>
+        </w:tabs>
+        <w:ind w:left="4320" w:hanging="360"/>
+      </w:pPr>
+      <w:rPr>
+        <w:rFonts w:ascii="Wingdings" w:hAnsi="Wingdings" w:hint="default"/>
+        <w:sz w:val="20"/>
+      </w:rPr>
+    </w:lvl>
+    <w:lvl w:ilvl="6" w:tentative="1">
+      <w:start w:val="1"/>
+      <w:numFmt w:val="bullet"/>
+      <w:lvlText w:val=""/>
+      <w:lvlJc w:val="left"/>
+      <w:pPr>
+        <w:tabs>
+          <w:tab w:val="num" w:pos="5040"/>
+        </w:tabs>
+        <w:ind w:left="5040" w:hanging="360"/>
+      </w:pPr>
+      <w:rPr>
+        <w:rFonts w:ascii="Wingdings" w:hAnsi="Wingdings" w:hint="default"/>
+        <w:sz w:val="20"/>
+      </w:rPr>
+    </w:lvl>
+    <w:lvl w:ilvl="7" w:tentative="1">
+      <w:start w:val="1"/>
+      <w:numFmt w:val="bullet"/>
+      <w:lvlText w:val=""/>
+      <w:lvlJc w:val="left"/>
+      <w:pPr>
+        <w:tabs>
+          <w:tab w:val="num" w:pos="5760"/>
+        </w:tabs>
+        <w:ind w:left="5760" w:hanging="360"/>
+      </w:pPr>
+      <w:rPr>
+        <w:rFonts w:ascii="Wingdings" w:hAnsi="Wingdings" w:hint="default"/>
+        <w:sz w:val="20"/>
+      </w:rPr>
+    </w:lvl>
+    <w:lvl w:ilvl="8" w:tentative="1">
+      <w:start w:val="1"/>
+      <w:numFmt w:val="bullet"/>
+      <w:lvlText w:val=""/>
+      <w:lvlJc w:val="left"/>
+      <w:pPr>
+        <w:tabs>
+          <w:tab w:val="num" w:pos="6480"/>
+        </w:tabs>
+        <w:ind w:left="6480" w:hanging="360"/>
+      </w:pPr>
+      <w:rPr>
+        <w:rFonts w:ascii="Wingdings" w:hAnsi="Wingdings" w:hint="default"/>
+        <w:sz w:val="20"/>
+      </w:rPr>
+    </w:lvl>
+  </w:abstractNum>
+  <w:abstractNum w:abstractNumId="2" w15:restartNumberingAfterBreak="0">
+    <w:nsid w:val="2A746064"/>
+    <w:multiLevelType w:val="multilevel"/>
+    <w:tmpl w:val="6D4EB1D4"/>
+    <w:lvl w:ilvl="0">
+      <w:start w:val="1"/>
+      <w:numFmt w:val="bullet"/>
+      <w:lvlText w:val=""/>
+      <w:lvlJc w:val="left"/>
+      <w:pPr>
+        <w:tabs>
+          <w:tab w:val="num" w:pos="720"/>
+        </w:tabs>
+        <w:ind w:left="720" w:hanging="360"/>
+      </w:pPr>
+      <w:rPr>
+        <w:rFonts w:ascii="Symbol" w:hAnsi="Symbol" w:hint="default"/>
+        <w:sz w:val="20"/>
+      </w:rPr>
+    </w:lvl>
+    <w:lvl w:ilvl="1" w:tentative="1">
+      <w:start w:val="1"/>
+      <w:numFmt w:val="bullet"/>
+      <w:lvlText w:val="o"/>
+      <w:lvlJc w:val="left"/>
+      <w:pPr>
+        <w:tabs>
+          <w:tab w:val="num" w:pos="1440"/>
+        </w:tabs>
+        <w:ind w:left="1440" w:hanging="360"/>
+      </w:pPr>
+      <w:rPr>
+        <w:rFonts w:ascii="Courier New" w:hAnsi="Courier New" w:hint="default"/>
+        <w:sz w:val="20"/>
+      </w:rPr>
+    </w:lvl>
+    <w:lvl w:ilvl="2" w:tentative="1">
+      <w:start w:val="1"/>
+      <w:numFmt w:val="bullet"/>
+      <w:lvlText w:val=""/>
+      <w:lvlJc w:val="left"/>
+      <w:pPr>
+        <w:tabs>
+          <w:tab w:val="num" w:pos="2160"/>
+        </w:tabs>
+        <w:ind w:left="2160" w:hanging="360"/>
+      </w:pPr>
+      <w:rPr>
+        <w:rFonts w:ascii="Wingdings" w:hAnsi="Wingdings" w:hint="default"/>
+        <w:sz w:val="20"/>
+      </w:rPr>
+    </w:lvl>
+    <w:lvl w:ilvl="3" w:tentative="1">
+      <w:start w:val="1"/>
+      <w:numFmt w:val="bullet"/>
+      <w:lvlText w:val=""/>
+      <w:lvlJc w:val="left"/>
+      <w:pPr>
+        <w:tabs>
+          <w:tab w:val="num" w:pos="2880"/>
+        </w:tabs>
+        <w:ind w:left="2880" w:hanging="360"/>
+      </w:pPr>
+      <w:rPr>
+        <w:rFonts w:ascii="Wingdings" w:hAnsi="Wingdings" w:hint="default"/>
+        <w:sz w:val="20"/>
+      </w:rPr>
+    </w:lvl>
+    <w:lvl w:ilvl="4" w:tentative="1">
+      <w:start w:val="1"/>
+      <w:numFmt w:val="bullet"/>
+      <w:lvlText w:val=""/>
+      <w:lvlJc w:val="left"/>
+      <w:pPr>
+        <w:tabs>
+          <w:tab w:val="num" w:pos="3600"/>
+        </w:tabs>
+        <w:ind w:left="3600" w:hanging="360"/>
+      </w:pPr>
+      <w:rPr>
+        <w:rFonts w:ascii="Wingdings" w:hAnsi="Wingdings" w:hint="default"/>
+        <w:sz w:val="20"/>
+      </w:rPr>
+    </w:lvl>
+    <w:lvl w:ilvl="5" w:tentative="1">
+      <w:start w:val="1"/>
+      <w:numFmt w:val="bullet"/>
+      <w:lvlText w:val=""/>
+      <w:lvlJc w:val="left"/>
+      <w:pPr>
+        <w:tabs>
+          <w:tab w:val="num" w:pos="4320"/>
+        </w:tabs>
+        <w:ind w:left="4320" w:hanging="360"/>
+      </w:pPr>
+      <w:rPr>
+        <w:rFonts w:ascii="Wingdings" w:hAnsi="Wingdings" w:hint="default"/>
+        <w:sz w:val="20"/>
+      </w:rPr>
+    </w:lvl>
+    <w:lvl w:ilvl="6" w:tentative="1">
+      <w:start w:val="1"/>
+      <w:numFmt w:val="bullet"/>
+      <w:lvlText w:val=""/>
+      <w:lvlJc w:val="left"/>
+      <w:pPr>
+        <w:tabs>
+          <w:tab w:val="num" w:pos="5040"/>
+        </w:tabs>
+        <w:ind w:left="5040" w:hanging="360"/>
+      </w:pPr>
+      <w:rPr>
+        <w:rFonts w:ascii="Wingdings" w:hAnsi="Wingdings" w:hint="default"/>
+        <w:sz w:val="20"/>
+      </w:rPr>
+    </w:lvl>
+    <w:lvl w:ilvl="7" w:tentative="1">
+      <w:start w:val="1"/>
+      <w:numFmt w:val="bullet"/>
+      <w:lvlText w:val=""/>
+      <w:lvlJc w:val="left"/>
+      <w:pPr>
+        <w:tabs>
+          <w:tab w:val="num" w:pos="5760"/>
+        </w:tabs>
+        <w:ind w:left="5760" w:hanging="360"/>
+      </w:pPr>
+      <w:rPr>
+        <w:rFonts w:ascii="Wingdings" w:hAnsi="Wingdings" w:hint="default"/>
+        <w:sz w:val="20"/>
+      </w:rPr>
+    </w:lvl>
+    <w:lvl w:ilvl="8" w:tentative="1">
+      <w:start w:val="1"/>
+      <w:numFmt w:val="bullet"/>
+      <w:lvlText w:val=""/>
+      <w:lvlJc w:val="left"/>
+      <w:pPr>
+        <w:tabs>
+          <w:tab w:val="num" w:pos="6480"/>
+        </w:tabs>
+        <w:ind w:left="6480" w:hanging="360"/>
+      </w:pPr>
+      <w:rPr>
+        <w:rFonts w:ascii="Wingdings" w:hAnsi="Wingdings" w:hint="default"/>
+        <w:sz w:val="20"/>
+      </w:rPr>
+    </w:lvl>
+  </w:abstractNum>
+  <w:abstractNum w:abstractNumId="3" w15:restartNumberingAfterBreak="0">
+    <w:nsid w:val="38793E8D"/>
+    <w:multiLevelType w:val="multilevel"/>
+    <w:tmpl w:val="B7C81CD6"/>
+    <w:lvl w:ilvl="0">
+      <w:start w:val="1"/>
+      <w:numFmt w:val="bullet"/>
+      <w:lvlText w:val=""/>
+      <w:lvlJc w:val="left"/>
+      <w:pPr>
+        <w:tabs>
+          <w:tab w:val="num" w:pos="720"/>
+        </w:tabs>
+        <w:ind w:left="720" w:hanging="360"/>
+      </w:pPr>
+      <w:rPr>
+        <w:rFonts w:ascii="Symbol" w:hAnsi="Symbol" w:hint="default"/>
+        <w:sz w:val="20"/>
+      </w:rPr>
+    </w:lvl>
+    <w:lvl w:ilvl="1" w:tentative="1">
+      <w:start w:val="1"/>
+      <w:numFmt w:val="bullet"/>
+      <w:lvlText w:val="o"/>
+      <w:lvlJc w:val="left"/>
+      <w:pPr>
+        <w:tabs>
+          <w:tab w:val="num" w:pos="1440"/>
+        </w:tabs>
+        <w:ind w:left="1440" w:hanging="360"/>
+      </w:pPr>
+      <w:rPr>
+        <w:rFonts w:ascii="Courier New" w:hAnsi="Courier New" w:hint="default"/>
+        <w:sz w:val="20"/>
+      </w:rPr>
+    </w:lvl>
+    <w:lvl w:ilvl="2" w:tentative="1">
+      <w:start w:val="1"/>
+      <w:numFmt w:val="bullet"/>
+      <w:lvlText w:val=""/>
+      <w:lvlJc w:val="left"/>
+      <w:pPr>
+        <w:tabs>
+          <w:tab w:val="num" w:pos="2160"/>
+        </w:tabs>
+        <w:ind w:left="2160" w:hanging="360"/>
+      </w:pPr>
+      <w:rPr>
+        <w:rFonts w:ascii="Wingdings" w:hAnsi="Wingdings" w:hint="default"/>
+        <w:sz w:val="20"/>
+      </w:rPr>
+    </w:lvl>
+    <w:lvl w:ilvl="3" w:tentative="1">
+      <w:start w:val="1"/>
+      <w:numFmt w:val="bullet"/>
+      <w:lvlText w:val=""/>
+      <w:lvlJc w:val="left"/>
+      <w:pPr>
+        <w:tabs>
+          <w:tab w:val="num" w:pos="2880"/>
+        </w:tabs>
+        <w:ind w:left="2880" w:hanging="360"/>
+      </w:pPr>
+      <w:rPr>
+        <w:rFonts w:ascii="Wingdings" w:hAnsi="Wingdings" w:hint="default"/>
+        <w:sz w:val="20"/>
+      </w:rPr>
+    </w:lvl>
+    <w:lvl w:ilvl="4" w:tentative="1">
+      <w:start w:val="1"/>
+      <w:numFmt w:val="bullet"/>
+      <w:lvlText w:val=""/>
+      <w:lvlJc w:val="left"/>
+      <w:pPr>
+        <w:tabs>
+          <w:tab w:val="num" w:pos="3600"/>
+        </w:tabs>
+        <w:ind w:left="3600" w:hanging="360"/>
+      </w:pPr>
+      <w:rPr>
+        <w:rFonts w:ascii="Wingdings" w:hAnsi="Wingdings" w:hint="default"/>
+        <w:sz w:val="20"/>
+      </w:rPr>
+    </w:lvl>
+    <w:lvl w:ilvl="5" w:tentative="1">
+      <w:start w:val="1"/>
+      <w:numFmt w:val="bullet"/>
+      <w:lvlText w:val=""/>
+      <w:lvlJc w:val="left"/>
+      <w:pPr>
+        <w:tabs>
+          <w:tab w:val="num" w:pos="4320"/>
+        </w:tabs>
+        <w:ind w:left="4320" w:hanging="360"/>
+      </w:pPr>
+      <w:rPr>
+        <w:rFonts w:ascii="Wingdings" w:hAnsi="Wingdings" w:hint="default"/>
+        <w:sz w:val="20"/>
+      </w:rPr>
+    </w:lvl>
+    <w:lvl w:ilvl="6" w:tentative="1">
+      <w:start w:val="1"/>
+      <w:numFmt w:val="bullet"/>
+      <w:lvlText w:val=""/>
+      <w:lvlJc w:val="left"/>
+      <w:pPr>
+        <w:tabs>
+          <w:tab w:val="num" w:pos="5040"/>
+        </w:tabs>
+        <w:ind w:left="5040" w:hanging="360"/>
+      </w:pPr>
+      <w:rPr>
+        <w:rFonts w:ascii="Wingdings" w:hAnsi="Wingdings" w:hint="default"/>
+        <w:sz w:val="20"/>
+      </w:rPr>
+    </w:lvl>
+    <w:lvl w:ilvl="7" w:tentative="1">
+      <w:start w:val="1"/>
+      <w:numFmt w:val="bullet"/>
+      <w:lvlText w:val=""/>
+      <w:lvlJc w:val="left"/>
+      <w:pPr>
+        <w:tabs>
+          <w:tab w:val="num" w:pos="5760"/>
+        </w:tabs>
+        <w:ind w:left="5760" w:hanging="360"/>
+      </w:pPr>
+      <w:rPr>
+        <w:rFonts w:ascii="Wingdings" w:hAnsi="Wingdings" w:hint="default"/>
+        <w:sz w:val="20"/>
+      </w:rPr>
+    </w:lvl>
+    <w:lvl w:ilvl="8" w:tentative="1">
+      <w:start w:val="1"/>
+      <w:numFmt w:val="bullet"/>
+      <w:lvlText w:val=""/>
+      <w:lvlJc w:val="left"/>
+      <w:pPr>
+        <w:tabs>
+          <w:tab w:val="num" w:pos="6480"/>
+        </w:tabs>
+        <w:ind w:left="6480" w:hanging="360"/>
+      </w:pPr>
+      <w:rPr>
+        <w:rFonts w:ascii="Wingdings" w:hAnsi="Wingdings" w:hint="default"/>
+        <w:sz w:val="20"/>
+      </w:rPr>
+    </w:lvl>
+  </w:abstractNum>
+  <w:abstractNum w:abstractNumId="4" w15:restartNumberingAfterBreak="0">
+    <w:nsid w:val="4B4A0913"/>
+    <w:multiLevelType w:val="multilevel"/>
+    <w:tmpl w:val="A77256F8"/>
+    <w:lvl w:ilvl="0">
+      <w:start w:val="1"/>
+      <w:numFmt w:val="bullet"/>
+      <w:lvlText w:val=""/>
+      <w:lvlJc w:val="left"/>
+      <w:pPr>
+        <w:tabs>
+          <w:tab w:val="num" w:pos="720"/>
+        </w:tabs>
+        <w:ind w:left="720" w:hanging="360"/>
+      </w:pPr>
+      <w:rPr>
+        <w:rFonts w:ascii="Symbol" w:hAnsi="Symbol" w:hint="default"/>
+        <w:sz w:val="20"/>
+      </w:rPr>
+    </w:lvl>
+    <w:lvl w:ilvl="1" w:tentative="1">
+      <w:start w:val="1"/>
+      <w:numFmt w:val="bullet"/>
+      <w:lvlText w:val="o"/>
+      <w:lvlJc w:val="left"/>
+      <w:pPr>
+        <w:tabs>
+          <w:tab w:val="num" w:pos="1440"/>
+        </w:tabs>
+        <w:ind w:left="1440" w:hanging="360"/>
+      </w:pPr>
+      <w:rPr>
+        <w:rFonts w:ascii="Courier New" w:hAnsi="Courier New" w:hint="default"/>
+        <w:sz w:val="20"/>
+      </w:rPr>
+    </w:lvl>
+    <w:lvl w:ilvl="2" w:tentative="1">
+      <w:start w:val="1"/>
+      <w:numFmt w:val="bullet"/>
+      <w:lvlText w:val=""/>
+      <w:lvlJc w:val="left"/>
+      <w:pPr>
+        <w:tabs>
+          <w:tab w:val="num" w:pos="2160"/>
+        </w:tabs>
+        <w:ind w:left="2160" w:hanging="360"/>
+      </w:pPr>
+      <w:rPr>
+        <w:rFonts w:ascii="Wingdings" w:hAnsi="Wingdings" w:hint="default"/>
+        <w:sz w:val="20"/>
+      </w:rPr>
+    </w:lvl>
+    <w:lvl w:ilvl="3" w:tentative="1">
+      <w:start w:val="1"/>
+      <w:numFmt w:val="bullet"/>
+      <w:lvlText w:val=""/>
+      <w:lvlJc w:val="left"/>
+      <w:pPr>
+        <w:tabs>
+          <w:tab w:val="num" w:pos="2880"/>
+        </w:tabs>
+        <w:ind w:left="2880" w:hanging="360"/>
+      </w:pPr>
+      <w:rPr>
+        <w:rFonts w:ascii="Wingdings" w:hAnsi="Wingdings" w:hint="default"/>
+        <w:sz w:val="20"/>
+      </w:rPr>
+    </w:lvl>
+    <w:lvl w:ilvl="4" w:tentative="1">
+      <w:start w:val="1"/>
+      <w:numFmt w:val="bullet"/>
+      <w:lvlText w:val=""/>
+      <w:lvlJc w:val="left"/>
+      <w:pPr>
+        <w:tabs>
+          <w:tab w:val="num" w:pos="3600"/>
+        </w:tabs>
+        <w:ind w:left="3600" w:hanging="360"/>
+      </w:pPr>
+      <w:rPr>
+        <w:rFonts w:ascii="Wingdings" w:hAnsi="Wingdings" w:hint="default"/>
+        <w:sz w:val="20"/>
+      </w:rPr>
+    </w:lvl>
+    <w:lvl w:ilvl="5" w:tentative="1">
+      <w:start w:val="1"/>
+      <w:numFmt w:val="bullet"/>
+      <w:lvlText w:val=""/>
+      <w:lvlJc w:val="left"/>
+      <w:pPr>
+        <w:tabs>
+          <w:tab w:val="num" w:pos="4320"/>
+        </w:tabs>
+        <w:ind w:left="4320" w:hanging="360"/>
+      </w:pPr>
+      <w:rPr>
+        <w:rFonts w:ascii="Wingdings" w:hAnsi="Wingdings" w:hint="default"/>
+        <w:sz w:val="20"/>
+      </w:rPr>
+    </w:lvl>
+    <w:lvl w:ilvl="6" w:tentative="1">
+      <w:start w:val="1"/>
+      <w:numFmt w:val="bullet"/>
+      <w:lvlText w:val=""/>
+      <w:lvlJc w:val="left"/>
+      <w:pPr>
+        <w:tabs>
+          <w:tab w:val="num" w:pos="5040"/>
+        </w:tabs>
+        <w:ind w:left="5040" w:hanging="360"/>
+      </w:pPr>
+      <w:rPr>
+        <w:rFonts w:ascii="Wingdings" w:hAnsi="Wingdings" w:hint="default"/>
+        <w:sz w:val="20"/>
+      </w:rPr>
+    </w:lvl>
+    <w:lvl w:ilvl="7" w:tentative="1">
+      <w:start w:val="1"/>
+      <w:numFmt w:val="bullet"/>
+      <w:lvlText w:val=""/>
+      <w:lvlJc w:val="left"/>
+      <w:pPr>
+        <w:tabs>
+          <w:tab w:val="num" w:pos="5760"/>
+        </w:tabs>
+        <w:ind w:left="5760" w:hanging="360"/>
+      </w:pPr>
+      <w:rPr>
+        <w:rFonts w:ascii="Wingdings" w:hAnsi="Wingdings" w:hint="default"/>
+        <w:sz w:val="20"/>
+      </w:rPr>
+    </w:lvl>
+    <w:lvl w:ilvl="8" w:tentative="1">
+      <w:start w:val="1"/>
+      <w:numFmt w:val="bullet"/>
+      <w:lvlText w:val=""/>
+      <w:lvlJc w:val="left"/>
+      <w:pPr>
+        <w:tabs>
+          <w:tab w:val="num" w:pos="6480"/>
+        </w:tabs>
+        <w:ind w:left="6480" w:hanging="360"/>
+      </w:pPr>
+      <w:rPr>
+        <w:rFonts w:ascii="Wingdings" w:hAnsi="Wingdings" w:hint="default"/>
+        <w:sz w:val="20"/>
+      </w:rPr>
+    </w:lvl>
+  </w:abstractNum>
+  <w:abstractNum w:abstractNumId="5" w15:restartNumberingAfterBreak="0">
+    <w:nsid w:val="4BB05687"/>
+    <w:multiLevelType w:val="hybridMultilevel"/>
+    <w:tmpl w:val="8DE05CCE"/>
+    <w:lvl w:ilvl="0" w:tplc="340A0001">
+      <w:start w:val="1"/>
+      <w:numFmt w:val="bullet"/>
+      <w:lvlText w:val=""/>
+      <w:lvlJc w:val="left"/>
+      <w:pPr>
+        <w:ind w:left="720" w:hanging="360"/>
+      </w:pPr>
+      <w:rPr>
+        <w:rFonts w:ascii="Symbol" w:hAnsi="Symbol" w:hint="default"/>
+      </w:rPr>
+    </w:lvl>
+    <w:lvl w:ilvl="1" w:tplc="340A0003" w:tentative="1">
+      <w:start w:val="1"/>
+      <w:numFmt w:val="bullet"/>
+      <w:lvlText w:val="o"/>
+      <w:lvlJc w:val="left"/>
+      <w:pPr>
+        <w:ind w:left="1440" w:hanging="360"/>
+      </w:pPr>
+      <w:rPr>
+        <w:rFonts w:ascii="Courier New" w:hAnsi="Courier New" w:cs="Courier New" w:hint="default"/>
+      </w:rPr>
+    </w:lvl>
+    <w:lvl w:ilvl="2" w:tplc="340A0005" w:tentative="1">
+      <w:start w:val="1"/>
+      <w:numFmt w:val="bullet"/>
+      <w:lvlText w:val=""/>
+      <w:lvlJc w:val="left"/>
+      <w:pPr>
+        <w:ind w:left="2160" w:hanging="360"/>
+      </w:pPr>
+      <w:rPr>
+        <w:rFonts w:ascii="Wingdings" w:hAnsi="Wingdings" w:hint="default"/>
+      </w:rPr>
+    </w:lvl>
+    <w:lvl w:ilvl="3" w:tplc="340A0001" w:tentative="1">
+      <w:start w:val="1"/>
+      <w:numFmt w:val="bullet"/>
+      <w:lvlText w:val=""/>
+      <w:lvlJc w:val="left"/>
+      <w:pPr>
+        <w:ind w:left="2880" w:hanging="360"/>
+      </w:pPr>
+      <w:rPr>
+        <w:rFonts w:ascii="Symbol" w:hAnsi="Symbol" w:hint="default"/>
+      </w:rPr>
+    </w:lvl>
+    <w:lvl w:ilvl="4" w:tplc="340A0003" w:tentative="1">
+      <w:start w:val="1"/>
+      <w:numFmt w:val="bullet"/>
+      <w:lvlText w:val="o"/>
+      <w:lvlJc w:val="left"/>
+      <w:pPr>
+        <w:ind w:left="3600" w:hanging="360"/>
+      </w:pPr>
+      <w:rPr>
+        <w:rFonts w:ascii="Courier New" w:hAnsi="Courier New" w:cs="Courier New" w:hint="default"/>
+      </w:rPr>
+    </w:lvl>
+    <w:lvl w:ilvl="5" w:tplc="340A0005" w:tentative="1">
+      <w:start w:val="1"/>
+      <w:numFmt w:val="bullet"/>
+      <w:lvlText w:val=""/>
+      <w:lvlJc w:val="left"/>
+      <w:pPr>
+        <w:ind w:left="4320" w:hanging="360"/>
+      </w:pPr>
+      <w:rPr>
+        <w:rFonts w:ascii="Wingdings" w:hAnsi="Wingdings" w:hint="default"/>
+      </w:rPr>
+    </w:lvl>
+    <w:lvl w:ilvl="6" w:tplc="340A0001" w:tentative="1">
+      <w:start w:val="1"/>
+      <w:numFmt w:val="bullet"/>
+      <w:lvlText w:val=""/>
+      <w:lvlJc w:val="left"/>
+      <w:pPr>
+        <w:ind w:left="5040" w:hanging="360"/>
+      </w:pPr>
+      <w:rPr>
+        <w:rFonts w:ascii="Symbol" w:hAnsi="Symbol" w:hint="default"/>
+      </w:rPr>
+    </w:lvl>
+    <w:lvl w:ilvl="7" w:tplc="340A0003" w:tentative="1">
+      <w:start w:val="1"/>
+      <w:numFmt w:val="bullet"/>
+      <w:lvlText w:val="o"/>
+      <w:lvlJc w:val="left"/>
+      <w:pPr>
+        <w:ind w:left="5760" w:hanging="360"/>
+      </w:pPr>
+      <w:rPr>
+        <w:rFonts w:ascii="Courier New" w:hAnsi="Courier New" w:cs="Courier New" w:hint="default"/>
+      </w:rPr>
+    </w:lvl>
+    <w:lvl w:ilvl="8" w:tplc="340A0005" w:tentative="1">
+      <w:start w:val="1"/>
+      <w:numFmt w:val="bullet"/>
+      <w:lvlText w:val=""/>
+      <w:lvlJc w:val="left"/>
+      <w:pPr>
+        <w:ind w:left="6480" w:hanging="360"/>
+      </w:pPr>
+      <w:rPr>
+        <w:rFonts w:ascii="Wingdings" w:hAnsi="Wingdings" w:hint="default"/>
+      </w:rPr>
+    </w:lvl>
+  </w:abstractNum>
+  <w:abstractNum w:abstractNumId="6" w15:restartNumberingAfterBreak="0">
+    <w:nsid w:val="5B2F61D9"/>
+    <w:multiLevelType w:val="hybridMultilevel"/>
+    <w:tmpl w:val="20C2FBCC"/>
+    <w:lvl w:ilvl="0" w:tplc="340A0001">
+      <w:start w:val="1"/>
+      <w:numFmt w:val="bullet"/>
+      <w:lvlText w:val=""/>
+      <w:lvlJc w:val="left"/>
+      <w:pPr>
+        <w:ind w:left="720" w:hanging="360"/>
+      </w:pPr>
+      <w:rPr>
+        <w:rFonts w:ascii="Symbol" w:hAnsi="Symbol" w:hint="default"/>
+      </w:rPr>
+    </w:lvl>
+    <w:lvl w:ilvl="1" w:tplc="340A0003" w:tentative="1">
+      <w:start w:val="1"/>
+      <w:numFmt w:val="bullet"/>
+      <w:lvlText w:val="o"/>
+      <w:lvlJc w:val="left"/>
+      <w:pPr>
+        <w:ind w:left="1440" w:hanging="360"/>
+      </w:pPr>
+      <w:rPr>
+        <w:rFonts w:ascii="Courier New" w:hAnsi="Courier New" w:cs="Courier New" w:hint="default"/>
+      </w:rPr>
+    </w:lvl>
+    <w:lvl w:ilvl="2" w:tplc="340A0005" w:tentative="1">
+      <w:start w:val="1"/>
+      <w:numFmt w:val="bullet"/>
+      <w:lvlText w:val=""/>
+      <w:lvlJc w:val="left"/>
+      <w:pPr>
+        <w:ind w:left="2160" w:hanging="360"/>
+      </w:pPr>
+      <w:rPr>
+        <w:rFonts w:ascii="Wingdings" w:hAnsi="Wingdings" w:hint="default"/>
+      </w:rPr>
+    </w:lvl>
+    <w:lvl w:ilvl="3" w:tplc="340A0001" w:tentative="1">
+      <w:start w:val="1"/>
+      <w:numFmt w:val="bullet"/>
+      <w:lvlText w:val=""/>
+      <w:lvlJc w:val="left"/>
+      <w:pPr>
+        <w:ind w:left="2880" w:hanging="360"/>
+      </w:pPr>
+      <w:rPr>
+        <w:rFonts w:ascii="Symbol" w:hAnsi="Symbol" w:hint="default"/>
+      </w:rPr>
+    </w:lvl>
+    <w:lvl w:ilvl="4" w:tplc="340A0003" w:tentative="1">
+      <w:start w:val="1"/>
+      <w:numFmt w:val="bullet"/>
+      <w:lvlText w:val="o"/>
+      <w:lvlJc w:val="left"/>
+      <w:pPr>
+        <w:ind w:left="3600" w:hanging="360"/>
+      </w:pPr>
+      <w:rPr>
+        <w:rFonts w:ascii="Courier New" w:hAnsi="Courier New" w:cs="Courier New" w:hint="default"/>
+      </w:rPr>
+    </w:lvl>
+    <w:lvl w:ilvl="5" w:tplc="340A0005" w:tentative="1">
+      <w:start w:val="1"/>
+      <w:numFmt w:val="bullet"/>
+      <w:lvlText w:val=""/>
+      <w:lvlJc w:val="left"/>
+      <w:pPr>
+        <w:ind w:left="4320" w:hanging="360"/>
+      </w:pPr>
+      <w:rPr>
+        <w:rFonts w:ascii="Wingdings" w:hAnsi="Wingdings" w:hint="default"/>
+      </w:rPr>
+    </w:lvl>
+    <w:lvl w:ilvl="6" w:tplc="340A0001" w:tentative="1">
+      <w:start w:val="1"/>
+      <w:numFmt w:val="bullet"/>
+      <w:lvlText w:val=""/>
+      <w:lvlJc w:val="left"/>
+      <w:pPr>
+        <w:ind w:left="5040" w:hanging="360"/>
+      </w:pPr>
+      <w:rPr>
+        <w:rFonts w:ascii="Symbol" w:hAnsi="Symbol" w:hint="default"/>
+      </w:rPr>
+    </w:lvl>
+    <w:lvl w:ilvl="7" w:tplc="340A0003" w:tentative="1">
+      <w:start w:val="1"/>
+      <w:numFmt w:val="bullet"/>
+      <w:lvlText w:val="o"/>
+      <w:lvlJc w:val="left"/>
+      <w:pPr>
+        <w:ind w:left="5760" w:hanging="360"/>
+      </w:pPr>
+      <w:rPr>
+        <w:rFonts w:ascii="Courier New" w:hAnsi="Courier New" w:cs="Courier New" w:hint="default"/>
+      </w:rPr>
+    </w:lvl>
+    <w:lvl w:ilvl="8" w:tplc="340A0005" w:tentative="1">
+      <w:start w:val="1"/>
+      <w:numFmt w:val="bullet"/>
+      <w:lvlText w:val=""/>
+      <w:lvlJc w:val="left"/>
+      <w:pPr>
+        <w:ind w:left="6480" w:hanging="360"/>
+      </w:pPr>
+      <w:rPr>
+        <w:rFonts w:ascii="Wingdings" w:hAnsi="Wingdings" w:hint="default"/>
+      </w:rPr>
+    </w:lvl>
+  </w:abstractNum>
+  <w:abstractNum w:abstractNumId="7" w15:restartNumberingAfterBreak="0">
     <w:nsid w:val="65924C23"/>
     <w:multiLevelType w:val="hybridMultilevel"/>
     <w:tmpl w:val="3BB88C30"/>
@@ -2194,14 +4614,187 @@
       </w:rPr>
     </w:lvl>
   </w:abstractNum>
+  <w:abstractNum w:abstractNumId="8" w15:restartNumberingAfterBreak="0">
+    <w:nsid w:val="67475562"/>
+    <w:multiLevelType w:val="multilevel"/>
+    <w:tmpl w:val="933836DC"/>
+    <w:lvl w:ilvl="0">
+      <w:start w:val="1"/>
+      <w:numFmt w:val="bullet"/>
+      <w:lvlText w:val=""/>
+      <w:lvlJc w:val="left"/>
+      <w:pPr>
+        <w:tabs>
+          <w:tab w:val="num" w:pos="720"/>
+        </w:tabs>
+        <w:ind w:left="720" w:hanging="360"/>
+      </w:pPr>
+      <w:rPr>
+        <w:rFonts w:ascii="Symbol" w:hAnsi="Symbol" w:hint="default"/>
+        <w:sz w:val="20"/>
+      </w:rPr>
+    </w:lvl>
+    <w:lvl w:ilvl="1" w:tentative="1">
+      <w:start w:val="1"/>
+      <w:numFmt w:val="bullet"/>
+      <w:lvlText w:val="o"/>
+      <w:lvlJc w:val="left"/>
+      <w:pPr>
+        <w:tabs>
+          <w:tab w:val="num" w:pos="1440"/>
+        </w:tabs>
+        <w:ind w:left="1440" w:hanging="360"/>
+      </w:pPr>
+      <w:rPr>
+        <w:rFonts w:ascii="Courier New" w:hAnsi="Courier New" w:hint="default"/>
+        <w:sz w:val="20"/>
+      </w:rPr>
+    </w:lvl>
+    <w:lvl w:ilvl="2" w:tentative="1">
+      <w:start w:val="1"/>
+      <w:numFmt w:val="bullet"/>
+      <w:lvlText w:val=""/>
+      <w:lvlJc w:val="left"/>
+      <w:pPr>
+        <w:tabs>
+          <w:tab w:val="num" w:pos="2160"/>
+        </w:tabs>
+        <w:ind w:left="2160" w:hanging="360"/>
+      </w:pPr>
+      <w:rPr>
+        <w:rFonts w:ascii="Wingdings" w:hAnsi="Wingdings" w:hint="default"/>
+        <w:sz w:val="20"/>
+      </w:rPr>
+    </w:lvl>
+    <w:lvl w:ilvl="3" w:tentative="1">
+      <w:start w:val="1"/>
+      <w:numFmt w:val="bullet"/>
+      <w:lvlText w:val=""/>
+      <w:lvlJc w:val="left"/>
+      <w:pPr>
+        <w:tabs>
+          <w:tab w:val="num" w:pos="2880"/>
+        </w:tabs>
+        <w:ind w:left="2880" w:hanging="360"/>
+      </w:pPr>
+      <w:rPr>
+        <w:rFonts w:ascii="Wingdings" w:hAnsi="Wingdings" w:hint="default"/>
+        <w:sz w:val="20"/>
+      </w:rPr>
+    </w:lvl>
+    <w:lvl w:ilvl="4" w:tentative="1">
+      <w:start w:val="1"/>
+      <w:numFmt w:val="bullet"/>
+      <w:lvlText w:val=""/>
+      <w:lvlJc w:val="left"/>
+      <w:pPr>
+        <w:tabs>
+          <w:tab w:val="num" w:pos="3600"/>
+        </w:tabs>
+        <w:ind w:left="3600" w:hanging="360"/>
+      </w:pPr>
+      <w:rPr>
+        <w:rFonts w:ascii="Wingdings" w:hAnsi="Wingdings" w:hint="default"/>
+        <w:sz w:val="20"/>
+      </w:rPr>
+    </w:lvl>
+    <w:lvl w:ilvl="5" w:tentative="1">
+      <w:start w:val="1"/>
+      <w:numFmt w:val="bullet"/>
+      <w:lvlText w:val=""/>
+      <w:lvlJc w:val="left"/>
+      <w:pPr>
+        <w:tabs>
+          <w:tab w:val="num" w:pos="4320"/>
+        </w:tabs>
+        <w:ind w:left="4320" w:hanging="360"/>
+      </w:pPr>
+      <w:rPr>
+        <w:rFonts w:ascii="Wingdings" w:hAnsi="Wingdings" w:hint="default"/>
+        <w:sz w:val="20"/>
+      </w:rPr>
+    </w:lvl>
+    <w:lvl w:ilvl="6" w:tentative="1">
+      <w:start w:val="1"/>
+      <w:numFmt w:val="bullet"/>
+      <w:lvlText w:val=""/>
+      <w:lvlJc w:val="left"/>
+      <w:pPr>
+        <w:tabs>
+          <w:tab w:val="num" w:pos="5040"/>
+        </w:tabs>
+        <w:ind w:left="5040" w:hanging="360"/>
+      </w:pPr>
+      <w:rPr>
+        <w:rFonts w:ascii="Wingdings" w:hAnsi="Wingdings" w:hint="default"/>
+        <w:sz w:val="20"/>
+      </w:rPr>
+    </w:lvl>
+    <w:lvl w:ilvl="7" w:tentative="1">
+      <w:start w:val="1"/>
+      <w:numFmt w:val="bullet"/>
+      <w:lvlText w:val=""/>
+      <w:lvlJc w:val="left"/>
+      <w:pPr>
+        <w:tabs>
+          <w:tab w:val="num" w:pos="5760"/>
+        </w:tabs>
+        <w:ind w:left="5760" w:hanging="360"/>
+      </w:pPr>
+      <w:rPr>
+        <w:rFonts w:ascii="Wingdings" w:hAnsi="Wingdings" w:hint="default"/>
+        <w:sz w:val="20"/>
+      </w:rPr>
+    </w:lvl>
+    <w:lvl w:ilvl="8" w:tentative="1">
+      <w:start w:val="1"/>
+      <w:numFmt w:val="bullet"/>
+      <w:lvlText w:val=""/>
+      <w:lvlJc w:val="left"/>
+      <w:pPr>
+        <w:tabs>
+          <w:tab w:val="num" w:pos="6480"/>
+        </w:tabs>
+        <w:ind w:left="6480" w:hanging="360"/>
+      </w:pPr>
+      <w:rPr>
+        <w:rFonts w:ascii="Wingdings" w:hAnsi="Wingdings" w:hint="default"/>
+        <w:sz w:val="20"/>
+      </w:rPr>
+    </w:lvl>
+  </w:abstractNum>
   <w:num w:numId="1" w16cid:durableId="383524814">
+    <w:abstractNumId w:val="7"/>
+  </w:num>
+  <w:num w:numId="2" w16cid:durableId="381054134">
+    <w:abstractNumId w:val="5"/>
+  </w:num>
+  <w:num w:numId="3" w16cid:durableId="277880619">
+    <w:abstractNumId w:val="6"/>
+  </w:num>
+  <w:num w:numId="4" w16cid:durableId="1339699570">
+    <w:abstractNumId w:val="3"/>
+  </w:num>
+  <w:num w:numId="5" w16cid:durableId="1309432509">
+    <w:abstractNumId w:val="1"/>
+  </w:num>
+  <w:num w:numId="6" w16cid:durableId="30422170">
+    <w:abstractNumId w:val="4"/>
+  </w:num>
+  <w:num w:numId="7" w16cid:durableId="1285232506">
+    <w:abstractNumId w:val="2"/>
+  </w:num>
+  <w:num w:numId="8" w16cid:durableId="1874346238">
+    <w:abstractNumId w:val="8"/>
+  </w:num>
+  <w:num w:numId="9" w16cid:durableId="9070769">
     <w:abstractNumId w:val="0"/>
   </w:num>
 </w:numbering>
 </file>
 
 <file path=word/styles.xml><?xml version="1.0" encoding="utf-8"?>
-<w:styles xmlns:mc="http://schemas.openxmlformats.org/markup-compatibility/2006" xmlns:r="http://schemas.openxmlformats.org/officeDocument/2006/relationships" xmlns:w="http://schemas.openxmlformats.org/wordprocessingml/2006/main" xmlns:w14="http://schemas.microsoft.com/office/word/2010/wordml" xmlns:w15="http://schemas.microsoft.com/office/word/2012/wordml" xmlns:w16cex="http://schemas.microsoft.com/office/word/2018/wordml/cex" xmlns:w16cid="http://schemas.microsoft.com/office/word/2016/wordml/cid" xmlns:w16="http://schemas.microsoft.com/office/word/2018/wordml" xmlns:w16du="http://schemas.microsoft.com/office/word/2023/wordml/word16du" xmlns:w16sdtdh="http://schemas.microsoft.com/office/word/2020/wordml/sdtdatahash" xmlns:w16se="http://schemas.microsoft.com/office/word/2015/wordml/symex" mc:Ignorable="w14 w15 w16se w16cid w16 w16cex w16sdtdh w16du">
+<w:styles xmlns:mc="http://schemas.openxmlformats.org/markup-compatibility/2006" xmlns:r="http://schemas.openxmlformats.org/officeDocument/2006/relationships" xmlns:w="http://schemas.openxmlformats.org/wordprocessingml/2006/main" xmlns:w14="http://schemas.microsoft.com/office/word/2010/wordml" xmlns:w15="http://schemas.microsoft.com/office/word/2012/wordml" xmlns:w16cex="http://schemas.microsoft.com/office/word/2018/wordml/cex" xmlns:w16cid="http://schemas.microsoft.com/office/word/2016/wordml/cid" xmlns:w16="http://schemas.microsoft.com/office/word/2018/wordml" xmlns:w16du="http://schemas.microsoft.com/office/word/2023/wordml/word16du" xmlns:w16sdtdh="http://schemas.microsoft.com/office/word/2020/wordml/sdtdatahash" xmlns:w16sdtfl="http://schemas.microsoft.com/office/word/2024/wordml/sdtformatlock" xmlns:w16se="http://schemas.microsoft.com/office/word/2015/wordml/symex" mc:Ignorable="w14 w15 w16se w16cid w16 w16cex w16sdtdh w16sdtfl w16du">
   <w:docDefaults>
     <w:rPrDefault>
       <w:rPr>
@@ -2626,10 +5219,32 @@
       <w:szCs w:val="28"/>
     </w:rPr>
   </w:style>
+  <w:style w:type="paragraph" w:styleId="Ttulo3">
+    <w:name w:val="heading 3"/>
+    <w:basedOn w:val="Normal"/>
+    <w:next w:val="Normal"/>
+    <w:link w:val="Ttulo3Car"/>
+    <w:uiPriority w:val="9"/>
+    <w:semiHidden/>
+    <w:unhideWhenUsed/>
+    <w:qFormat/>
+    <w:rsid w:val="00606E1F"/>
+    <w:pPr>
+      <w:keepNext/>
+      <w:keepLines/>
+      <w:spacing w:before="40" w:after="0"/>
+      <w:outlineLvl w:val="2"/>
+    </w:pPr>
+    <w:rPr>
+      <w:rFonts w:asciiTheme="majorHAnsi" w:eastAsiaTheme="majorEastAsia" w:hAnsiTheme="majorHAnsi" w:cstheme="majorBidi"/>
+      <w:color w:val="243F60" w:themeColor="accent1" w:themeShade="7F"/>
+      <w:sz w:val="24"/>
+      <w:szCs w:val="24"/>
+    </w:rPr>
+  </w:style>
   <w:style w:type="character" w:default="1" w:styleId="Fuentedeprrafopredeter">
     <w:name w:val="Default Paragraph Font"/>
     <w:uiPriority w:val="1"/>
-    <w:semiHidden/>
     <w:unhideWhenUsed/>
   </w:style>
   <w:style w:type="table" w:default="1" w:styleId="Tablanormal">
@@ -2909,6 +5524,45 @@
     <w:rsid w:val="00917D4E"/>
     <w:rPr>
       <w:rFonts w:eastAsiaTheme="minorEastAsia"/>
+      <w:lang w:eastAsia="es-CL"/>
+    </w:rPr>
+  </w:style>
+  <w:style w:type="paragraph" w:styleId="NormalWeb">
+    <w:name w:val="Normal (Web)"/>
+    <w:basedOn w:val="Normal"/>
+    <w:uiPriority w:val="99"/>
+    <w:semiHidden/>
+    <w:unhideWhenUsed/>
+    <w:rsid w:val="00606E1F"/>
+    <w:rPr>
+      <w:rFonts w:ascii="Times New Roman" w:hAnsi="Times New Roman" w:cs="Times New Roman"/>
+      <w:sz w:val="24"/>
+      <w:szCs w:val="24"/>
+    </w:rPr>
+  </w:style>
+  <w:style w:type="paragraph" w:styleId="Prrafodelista">
+    <w:name w:val="List Paragraph"/>
+    <w:basedOn w:val="Normal"/>
+    <w:uiPriority w:val="34"/>
+    <w:qFormat/>
+    <w:rsid w:val="00606E1F"/>
+    <w:pPr>
+      <w:ind w:left="720"/>
+      <w:contextualSpacing/>
+    </w:pPr>
+  </w:style>
+  <w:style w:type="character" w:customStyle="1" w:styleId="Ttulo3Car">
+    <w:name w:val="Título 3 Car"/>
+    <w:basedOn w:val="Fuentedeprrafopredeter"/>
+    <w:link w:val="Ttulo3"/>
+    <w:uiPriority w:val="9"/>
+    <w:semiHidden/>
+    <w:rsid w:val="00606E1F"/>
+    <w:rPr>
+      <w:rFonts w:asciiTheme="majorHAnsi" w:eastAsiaTheme="majorEastAsia" w:hAnsiTheme="majorHAnsi" w:cstheme="majorBidi"/>
+      <w:color w:val="243F60" w:themeColor="accent1" w:themeShade="7F"/>
+      <w:sz w:val="24"/>
+      <w:szCs w:val="24"/>
       <w:lang w:eastAsia="es-CL"/>
     </w:rPr>
   </w:style>

</xml_diff>